<commit_message>
address situations where it's both DR and IR, re-run analysis to capture this
</commit_message>
<xml_diff>
--- a/TFM Writing/RICSE_Enoch Shin_template.docx
+++ b/TFM Writing/RICSE_Enoch Shin_template.docx
@@ -362,10 +362,13 @@
           <w:szCs w:val="32"/>
           <w:lang w:val="en-US"/>
         </w:rPr>
-        <w:t xml:space="preserve">Dr. Ivan </w:t>
-      </w:r>
-      <w:proofErr w:type="spellStart"/>
-      <w:r>
+        <w:t>Dr. Ivan Erill Sagales</w:t>
+      </w:r>
+    </w:p>
+    <w:p>
+      <w:pPr>
+        <w:spacing w:after="0" w:line="240" w:lineRule="auto"/>
+        <w:jc w:val="center"/>
         <w:rPr>
           <w:rFonts w:cstheme="minorHAnsi"/>
           <w:b/>
@@ -374,9 +377,7 @@
           <w:szCs w:val="32"/>
           <w:lang w:val="en-US"/>
         </w:rPr>
-        <w:t>Erill</w:t>
-      </w:r>
-      <w:proofErr w:type="spellEnd"/>
+      </w:pPr>
       <w:r>
         <w:rPr>
           <w:rFonts w:cstheme="minorHAnsi"/>
@@ -386,10 +387,12 @@
           <w:szCs w:val="32"/>
           <w:lang w:val="en-US"/>
         </w:rPr>
-        <w:t xml:space="preserve"> </w:t>
-      </w:r>
-      <w:proofErr w:type="spellStart"/>
-      <w:r>
+        <w:t>Department of Information and Communications Engineering</w:t>
+      </w:r>
+    </w:p>
+    <w:p>
+      <w:pPr>
+        <w:jc w:val="center"/>
         <w:rPr>
           <w:rFonts w:cstheme="minorHAnsi"/>
           <w:b/>
@@ -398,13 +401,10 @@
           <w:szCs w:val="32"/>
           <w:lang w:val="en-US"/>
         </w:rPr>
-        <w:t>Sagales</w:t>
-      </w:r>
-      <w:proofErr w:type="spellEnd"/>
-    </w:p>
-    <w:p>
-      <w:pPr>
-        <w:spacing w:after="0" w:line="240" w:lineRule="auto"/>
+      </w:pPr>
+    </w:p>
+    <w:p>
+      <w:pPr>
         <w:jc w:val="center"/>
         <w:rPr>
           <w:rFonts w:cstheme="minorHAnsi"/>
@@ -415,43 +415,6 @@
           <w:lang w:val="en-US"/>
         </w:rPr>
       </w:pPr>
-      <w:r>
-        <w:rPr>
-          <w:rFonts w:cstheme="minorHAnsi"/>
-          <w:b/>
-          <w:bCs/>
-          <w:sz w:val="32"/>
-          <w:szCs w:val="32"/>
-          <w:lang w:val="en-US"/>
-        </w:rPr>
-        <w:t>Department of Information and Communications Engineering</w:t>
-      </w:r>
-    </w:p>
-    <w:p>
-      <w:pPr>
-        <w:jc w:val="center"/>
-        <w:rPr>
-          <w:rFonts w:cstheme="minorHAnsi"/>
-          <w:b/>
-          <w:bCs/>
-          <w:sz w:val="32"/>
-          <w:szCs w:val="32"/>
-          <w:lang w:val="en-US"/>
-        </w:rPr>
-      </w:pPr>
-    </w:p>
-    <w:p>
-      <w:pPr>
-        <w:jc w:val="center"/>
-        <w:rPr>
-          <w:rFonts w:cstheme="minorHAnsi"/>
-          <w:b/>
-          <w:bCs/>
-          <w:sz w:val="32"/>
-          <w:szCs w:val="32"/>
-          <w:lang w:val="en-US"/>
-        </w:rPr>
-      </w:pPr>
     </w:p>
     <w:p>
       <w:pPr>
@@ -476,7 +439,6 @@
           <w:lang w:val="en-US"/>
         </w:rPr>
       </w:pPr>
-      <w:proofErr w:type="spellStart"/>
       <w:r>
         <w:rPr>
           <w:rFonts w:cstheme="minorHAnsi"/>
@@ -484,9 +446,8 @@
           <w:szCs w:val="28"/>
           <w:lang w:val="en-US"/>
         </w:rPr>
-        <w:t>Cerdanyola</w:t>
-      </w:r>
-      <w:proofErr w:type="spellEnd"/>
+        <w:t>Cerdanyola del Vall</w:t>
+      </w:r>
       <w:r>
         <w:rPr>
           <w:rFonts w:cstheme="minorHAnsi"/>
@@ -494,9 +455,8 @@
           <w:szCs w:val="28"/>
           <w:lang w:val="en-US"/>
         </w:rPr>
-        <w:t xml:space="preserve"> del </w:t>
-      </w:r>
-      <w:proofErr w:type="spellStart"/>
+        <w:t>è</w:t>
+      </w:r>
       <w:r>
         <w:rPr>
           <w:rFonts w:cstheme="minorHAnsi"/>
@@ -504,35 +464,7 @@
           <w:szCs w:val="28"/>
           <w:lang w:val="en-US"/>
         </w:rPr>
-        <w:t>Vall</w:t>
-      </w:r>
-      <w:r>
-        <w:rPr>
-          <w:rFonts w:cstheme="minorHAnsi"/>
-          <w:sz w:val="28"/>
-          <w:szCs w:val="28"/>
-          <w:lang w:val="en-US"/>
-        </w:rPr>
-        <w:t>è</w:t>
-      </w:r>
-      <w:r>
-        <w:rPr>
-          <w:rFonts w:cstheme="minorHAnsi"/>
-          <w:sz w:val="28"/>
-          <w:szCs w:val="28"/>
-          <w:lang w:val="en-US"/>
-        </w:rPr>
-        <w:t>s</w:t>
-      </w:r>
-      <w:proofErr w:type="spellEnd"/>
-      <w:r>
-        <w:rPr>
-          <w:rFonts w:cstheme="minorHAnsi"/>
-          <w:sz w:val="28"/>
-          <w:szCs w:val="28"/>
-          <w:lang w:val="en-US"/>
-        </w:rPr>
-        <w:t xml:space="preserve">, </w:t>
+        <w:t xml:space="preserve">s, </w:t>
       </w:r>
       <w:r>
         <w:rPr>
@@ -691,33 +623,8 @@
           <w:sz w:val="24"/>
           <w:szCs w:val="24"/>
         </w:rPr>
-        <w:t xml:space="preserve">Ivan </w:t>
-      </w:r>
-      <w:proofErr w:type="spellStart"/>
-      <w:r>
-        <w:rPr>
-          <w:sz w:val="24"/>
-          <w:szCs w:val="24"/>
-        </w:rPr>
-        <w:t>Erill</w:t>
-      </w:r>
-      <w:proofErr w:type="spellEnd"/>
-      <w:r>
-        <w:rPr>
-          <w:sz w:val="24"/>
-          <w:szCs w:val="24"/>
-        </w:rPr>
-        <w:t xml:space="preserve"> </w:t>
-      </w:r>
-      <w:proofErr w:type="spellStart"/>
-      <w:r>
-        <w:rPr>
-          <w:sz w:val="24"/>
-          <w:szCs w:val="24"/>
-        </w:rPr>
-        <w:t>Sagales</w:t>
-      </w:r>
-      <w:proofErr w:type="spellEnd"/>
+        <w:t>Ivan Erill Sagales</w:t>
+      </w:r>
       <w:r>
         <w:rPr>
           <w:sz w:val="24"/>
@@ -765,23 +672,7 @@
           <w:sz w:val="24"/>
           <w:szCs w:val="24"/>
         </w:rPr>
-        <w:t xml:space="preserve">a history and statistics background, Dr. </w:t>
-      </w:r>
-      <w:proofErr w:type="spellStart"/>
-      <w:r>
-        <w:rPr>
-          <w:sz w:val="24"/>
-          <w:szCs w:val="24"/>
-        </w:rPr>
-        <w:t>Erill</w:t>
-      </w:r>
-      <w:proofErr w:type="spellEnd"/>
-      <w:r>
-        <w:rPr>
-          <w:sz w:val="24"/>
-          <w:szCs w:val="24"/>
-        </w:rPr>
-        <w:t xml:space="preserve"> tailored the project to </w:t>
+        <w:t xml:space="preserve">a history and statistics background, Dr. Erill tailored the project to </w:t>
       </w:r>
       <w:r>
         <w:rPr>
@@ -823,23 +714,7 @@
           <w:sz w:val="24"/>
           <w:szCs w:val="24"/>
         </w:rPr>
-        <w:t xml:space="preserve">. Moreover, Dr. </w:t>
-      </w:r>
-      <w:proofErr w:type="spellStart"/>
-      <w:r>
-        <w:rPr>
-          <w:sz w:val="24"/>
-          <w:szCs w:val="24"/>
-        </w:rPr>
-        <w:t>Erill</w:t>
-      </w:r>
-      <w:proofErr w:type="spellEnd"/>
-      <w:r>
-        <w:rPr>
-          <w:sz w:val="24"/>
-          <w:szCs w:val="24"/>
-        </w:rPr>
-        <w:t xml:space="preserve"> worked tirelessly to support me in </w:t>
+        <w:t xml:space="preserve">. Moreover, Dr. Erill worked tirelessly to support me in </w:t>
       </w:r>
       <w:r>
         <w:rPr>
@@ -867,39 +742,7 @@
           <w:sz w:val="24"/>
           <w:szCs w:val="24"/>
         </w:rPr>
-        <w:t xml:space="preserve">scholarship funding for my studies here at the </w:t>
-      </w:r>
-      <w:proofErr w:type="spellStart"/>
-      <w:r>
-        <w:rPr>
-          <w:sz w:val="24"/>
-          <w:szCs w:val="24"/>
-        </w:rPr>
-        <w:t>Universitat</w:t>
-      </w:r>
-      <w:proofErr w:type="spellEnd"/>
-      <w:r>
-        <w:rPr>
-          <w:sz w:val="24"/>
-          <w:szCs w:val="24"/>
-        </w:rPr>
-        <w:t xml:space="preserve"> </w:t>
-      </w:r>
-      <w:proofErr w:type="spellStart"/>
-      <w:r>
-        <w:rPr>
-          <w:sz w:val="24"/>
-          <w:szCs w:val="24"/>
-        </w:rPr>
-        <w:t>Autònoma</w:t>
-      </w:r>
-      <w:proofErr w:type="spellEnd"/>
-      <w:r>
-        <w:rPr>
-          <w:sz w:val="24"/>
-          <w:szCs w:val="24"/>
-        </w:rPr>
-        <w:t xml:space="preserve"> de Barcelona, without which my time here would have been substantially more stressful and challenging. I am grateful to have had the opportunity to work with him</w:t>
+        <w:t>scholarship funding for my studies here at the Universitat Autònoma de Barcelona, without which my time here would have been substantially more stressful and challenging. I am grateful to have had the opportunity to work with him</w:t>
       </w:r>
       <w:r>
         <w:rPr>
@@ -2717,23 +2560,7 @@
           <w:sz w:val="24"/>
           <w:szCs w:val="24"/>
         </w:rPr>
-        <w:t xml:space="preserve">Classical approaches to motif discovery include </w:t>
-      </w:r>
-      <w:proofErr w:type="spellStart"/>
-      <w:r>
-        <w:rPr>
-          <w:sz w:val="24"/>
-          <w:szCs w:val="24"/>
-        </w:rPr>
-        <w:t>ChIP</w:t>
-      </w:r>
-      <w:proofErr w:type="spellEnd"/>
-      <w:r>
-        <w:rPr>
-          <w:sz w:val="24"/>
-          <w:szCs w:val="24"/>
-        </w:rPr>
-        <w:t>-Seq (Chromatin Immunoprecipitation Sequencing) and RNA-Seq.</w:t>
+        <w:t>Classical approaches to motif discovery include ChIP-Seq (Chromatin Immunoprecipitation Sequencing) and RNA-Seq.</w:t>
       </w:r>
       <w:r>
         <w:rPr>
@@ -2762,23 +2589,7 @@
           <w:sz w:val="24"/>
           <w:szCs w:val="24"/>
         </w:rPr>
-        <w:t xml:space="preserve">organism of interest in a petri dish. In </w:t>
-      </w:r>
-      <w:proofErr w:type="spellStart"/>
-      <w:r>
-        <w:rPr>
-          <w:sz w:val="24"/>
-          <w:szCs w:val="24"/>
-        </w:rPr>
-        <w:t>ChIP</w:t>
-      </w:r>
-      <w:proofErr w:type="spellEnd"/>
-      <w:r>
-        <w:rPr>
-          <w:sz w:val="24"/>
-          <w:szCs w:val="24"/>
-        </w:rPr>
-        <w:t xml:space="preserve">-Seq, the transcription factor </w:t>
+        <w:t xml:space="preserve">organism of interest in a petri dish. In ChIP-Seq, the transcription factor </w:t>
       </w:r>
       <w:r>
         <w:rPr>
@@ -3146,23 +2957,7 @@
           <w:sz w:val="24"/>
           <w:szCs w:val="24"/>
         </w:rPr>
-        <w:t xml:space="preserve"> and phylogenetic </w:t>
-      </w:r>
-      <w:proofErr w:type="spellStart"/>
-      <w:r>
-        <w:rPr>
-          <w:sz w:val="24"/>
-          <w:szCs w:val="24"/>
-        </w:rPr>
-        <w:t>footprinting</w:t>
-      </w:r>
-      <w:proofErr w:type="spellEnd"/>
-      <w:r>
-        <w:rPr>
-          <w:sz w:val="24"/>
-          <w:szCs w:val="24"/>
-        </w:rPr>
-        <w:t xml:space="preserve">, </w:t>
+        <w:t xml:space="preserve"> and phylogenetic footprinting, </w:t>
       </w:r>
       <w:r>
         <w:rPr>
@@ -4303,23 +4098,7 @@
           <w:sz w:val="24"/>
           <w:szCs w:val="24"/>
         </w:rPr>
-        <w:t xml:space="preserve"> (</w:t>
-      </w:r>
-      <w:proofErr w:type="spellStart"/>
-      <w:r>
-        <w:rPr>
-          <w:sz w:val="24"/>
-          <w:szCs w:val="24"/>
-        </w:rPr>
-        <w:t>e.g</w:t>
-      </w:r>
-      <w:proofErr w:type="spellEnd"/>
-      <w:r>
-        <w:rPr>
-          <w:sz w:val="24"/>
-          <w:szCs w:val="24"/>
-        </w:rPr>
-        <w:t xml:space="preserve">, </w:t>
+        <w:t xml:space="preserve"> (e.g, </w:t>
       </w:r>
       <w:r>
         <w:rPr>
@@ -5547,23 +5326,7 @@
           <w:sz w:val="24"/>
           <w:szCs w:val="24"/>
         </w:rPr>
-        <w:t xml:space="preserve">(Hypergeometric Optimization of Motif </w:t>
-      </w:r>
-      <w:proofErr w:type="spellStart"/>
-      <w:r>
-        <w:rPr>
-          <w:sz w:val="24"/>
-          <w:szCs w:val="24"/>
-        </w:rPr>
-        <w:t>EnRichment</w:t>
-      </w:r>
-      <w:proofErr w:type="spellEnd"/>
-      <w:r>
-        <w:rPr>
-          <w:sz w:val="24"/>
-          <w:szCs w:val="24"/>
-        </w:rPr>
-        <w:t xml:space="preserve">, 2010) or STREME </w:t>
+        <w:t xml:space="preserve">(Hypergeometric Optimization of Motif EnRichment, 2010) or STREME </w:t>
       </w:r>
       <w:r>
         <w:rPr>
@@ -5819,23 +5582,7 @@
           <w:sz w:val="24"/>
           <w:szCs w:val="24"/>
         </w:rPr>
-        <w:t xml:space="preserve"> compared to five other methods, including deep learning-based and MEME-</w:t>
-      </w:r>
-      <w:proofErr w:type="spellStart"/>
-      <w:r>
-        <w:rPr>
-          <w:sz w:val="24"/>
-          <w:szCs w:val="24"/>
-        </w:rPr>
-        <w:t>ChiP</w:t>
-      </w:r>
-      <w:proofErr w:type="spellEnd"/>
-      <w:r>
-        <w:rPr>
-          <w:sz w:val="24"/>
-          <w:szCs w:val="24"/>
-        </w:rPr>
-        <w:t xml:space="preserve"> algorithms.</w:t>
+        <w:t xml:space="preserve"> compared to five other methods, including deep learning-based and MEME-ChiP algorithms.</w:t>
       </w:r>
       <w:r>
         <w:rPr>
@@ -7230,39 +6977,7 @@
           <w:sz w:val="24"/>
           <w:szCs w:val="24"/>
         </w:rPr>
-        <w:t xml:space="preserve">Given a set of binding site sequences across the FNR-CRP, </w:t>
-      </w:r>
-      <w:proofErr w:type="spellStart"/>
-      <w:r>
-        <w:rPr>
-          <w:sz w:val="24"/>
-          <w:szCs w:val="24"/>
-        </w:rPr>
-        <w:t>LexA</w:t>
-      </w:r>
-      <w:proofErr w:type="spellEnd"/>
-      <w:r>
-        <w:rPr>
-          <w:sz w:val="24"/>
-          <w:szCs w:val="24"/>
-        </w:rPr>
-        <w:t xml:space="preserve">, and </w:t>
-      </w:r>
-      <w:proofErr w:type="spellStart"/>
-      <w:r>
-        <w:rPr>
-          <w:sz w:val="24"/>
-          <w:szCs w:val="24"/>
-        </w:rPr>
-        <w:t>OmpR</w:t>
-      </w:r>
-      <w:proofErr w:type="spellEnd"/>
-      <w:r>
-        <w:rPr>
-          <w:sz w:val="24"/>
-          <w:szCs w:val="24"/>
-        </w:rPr>
-        <w:t xml:space="preserve"> transcription factor families</w:t>
+        <w:t>Given a set of binding site sequences across the FNR-CRP, LexA, and OmpR transcription factor families</w:t>
       </w:r>
       <w:r>
         <w:rPr>
@@ -7920,17 +7635,8 @@
           <w:sz w:val="24"/>
           <w:szCs w:val="24"/>
         </w:rPr>
-        <w:t xml:space="preserve">For example, the </w:t>
-      </w:r>
-      <w:proofErr w:type="spellStart"/>
-      <w:r>
-        <w:rPr>
-          <w:sz w:val="24"/>
-          <w:szCs w:val="24"/>
-        </w:rPr>
-        <w:t>LexA</w:t>
-      </w:r>
-      <w:proofErr w:type="spellEnd"/>
+        <w:t>For example, the LexA</w:t>
+      </w:r>
       <w:r>
         <w:rPr>
           <w:sz w:val="24"/>
@@ -8142,19 +7848,12 @@
         <w:rPr>
           <w:sz w:val="24"/>
           <w:szCs w:val="24"/>
-          <w:lang w:val="es-ES"/>
         </w:rPr>
         <w:drawing>
-          <wp:inline distT="0" distB="0" distL="0" distR="0" wp14:anchorId="64F0CF4F" wp14:editId="3A8A378B">
-            <wp:extent cx="2511221" cy="1253424"/>
-            <wp:effectExtent l="0" t="0" r="3810" b="4445"/>
-            <wp:docPr id="1888632339" name="Picture 8" descr="A diagram of letters and numbers&#10;&#10;AI-generated content may be incorrect.">
-              <a:extLst xmlns:a="http://schemas.openxmlformats.org/drawingml/2006/main">
-                <a:ext uri="{FF2B5EF4-FFF2-40B4-BE49-F238E27FC236}">
-                  <a16:creationId xmlns:a16="http://schemas.microsoft.com/office/drawing/2014/main" id="{089D98F1-D5EA-EA13-5371-E892BEACD021}"/>
-                </a:ext>
-              </a:extLst>
-            </wp:docPr>
+          <wp:inline distT="0" distB="0" distL="0" distR="0" wp14:anchorId="23CF4657" wp14:editId="446E868D">
+            <wp:extent cx="2402235" cy="1201118"/>
+            <wp:effectExtent l="0" t="0" r="0" b="5715"/>
+            <wp:docPr id="1271033627" name="Picture 1" descr="A diagram of numbers and letters&#10;&#10;AI-generated content may be incorrect."/>
             <wp:cNvGraphicFramePr>
               <a:graphicFrameLocks xmlns:a="http://schemas.openxmlformats.org/drawingml/2006/main" noChangeAspect="1"/>
             </wp:cNvGraphicFramePr>
@@ -8162,16 +7861,8 @@
               <a:graphicData uri="http://schemas.openxmlformats.org/drawingml/2006/picture">
                 <pic:pic xmlns:pic="http://schemas.openxmlformats.org/drawingml/2006/picture">
                   <pic:nvPicPr>
-                    <pic:cNvPr id="1888632339" name="Picture 8" descr="A diagram of letters and numbers&#10;&#10;AI-generated content may be incorrect.">
-                      <a:extLst>
-                        <a:ext uri="{FF2B5EF4-FFF2-40B4-BE49-F238E27FC236}">
-                          <a16:creationId xmlns:a16="http://schemas.microsoft.com/office/drawing/2014/main" id="{089D98F1-D5EA-EA13-5371-E892BEACD021}"/>
-                        </a:ext>
-                      </a:extLst>
-                    </pic:cNvPr>
-                    <pic:cNvPicPr>
-                      <a:picLocks noChangeAspect="1"/>
-                    </pic:cNvPicPr>
+                    <pic:cNvPr id="2041645647" name="Picture 1" descr="A diagram of numbers and letters&#10;&#10;AI-generated content may be incorrect."/>
+                    <pic:cNvPicPr/>
                   </pic:nvPicPr>
                   <pic:blipFill>
                     <a:blip r:embed="rId13"/>
@@ -8182,7 +7873,7 @@
                   <pic:spPr>
                     <a:xfrm>
                       <a:off x="0" y="0"/>
-                      <a:ext cx="2539184" cy="1267381"/>
+                      <a:ext cx="2434140" cy="1217070"/>
                     </a:xfrm>
                     <a:prstGeom prst="rect">
                       <a:avLst/>
@@ -10287,17 +9978,8 @@
           <w:sz w:val="24"/>
           <w:szCs w:val="24"/>
         </w:rPr>
-        <w:t xml:space="preserve">The </w:t>
-      </w:r>
-      <w:proofErr w:type="spellStart"/>
-      <w:r>
-        <w:rPr>
-          <w:sz w:val="24"/>
-          <w:szCs w:val="24"/>
-        </w:rPr>
-        <w:t>Kullback</w:t>
-      </w:r>
-      <w:proofErr w:type="spellEnd"/>
+        <w:t>The Kullback</w:t>
+      </w:r>
       <w:r>
         <w:rPr>
           <w:sz w:val="24"/>
@@ -10733,19 +10415,12 @@
         <w:rPr>
           <w:sz w:val="24"/>
           <w:szCs w:val="24"/>
-          <w:lang w:val="es-ES"/>
         </w:rPr>
         <w:drawing>
-          <wp:inline distT="0" distB="0" distL="0" distR="0" wp14:anchorId="045A406C" wp14:editId="443F9955">
-            <wp:extent cx="2040255" cy="1018351"/>
-            <wp:effectExtent l="0" t="0" r="4445" b="0"/>
-            <wp:docPr id="9" name="Picture 8" descr="A diagram of letters and numbers&#10;&#10;AI-generated content may be incorrect.">
-              <a:extLst xmlns:a="http://schemas.openxmlformats.org/drawingml/2006/main">
-                <a:ext uri="{FF2B5EF4-FFF2-40B4-BE49-F238E27FC236}">
-                  <a16:creationId xmlns:a16="http://schemas.microsoft.com/office/drawing/2014/main" id="{089D98F1-D5EA-EA13-5371-E892BEACD021}"/>
-                </a:ext>
-              </a:extLst>
-            </wp:docPr>
+          <wp:inline distT="0" distB="0" distL="0" distR="0" wp14:anchorId="67800A70" wp14:editId="3846535D">
+            <wp:extent cx="2007031" cy="1003516"/>
+            <wp:effectExtent l="0" t="0" r="0" b="0"/>
+            <wp:docPr id="2041645647" name="Picture 1" descr="A diagram of numbers and letters&#10;&#10;AI-generated content may be incorrect."/>
             <wp:cNvGraphicFramePr>
               <a:graphicFrameLocks xmlns:a="http://schemas.openxmlformats.org/drawingml/2006/main" noChangeAspect="1"/>
             </wp:cNvGraphicFramePr>
@@ -10753,16 +10428,8 @@
               <a:graphicData uri="http://schemas.openxmlformats.org/drawingml/2006/picture">
                 <pic:pic xmlns:pic="http://schemas.openxmlformats.org/drawingml/2006/picture">
                   <pic:nvPicPr>
-                    <pic:cNvPr id="9" name="Picture 8" descr="A diagram of letters and numbers&#10;&#10;AI-generated content may be incorrect.">
-                      <a:extLst>
-                        <a:ext uri="{FF2B5EF4-FFF2-40B4-BE49-F238E27FC236}">
-                          <a16:creationId xmlns:a16="http://schemas.microsoft.com/office/drawing/2014/main" id="{089D98F1-D5EA-EA13-5371-E892BEACD021}"/>
-                        </a:ext>
-                      </a:extLst>
-                    </pic:cNvPr>
-                    <pic:cNvPicPr>
-                      <a:picLocks noChangeAspect="1"/>
-                    </pic:cNvPicPr>
+                    <pic:cNvPr id="2041645647" name="Picture 1" descr="A diagram of numbers and letters&#10;&#10;AI-generated content may be incorrect."/>
+                    <pic:cNvPicPr/>
                   </pic:nvPicPr>
                   <pic:blipFill>
                     <a:blip r:embed="rId13"/>
@@ -10773,7 +10440,7 @@
                   <pic:spPr>
                     <a:xfrm>
                       <a:off x="0" y="0"/>
-                      <a:ext cx="2060832" cy="1028621"/>
+                      <a:ext cx="2024895" cy="1012448"/>
                     </a:xfrm>
                     <a:prstGeom prst="rect">
                       <a:avLst/>
@@ -11705,14 +11372,14 @@
         <w:tblLook w:val="0420" w:firstRow="1" w:lastRow="0" w:firstColumn="0" w:lastColumn="0" w:noHBand="0" w:noVBand="1"/>
       </w:tblPr>
       <w:tblGrid>
-        <w:gridCol w:w="1496"/>
-        <w:gridCol w:w="1419"/>
-        <w:gridCol w:w="899"/>
-        <w:gridCol w:w="1176"/>
-        <w:gridCol w:w="752"/>
-        <w:gridCol w:w="803"/>
-        <w:gridCol w:w="1316"/>
-        <w:gridCol w:w="1772"/>
+        <w:gridCol w:w="1521"/>
+        <w:gridCol w:w="1328"/>
+        <w:gridCol w:w="909"/>
+        <w:gridCol w:w="1175"/>
+        <w:gridCol w:w="754"/>
+        <w:gridCol w:w="809"/>
+        <w:gridCol w:w="1342"/>
+        <w:gridCol w:w="1795"/>
       </w:tblGrid>
       <w:tr>
         <w:trPr>
@@ -11740,7 +11407,7 @@
             <w:pPr>
               <w:spacing w:after="0" w:line="240" w:lineRule="auto"/>
               <w:rPr>
-                <w:rFonts w:ascii="Aptos" w:eastAsia="Times New Roman" w:hAnsi="Aptos" w:cs="Arial"/>
+                <w:rFonts w:ascii="Times New Roman" w:eastAsia="Times New Roman" w:hAnsi="Times New Roman" w:cs="Times New Roman"/>
                 <w:sz w:val="24"/>
                 <w:szCs w:val="24"/>
                 <w:lang w:val="en-US" w:eastAsia="ko-KR"/>
@@ -11748,7 +11415,7 @@
             </w:pPr>
             <w:r>
               <w:rPr>
-                <w:rFonts w:ascii="Aptos" w:eastAsia="Times New Roman" w:hAnsi="Aptos" w:cs="Arial"/>
+                <w:rFonts w:ascii="Times New Roman" w:eastAsia="Times New Roman" w:hAnsi="Times New Roman" w:cs="Times New Roman"/>
                 <w:b/>
                 <w:bCs/>
                 <w:color w:val="FFFFFF"/>
@@ -11761,7 +11428,7 @@
             </w:r>
             <w:r>
               <w:rPr>
-                <w:rFonts w:ascii="Aptos" w:eastAsia="Times New Roman" w:hAnsi="Aptos" w:cs="Arial"/>
+                <w:rFonts w:ascii="Times New Roman" w:eastAsia="Times New Roman" w:hAnsi="Times New Roman" w:cs="Times New Roman"/>
                 <w:b/>
                 <w:bCs/>
                 <w:color w:val="FFFFFF"/>
@@ -11796,7 +11463,7 @@
             <w:pPr>
               <w:spacing w:after="0" w:line="240" w:lineRule="auto"/>
               <w:rPr>
-                <w:rFonts w:ascii="Aptos" w:eastAsia="Times New Roman" w:hAnsi="Aptos" w:cs="Arial"/>
+                <w:rFonts w:ascii="Times New Roman" w:eastAsia="Times New Roman" w:hAnsi="Times New Roman" w:cs="Times New Roman"/>
                 <w:sz w:val="24"/>
                 <w:szCs w:val="24"/>
                 <w:lang w:val="en-US" w:eastAsia="ko-KR"/>
@@ -11804,7 +11471,7 @@
             </w:pPr>
             <w:r>
               <w:rPr>
-                <w:rFonts w:ascii="Aptos" w:eastAsia="Times New Roman" w:hAnsi="Aptos" w:cs="Arial"/>
+                <w:rFonts w:ascii="Times New Roman" w:eastAsia="Times New Roman" w:hAnsi="Times New Roman" w:cs="Times New Roman"/>
                 <w:b/>
                 <w:bCs/>
                 <w:color w:val="FFFFFF"/>
@@ -11814,19 +11481,6 @@
                 <w:lang w:val="en-US" w:eastAsia="ko-KR"/>
               </w:rPr>
               <w:t>Scenario</w:t>
-            </w:r>
-            <w:r>
-              <w:rPr>
-                <w:rFonts w:ascii="Aptos" w:eastAsia="Times New Roman" w:hAnsi="Aptos" w:cs="Arial"/>
-                <w:b/>
-                <w:bCs/>
-                <w:color w:val="FFFFFF"/>
-                <w:kern w:val="24"/>
-                <w:sz w:val="24"/>
-                <w:szCs w:val="24"/>
-                <w:lang w:val="en-US" w:eastAsia="ko-KR"/>
-              </w:rPr>
-              <w:t>s</w:t>
             </w:r>
           </w:p>
         </w:tc>
@@ -11852,7 +11506,7 @@
             <w:pPr>
               <w:spacing w:after="0" w:line="240" w:lineRule="auto"/>
               <w:rPr>
-                <w:rFonts w:ascii="Aptos" w:eastAsia="Times New Roman" w:hAnsi="Aptos" w:cs="Arial"/>
+                <w:rFonts w:ascii="Times New Roman" w:eastAsia="Times New Roman" w:hAnsi="Times New Roman" w:cs="Times New Roman"/>
                 <w:sz w:val="24"/>
                 <w:szCs w:val="24"/>
                 <w:lang w:val="en-US" w:eastAsia="ko-KR"/>
@@ -11860,7 +11514,7 @@
             </w:pPr>
             <w:r>
               <w:rPr>
-                <w:rFonts w:ascii="Aptos" w:eastAsia="Times New Roman" w:hAnsi="Aptos" w:cs="Arial"/>
+                <w:rFonts w:ascii="Times New Roman" w:eastAsia="Times New Roman" w:hAnsi="Times New Roman" w:cs="Times New Roman"/>
                 <w:b/>
                 <w:bCs/>
                 <w:color w:val="FFFFFF"/>
@@ -11895,7 +11549,7 @@
             <w:pPr>
               <w:spacing w:after="0" w:line="240" w:lineRule="auto"/>
               <w:rPr>
-                <w:rFonts w:ascii="Aptos" w:eastAsia="Times New Roman" w:hAnsi="Aptos" w:cs="Arial"/>
+                <w:rFonts w:ascii="Times New Roman" w:eastAsia="Times New Roman" w:hAnsi="Times New Roman" w:cs="Times New Roman"/>
                 <w:sz w:val="24"/>
                 <w:szCs w:val="24"/>
                 <w:lang w:val="en-US" w:eastAsia="ko-KR"/>
@@ -11903,7 +11557,7 @@
             </w:pPr>
             <w:r>
               <w:rPr>
-                <w:rFonts w:ascii="Aptos" w:eastAsia="Times New Roman" w:hAnsi="Aptos" w:cs="Arial"/>
+                <w:rFonts w:ascii="Times New Roman" w:eastAsia="Times New Roman" w:hAnsi="Times New Roman" w:cs="Times New Roman"/>
                 <w:b/>
                 <w:bCs/>
                 <w:color w:val="FFFFFF"/>
@@ -11938,7 +11592,7 @@
             <w:pPr>
               <w:spacing w:after="0" w:line="240" w:lineRule="auto"/>
               <w:rPr>
-                <w:rFonts w:ascii="Aptos" w:eastAsia="Times New Roman" w:hAnsi="Aptos" w:cs="Arial"/>
+                <w:rFonts w:ascii="Times New Roman" w:eastAsia="Times New Roman" w:hAnsi="Times New Roman" w:cs="Times New Roman"/>
                 <w:sz w:val="24"/>
                 <w:szCs w:val="24"/>
                 <w:lang w:val="en-US" w:eastAsia="ko-KR"/>
@@ -11946,7 +11600,7 @@
             </w:pPr>
             <w:r>
               <w:rPr>
-                <w:rFonts w:ascii="Aptos" w:eastAsia="Times New Roman" w:hAnsi="Aptos" w:cs="Arial"/>
+                <w:rFonts w:ascii="Times New Roman" w:eastAsia="Times New Roman" w:hAnsi="Times New Roman" w:cs="Times New Roman"/>
                 <w:b/>
                 <w:bCs/>
                 <w:color w:val="FFFFFF"/>
@@ -11981,7 +11635,7 @@
             <w:pPr>
               <w:spacing w:after="0" w:line="240" w:lineRule="auto"/>
               <w:rPr>
-                <w:rFonts w:ascii="Aptos" w:eastAsia="Times New Roman" w:hAnsi="Aptos" w:cs="Arial"/>
+                <w:rFonts w:ascii="Times New Roman" w:eastAsia="Times New Roman" w:hAnsi="Times New Roman" w:cs="Times New Roman"/>
                 <w:b/>
                 <w:bCs/>
                 <w:sz w:val="24"/>
@@ -11991,7 +11645,7 @@
             </w:pPr>
             <w:r>
               <w:rPr>
-                <w:rFonts w:ascii="Aptos" w:eastAsia="Times New Roman" w:hAnsi="Aptos" w:cs="Arial"/>
+                <w:rFonts w:ascii="Times New Roman" w:eastAsia="Times New Roman" w:hAnsi="Times New Roman" w:cs="Times New Roman"/>
                 <w:b/>
                 <w:bCs/>
                 <w:color w:val="FFFFFF" w:themeColor="background1"/>
@@ -12025,7 +11679,7 @@
             <w:pPr>
               <w:spacing w:after="0" w:line="240" w:lineRule="auto"/>
               <w:rPr>
-                <w:rFonts w:ascii="Aptos" w:eastAsia="Times New Roman" w:hAnsi="Aptos" w:cs="Arial"/>
+                <w:rFonts w:ascii="Times New Roman" w:eastAsia="Times New Roman" w:hAnsi="Times New Roman" w:cs="Times New Roman"/>
                 <w:sz w:val="24"/>
                 <w:szCs w:val="24"/>
                 <w:lang w:val="en-US" w:eastAsia="ko-KR"/>
@@ -12033,7 +11687,7 @@
             </w:pPr>
             <w:r>
               <w:rPr>
-                <w:rFonts w:ascii="Aptos" w:eastAsia="Times New Roman" w:hAnsi="Aptos" w:cs="Arial"/>
+                <w:rFonts w:ascii="Times New Roman" w:eastAsia="Times New Roman" w:hAnsi="Times New Roman" w:cs="Times New Roman"/>
                 <w:b/>
                 <w:bCs/>
                 <w:color w:val="FFFFFF"/>
@@ -12046,7 +11700,7 @@
             </w:r>
             <w:r>
               <w:rPr>
-                <w:rFonts w:ascii="Aptos" w:eastAsia="Times New Roman" w:hAnsi="Aptos" w:cs="Arial"/>
+                <w:rFonts w:ascii="Times New Roman" w:eastAsia="Times New Roman" w:hAnsi="Times New Roman" w:cs="Times New Roman"/>
                 <w:b/>
                 <w:bCs/>
                 <w:color w:val="FFFFFF"/>
@@ -12081,7 +11735,7 @@
             <w:pPr>
               <w:spacing w:after="0" w:line="240" w:lineRule="auto"/>
               <w:rPr>
-                <w:rFonts w:ascii="Aptos" w:eastAsia="Times New Roman" w:hAnsi="Aptos" w:cs="Arial"/>
+                <w:rFonts w:ascii="Times New Roman" w:eastAsia="Times New Roman" w:hAnsi="Times New Roman" w:cs="Times New Roman"/>
                 <w:sz w:val="24"/>
                 <w:szCs w:val="24"/>
                 <w:lang w:val="en-US" w:eastAsia="ko-KR"/>
@@ -12089,7 +11743,7 @@
             </w:pPr>
             <w:r>
               <w:rPr>
-                <w:rFonts w:ascii="Aptos" w:eastAsia="Times New Roman" w:hAnsi="Aptos" w:cs="Arial"/>
+                <w:rFonts w:ascii="Times New Roman" w:eastAsia="Times New Roman" w:hAnsi="Times New Roman" w:cs="Times New Roman"/>
                 <w:b/>
                 <w:bCs/>
                 <w:color w:val="FFFFFF"/>
@@ -12102,7 +11756,7 @@
             </w:r>
             <w:r>
               <w:rPr>
-                <w:rFonts w:ascii="Aptos" w:eastAsia="Times New Roman" w:hAnsi="Aptos" w:cs="Arial"/>
+                <w:rFonts w:ascii="Times New Roman" w:eastAsia="Times New Roman" w:hAnsi="Times New Roman" w:cs="Times New Roman"/>
                 <w:b/>
                 <w:bCs/>
                 <w:color w:val="FFFFFF"/>
@@ -12142,7 +11796,7 @@
             <w:pPr>
               <w:spacing w:after="0" w:line="240" w:lineRule="auto"/>
               <w:rPr>
-                <w:rFonts w:ascii="Arial" w:eastAsia="Times New Roman" w:hAnsi="Arial" w:cs="Arial"/>
+                <w:rFonts w:ascii="Times New Roman" w:eastAsia="Times New Roman" w:hAnsi="Times New Roman" w:cs="Times New Roman"/>
                 <w:sz w:val="24"/>
                 <w:szCs w:val="24"/>
                 <w:lang w:val="en-US" w:eastAsia="ko-KR"/>
@@ -12172,7 +11826,7 @@
             <w:pPr>
               <w:spacing w:after="0" w:line="240" w:lineRule="auto"/>
               <w:rPr>
-                <w:rFonts w:ascii="Arial" w:eastAsia="Times New Roman" w:hAnsi="Arial" w:cs="Arial"/>
+                <w:rFonts w:ascii="Times New Roman" w:eastAsia="Times New Roman" w:hAnsi="Times New Roman" w:cs="Times New Roman"/>
                 <w:sz w:val="24"/>
                 <w:szCs w:val="24"/>
                 <w:lang w:val="en-US" w:eastAsia="ko-KR"/>
@@ -12180,42 +11834,29 @@
             </w:pPr>
             <w:r>
               <w:rPr>
-                <w:rFonts w:ascii="Aptos" w:eastAsia="Times New Roman" w:hAnsi="Aptos" w:cs="Arial"/>
+                <w:rFonts w:ascii="Times New Roman" w:eastAsia="Times New Roman" w:hAnsi="Times New Roman" w:cs="Times New Roman"/>
                 <w:color w:val="000000"/>
                 <w:kern w:val="24"/>
                 <w:sz w:val="24"/>
                 <w:szCs w:val="24"/>
                 <w:lang w:val="en-US" w:eastAsia="ko-KR"/>
               </w:rPr>
-              <w:t xml:space="preserve">No </w:t>
+              <w:t xml:space="preserve">Low </w:t>
             </w:r>
-            <w:proofErr w:type="gramStart"/>
             <w:r>
               <w:rPr>
-                <w:rFonts w:ascii="Aptos" w:eastAsia="Times New Roman" w:hAnsi="Aptos" w:cs="Arial"/>
+                <w:rFonts w:ascii="Times New Roman" w:eastAsia="Times New Roman" w:hAnsi="Times New Roman" w:cs="Times New Roman"/>
                 <w:color w:val="000000"/>
                 <w:kern w:val="24"/>
                 <w:sz w:val="24"/>
                 <w:szCs w:val="24"/>
                 <w:lang w:val="en-US" w:eastAsia="ko-KR"/>
               </w:rPr>
-              <w:t>IC  +</w:t>
-            </w:r>
-            <w:proofErr w:type="gramEnd"/>
-            <w:r>
-              <w:rPr>
-                <w:rFonts w:ascii="Aptos" w:eastAsia="Times New Roman" w:hAnsi="Aptos" w:cs="Arial"/>
-                <w:color w:val="000000"/>
-                <w:kern w:val="24"/>
-                <w:sz w:val="24"/>
-                <w:szCs w:val="24"/>
-                <w:lang w:val="en-US" w:eastAsia="ko-KR"/>
-              </w:rPr>
-              <w:t xml:space="preserve"> strongly correlated</w:t>
+              <w:t>IC  + strongly correlated</w:t>
             </w:r>
             <w:r>
               <w:rPr>
-                <w:rFonts w:ascii="Aptos" w:eastAsia="Times New Roman" w:hAnsi="Aptos" w:cs="Arial"/>
+                <w:rFonts w:ascii="Times New Roman" w:eastAsia="Times New Roman" w:hAnsi="Times New Roman" w:cs="Times New Roman"/>
                 <w:color w:val="000000"/>
                 <w:kern w:val="24"/>
                 <w:sz w:val="24"/>
@@ -12248,7 +11889,7 @@
             <w:pPr>
               <w:spacing w:after="0" w:line="240" w:lineRule="auto"/>
               <w:rPr>
-                <w:rFonts w:ascii="Arial" w:eastAsia="Times New Roman" w:hAnsi="Arial" w:cs="Arial"/>
+                <w:rFonts w:ascii="Times New Roman" w:eastAsia="Times New Roman" w:hAnsi="Times New Roman" w:cs="Times New Roman"/>
                 <w:sz w:val="24"/>
                 <w:szCs w:val="24"/>
                 <w:lang w:val="en-US" w:eastAsia="ko-KR"/>
@@ -12256,7 +11897,7 @@
             </w:pPr>
             <w:r>
               <w:rPr>
-                <w:rFonts w:ascii="Aptos" w:eastAsia="Times New Roman" w:hAnsi="Aptos" w:cs="Arial"/>
+                <w:rFonts w:ascii="Times New Roman" w:eastAsia="Times New Roman" w:hAnsi="Times New Roman" w:cs="Times New Roman"/>
                 <w:color w:val="000000"/>
                 <w:kern w:val="24"/>
                 <w:sz w:val="24"/>
@@ -12289,7 +11930,7 @@
             <w:pPr>
               <w:spacing w:after="0" w:line="240" w:lineRule="auto"/>
               <w:rPr>
-                <w:rFonts w:ascii="Arial" w:eastAsia="Times New Roman" w:hAnsi="Arial" w:cs="Arial"/>
+                <w:rFonts w:ascii="Times New Roman" w:eastAsia="Times New Roman" w:hAnsi="Times New Roman" w:cs="Times New Roman"/>
                 <w:sz w:val="24"/>
                 <w:szCs w:val="24"/>
                 <w:lang w:val="en-US" w:eastAsia="ko-KR"/>
@@ -12297,7 +11938,7 @@
             </w:pPr>
             <w:r>
               <w:rPr>
-                <w:rFonts w:ascii="Aptos" w:eastAsia="Times New Roman" w:hAnsi="Aptos" w:cs="Arial"/>
+                <w:rFonts w:ascii="Times New Roman" w:eastAsia="Times New Roman" w:hAnsi="Times New Roman" w:cs="Times New Roman"/>
                 <w:color w:val="000000"/>
                 <w:kern w:val="24"/>
                 <w:sz w:val="24"/>
@@ -12330,7 +11971,7 @@
             <w:pPr>
               <w:spacing w:after="0" w:line="240" w:lineRule="auto"/>
               <w:rPr>
-                <w:rFonts w:ascii="Arial" w:eastAsia="Times New Roman" w:hAnsi="Arial" w:cs="Arial"/>
+                <w:rFonts w:ascii="Times New Roman" w:eastAsia="Times New Roman" w:hAnsi="Times New Roman" w:cs="Times New Roman"/>
                 <w:sz w:val="24"/>
                 <w:szCs w:val="24"/>
                 <w:lang w:val="en-US" w:eastAsia="ko-KR"/>
@@ -12338,7 +11979,7 @@
             </w:pPr>
             <w:r>
               <w:rPr>
-                <w:rFonts w:ascii="Aptos" w:eastAsia="Times New Roman" w:hAnsi="Aptos" w:cs="Arial"/>
+                <w:rFonts w:ascii="Times New Roman" w:eastAsia="Times New Roman" w:hAnsi="Times New Roman" w:cs="Times New Roman"/>
                 <w:color w:val="000000"/>
                 <w:kern w:val="24"/>
                 <w:sz w:val="24"/>
@@ -12371,7 +12012,7 @@
             <w:pPr>
               <w:spacing w:after="0" w:line="240" w:lineRule="auto"/>
               <w:rPr>
-                <w:rFonts w:ascii="Arial" w:eastAsia="Times New Roman" w:hAnsi="Arial" w:cs="Arial"/>
+                <w:rFonts w:ascii="Times New Roman" w:eastAsia="Times New Roman" w:hAnsi="Times New Roman" w:cs="Times New Roman"/>
                 <w:sz w:val="24"/>
                 <w:szCs w:val="24"/>
                 <w:lang w:val="en-US" w:eastAsia="ko-KR"/>
@@ -12379,7 +12020,7 @@
             </w:pPr>
             <w:r>
               <w:rPr>
-                <w:rFonts w:ascii="Aptos" w:eastAsia="Times New Roman" w:hAnsi="Aptos" w:cs="Arial"/>
+                <w:rFonts w:ascii="Times New Roman" w:eastAsia="Times New Roman" w:hAnsi="Times New Roman" w:cs="Times New Roman"/>
                 <w:color w:val="000000"/>
                 <w:kern w:val="24"/>
                 <w:sz w:val="24"/>
@@ -12412,7 +12053,7 @@
             <w:pPr>
               <w:spacing w:after="0" w:line="240" w:lineRule="auto"/>
               <w:rPr>
-                <w:rFonts w:ascii="Arial" w:eastAsia="Times New Roman" w:hAnsi="Arial" w:cs="Arial"/>
+                <w:rFonts w:ascii="Times New Roman" w:eastAsia="Times New Roman" w:hAnsi="Times New Roman" w:cs="Times New Roman"/>
                 <w:sz w:val="24"/>
                 <w:szCs w:val="24"/>
                 <w:lang w:val="en-US" w:eastAsia="ko-KR"/>
@@ -12420,7 +12061,7 @@
             </w:pPr>
             <w:r>
               <w:rPr>
-                <w:rFonts w:ascii="Aptos" w:eastAsia="Times New Roman" w:hAnsi="Aptos" w:cs="Arial"/>
+                <w:rFonts w:ascii="Times New Roman" w:eastAsia="Times New Roman" w:hAnsi="Times New Roman" w:cs="Times New Roman"/>
                 <w:color w:val="000000"/>
                 <w:kern w:val="24"/>
                 <w:sz w:val="24"/>
@@ -12453,7 +12094,7 @@
             <w:pPr>
               <w:spacing w:after="0" w:line="240" w:lineRule="auto"/>
               <w:rPr>
-                <w:rFonts w:ascii="Arial" w:eastAsia="Times New Roman" w:hAnsi="Arial" w:cs="Arial"/>
+                <w:rFonts w:ascii="Times New Roman" w:eastAsia="Times New Roman" w:hAnsi="Times New Roman" w:cs="Times New Roman"/>
                 <w:sz w:val="24"/>
                 <w:szCs w:val="24"/>
                 <w:lang w:val="en-US" w:eastAsia="ko-KR"/>
@@ -12461,7 +12102,7 @@
             </w:pPr>
             <w:r>
               <w:rPr>
-                <w:rFonts w:ascii="Aptos" w:eastAsia="Times New Roman" w:hAnsi="Aptos" w:cs="Arial"/>
+                <w:rFonts w:ascii="Times New Roman" w:eastAsia="Times New Roman" w:hAnsi="Times New Roman" w:cs="Times New Roman"/>
                 <w:color w:val="000000"/>
                 <w:kern w:val="24"/>
                 <w:sz w:val="24"/>
@@ -12499,7 +12140,7 @@
             <w:pPr>
               <w:spacing w:after="0" w:line="240" w:lineRule="auto"/>
               <w:rPr>
-                <w:rFonts w:ascii="Arial" w:eastAsia="Times New Roman" w:hAnsi="Arial" w:cs="Arial"/>
+                <w:rFonts w:ascii="Times New Roman" w:eastAsia="Times New Roman" w:hAnsi="Times New Roman" w:cs="Times New Roman"/>
                 <w:sz w:val="24"/>
                 <w:szCs w:val="24"/>
                 <w:lang w:val="en-US" w:eastAsia="ko-KR"/>
@@ -12507,7 +12148,7 @@
             </w:pPr>
             <w:r>
               <w:rPr>
-                <w:rFonts w:ascii="Aptos" w:eastAsia="Times New Roman" w:hAnsi="Aptos" w:cs="Arial"/>
+                <w:rFonts w:ascii="Times New Roman" w:eastAsia="Times New Roman" w:hAnsi="Times New Roman" w:cs="Times New Roman"/>
                 <w:color w:val="000000"/>
                 <w:kern w:val="24"/>
                 <w:sz w:val="24"/>
@@ -12540,7 +12181,7 @@
             <w:pPr>
               <w:spacing w:after="0" w:line="240" w:lineRule="auto"/>
               <w:rPr>
-                <w:rFonts w:ascii="Arial" w:eastAsia="Times New Roman" w:hAnsi="Arial" w:cs="Arial"/>
+                <w:rFonts w:ascii="Times New Roman" w:eastAsia="Times New Roman" w:hAnsi="Times New Roman" w:cs="Times New Roman"/>
                 <w:sz w:val="24"/>
                 <w:szCs w:val="24"/>
                 <w:lang w:val="en-US" w:eastAsia="ko-KR"/>
@@ -12548,7 +12189,7 @@
             </w:pPr>
             <w:r>
               <w:rPr>
-                <w:rFonts w:ascii="Aptos" w:eastAsia="Times New Roman" w:hAnsi="Aptos" w:cs="Arial"/>
+                <w:rFonts w:ascii="Times New Roman" w:eastAsia="Times New Roman" w:hAnsi="Times New Roman" w:cs="Times New Roman"/>
                 <w:color w:val="000000"/>
                 <w:kern w:val="24"/>
                 <w:sz w:val="24"/>
@@ -12581,7 +12222,7 @@
             <w:pPr>
               <w:spacing w:after="0" w:line="240" w:lineRule="auto"/>
               <w:rPr>
-                <w:rFonts w:ascii="Arial" w:eastAsia="Times New Roman" w:hAnsi="Arial" w:cs="Arial"/>
+                <w:rFonts w:ascii="Times New Roman" w:eastAsia="Times New Roman" w:hAnsi="Times New Roman" w:cs="Times New Roman"/>
                 <w:sz w:val="24"/>
                 <w:szCs w:val="24"/>
                 <w:lang w:val="en-US" w:eastAsia="ko-KR"/>
@@ -12589,7 +12230,7 @@
             </w:pPr>
             <w:r>
               <w:rPr>
-                <w:rFonts w:ascii="Aptos" w:eastAsia="Times New Roman" w:hAnsi="Aptos" w:cs="Arial"/>
+                <w:rFonts w:ascii="Times New Roman" w:eastAsia="Times New Roman" w:hAnsi="Times New Roman" w:cs="Times New Roman"/>
                 <w:color w:val="000000"/>
                 <w:kern w:val="24"/>
                 <w:sz w:val="24"/>
@@ -12622,7 +12263,7 @@
             <w:pPr>
               <w:spacing w:after="0" w:line="240" w:lineRule="auto"/>
               <w:rPr>
-                <w:rFonts w:ascii="Arial" w:eastAsia="Times New Roman" w:hAnsi="Arial" w:cs="Arial"/>
+                <w:rFonts w:ascii="Times New Roman" w:eastAsia="Times New Roman" w:hAnsi="Times New Roman" w:cs="Times New Roman"/>
                 <w:sz w:val="24"/>
                 <w:szCs w:val="24"/>
                 <w:lang w:val="en-US" w:eastAsia="ko-KR"/>
@@ -12630,7 +12271,7 @@
             </w:pPr>
             <w:r>
               <w:rPr>
-                <w:rFonts w:ascii="Aptos" w:eastAsia="Times New Roman" w:hAnsi="Aptos" w:cs="Arial"/>
+                <w:rFonts w:ascii="Times New Roman" w:eastAsia="Times New Roman" w:hAnsi="Times New Roman" w:cs="Times New Roman"/>
                 <w:color w:val="000000"/>
                 <w:kern w:val="24"/>
                 <w:sz w:val="24"/>
@@ -12663,7 +12304,7 @@
             <w:pPr>
               <w:spacing w:after="0" w:line="240" w:lineRule="auto"/>
               <w:rPr>
-                <w:rFonts w:ascii="Arial" w:eastAsia="Times New Roman" w:hAnsi="Arial" w:cs="Arial"/>
+                <w:rFonts w:ascii="Times New Roman" w:eastAsia="Times New Roman" w:hAnsi="Times New Roman" w:cs="Times New Roman"/>
                 <w:sz w:val="24"/>
                 <w:szCs w:val="24"/>
                 <w:lang w:val="en-US" w:eastAsia="ko-KR"/>
@@ -12671,7 +12312,7 @@
             </w:pPr>
             <w:r>
               <w:rPr>
-                <w:rFonts w:ascii="Aptos" w:eastAsia="Times New Roman" w:hAnsi="Aptos" w:cs="Arial"/>
+                <w:rFonts w:ascii="Times New Roman" w:eastAsia="Times New Roman" w:hAnsi="Times New Roman" w:cs="Times New Roman"/>
                 <w:color w:val="000000"/>
                 <w:kern w:val="24"/>
                 <w:sz w:val="24"/>
@@ -12704,7 +12345,7 @@
             <w:pPr>
               <w:spacing w:after="0" w:line="240" w:lineRule="auto"/>
               <w:rPr>
-                <w:rFonts w:ascii="Arial" w:eastAsia="Times New Roman" w:hAnsi="Arial" w:cs="Arial"/>
+                <w:rFonts w:ascii="Times New Roman" w:eastAsia="Times New Roman" w:hAnsi="Times New Roman" w:cs="Times New Roman"/>
                 <w:sz w:val="24"/>
                 <w:szCs w:val="24"/>
                 <w:lang w:val="en-US" w:eastAsia="ko-KR"/>
@@ -12712,7 +12353,7 @@
             </w:pPr>
             <w:r>
               <w:rPr>
-                <w:rFonts w:ascii="Aptos" w:eastAsia="Times New Roman" w:hAnsi="Aptos" w:cs="Arial"/>
+                <w:rFonts w:ascii="Times New Roman" w:eastAsia="Times New Roman" w:hAnsi="Times New Roman" w:cs="Times New Roman"/>
                 <w:color w:val="000000"/>
                 <w:kern w:val="24"/>
                 <w:sz w:val="24"/>
@@ -12745,7 +12386,7 @@
             <w:pPr>
               <w:spacing w:after="0" w:line="240" w:lineRule="auto"/>
               <w:rPr>
-                <w:rFonts w:ascii="Arial" w:eastAsia="Times New Roman" w:hAnsi="Arial" w:cs="Arial"/>
+                <w:rFonts w:ascii="Times New Roman" w:eastAsia="Times New Roman" w:hAnsi="Times New Roman" w:cs="Times New Roman"/>
                 <w:sz w:val="24"/>
                 <w:szCs w:val="24"/>
                 <w:lang w:val="en-US" w:eastAsia="ko-KR"/>
@@ -12753,7 +12394,7 @@
             </w:pPr>
             <w:r>
               <w:rPr>
-                <w:rFonts w:ascii="Aptos" w:eastAsia="Times New Roman" w:hAnsi="Aptos" w:cs="Arial"/>
+                <w:rFonts w:ascii="Times New Roman" w:eastAsia="Times New Roman" w:hAnsi="Times New Roman" w:cs="Times New Roman"/>
                 <w:color w:val="000000"/>
                 <w:kern w:val="24"/>
                 <w:sz w:val="24"/>
@@ -12786,7 +12427,7 @@
             <w:pPr>
               <w:spacing w:after="0" w:line="240" w:lineRule="auto"/>
               <w:rPr>
-                <w:rFonts w:ascii="Arial" w:eastAsia="Times New Roman" w:hAnsi="Arial" w:cs="Arial"/>
+                <w:rFonts w:ascii="Times New Roman" w:eastAsia="Times New Roman" w:hAnsi="Times New Roman" w:cs="Times New Roman"/>
                 <w:sz w:val="24"/>
                 <w:szCs w:val="24"/>
                 <w:lang w:val="en-US" w:eastAsia="ko-KR"/>
@@ -12794,7 +12435,7 @@
             </w:pPr>
             <w:r>
               <w:rPr>
-                <w:rFonts w:ascii="Aptos" w:eastAsia="Times New Roman" w:hAnsi="Aptos" w:cs="Arial"/>
+                <w:rFonts w:ascii="Times New Roman" w:eastAsia="Times New Roman" w:hAnsi="Times New Roman" w:cs="Times New Roman"/>
                 <w:color w:val="000000"/>
                 <w:kern w:val="24"/>
                 <w:sz w:val="24"/>
@@ -12832,7 +12473,7 @@
             <w:pPr>
               <w:spacing w:after="0" w:line="240" w:lineRule="auto"/>
               <w:rPr>
-                <w:rFonts w:ascii="Arial" w:eastAsia="Times New Roman" w:hAnsi="Arial" w:cs="Arial"/>
+                <w:rFonts w:ascii="Times New Roman" w:eastAsia="Times New Roman" w:hAnsi="Times New Roman" w:cs="Times New Roman"/>
                 <w:sz w:val="24"/>
                 <w:szCs w:val="24"/>
                 <w:lang w:val="en-US" w:eastAsia="ko-KR"/>
@@ -12840,7 +12481,7 @@
             </w:pPr>
             <w:r>
               <w:rPr>
-                <w:rFonts w:ascii="Aptos" w:eastAsia="Times New Roman" w:hAnsi="Aptos" w:cs="Arial"/>
+                <w:rFonts w:ascii="Times New Roman" w:eastAsia="Times New Roman" w:hAnsi="Times New Roman" w:cs="Times New Roman"/>
                 <w:color w:val="000000"/>
                 <w:kern w:val="24"/>
                 <w:sz w:val="24"/>
@@ -12873,7 +12514,7 @@
             <w:pPr>
               <w:spacing w:after="0" w:line="240" w:lineRule="auto"/>
               <w:rPr>
-                <w:rFonts w:ascii="Arial" w:eastAsia="Times New Roman" w:hAnsi="Arial" w:cs="Arial"/>
+                <w:rFonts w:ascii="Times New Roman" w:eastAsia="Times New Roman" w:hAnsi="Times New Roman" w:cs="Times New Roman"/>
                 <w:sz w:val="24"/>
                 <w:szCs w:val="24"/>
                 <w:lang w:val="en-US" w:eastAsia="ko-KR"/>
@@ -12881,7 +12522,7 @@
             </w:pPr>
             <w:r>
               <w:rPr>
-                <w:rFonts w:ascii="Aptos" w:eastAsia="Times New Roman" w:hAnsi="Aptos" w:cs="Arial"/>
+                <w:rFonts w:ascii="Times New Roman" w:eastAsia="Times New Roman" w:hAnsi="Times New Roman" w:cs="Times New Roman"/>
                 <w:color w:val="000000"/>
                 <w:kern w:val="24"/>
                 <w:sz w:val="24"/>
@@ -12892,28 +12533,15 @@
             </w:r>
             <w:r>
               <w:rPr>
-                <w:rFonts w:ascii="Aptos" w:eastAsia="Times New Roman" w:hAnsi="Aptos" w:cs="Arial"/>
+                <w:rFonts w:ascii="Times New Roman" w:eastAsia="Times New Roman" w:hAnsi="Times New Roman" w:cs="Times New Roman"/>
                 <w:color w:val="000000"/>
                 <w:kern w:val="24"/>
                 <w:sz w:val="24"/>
                 <w:szCs w:val="24"/>
                 <w:lang w:val="en-US" w:eastAsia="ko-KR"/>
               </w:rPr>
-              <w:t xml:space="preserve">+ neg </w:t>
+              <w:t>+ neg corr</w:t>
             </w:r>
-            <w:proofErr w:type="spellStart"/>
-            <w:r>
-              <w:rPr>
-                <w:rFonts w:ascii="Aptos" w:eastAsia="Times New Roman" w:hAnsi="Aptos" w:cs="Arial"/>
-                <w:color w:val="000000"/>
-                <w:kern w:val="24"/>
-                <w:sz w:val="24"/>
-                <w:szCs w:val="24"/>
-                <w:lang w:val="en-US" w:eastAsia="ko-KR"/>
-              </w:rPr>
-              <w:t>corr</w:t>
-            </w:r>
-            <w:proofErr w:type="spellEnd"/>
           </w:p>
         </w:tc>
         <w:tc>
@@ -12938,35 +12566,22 @@
             <w:pPr>
               <w:spacing w:after="0" w:line="240" w:lineRule="auto"/>
               <w:rPr>
-                <w:rFonts w:ascii="Arial" w:eastAsia="Times New Roman" w:hAnsi="Arial" w:cs="Arial"/>
+                <w:rFonts w:ascii="Times New Roman" w:eastAsia="Times New Roman" w:hAnsi="Times New Roman" w:cs="Times New Roman"/>
                 <w:sz w:val="24"/>
                 <w:szCs w:val="24"/>
                 <w:lang w:val="en-US" w:eastAsia="ko-KR"/>
               </w:rPr>
             </w:pPr>
-            <w:proofErr w:type="gramStart"/>
             <w:r>
               <w:rPr>
-                <w:rFonts w:ascii="Aptos" w:eastAsia="Times New Roman" w:hAnsi="Aptos" w:cs="Arial"/>
+                <w:rFonts w:ascii="Times New Roman" w:eastAsia="Times New Roman" w:hAnsi="Times New Roman" w:cs="Times New Roman"/>
                 <w:color w:val="000000"/>
                 <w:kern w:val="24"/>
                 <w:sz w:val="24"/>
                 <w:szCs w:val="24"/>
                 <w:lang w:val="en-US" w:eastAsia="ko-KR"/>
               </w:rPr>
-              <w:t>32 ,</w:t>
-            </w:r>
-            <w:proofErr w:type="gramEnd"/>
-            <w:r>
-              <w:rPr>
-                <w:rFonts w:ascii="Aptos" w:eastAsia="Times New Roman" w:hAnsi="Aptos" w:cs="Arial"/>
-                <w:color w:val="000000"/>
-                <w:kern w:val="24"/>
-                <w:sz w:val="24"/>
-                <w:szCs w:val="24"/>
-                <w:lang w:val="en-US" w:eastAsia="ko-KR"/>
-              </w:rPr>
-              <w:t xml:space="preserve"> 6 </w:t>
+              <w:t xml:space="preserve">32 , 6 </w:t>
             </w:r>
           </w:p>
         </w:tc>
@@ -12992,7 +12607,7 @@
             <w:pPr>
               <w:spacing w:after="0" w:line="240" w:lineRule="auto"/>
               <w:rPr>
-                <w:rFonts w:ascii="Arial" w:eastAsia="Times New Roman" w:hAnsi="Arial" w:cs="Arial"/>
+                <w:rFonts w:ascii="Times New Roman" w:eastAsia="Times New Roman" w:hAnsi="Times New Roman" w:cs="Times New Roman"/>
                 <w:sz w:val="24"/>
                 <w:szCs w:val="24"/>
                 <w:lang w:val="en-US" w:eastAsia="ko-KR"/>
@@ -13000,7 +12615,7 @@
             </w:pPr>
             <w:r>
               <w:rPr>
-                <w:rFonts w:ascii="Aptos" w:eastAsia="Times New Roman" w:hAnsi="Aptos" w:cs="Arial"/>
+                <w:rFonts w:ascii="Times New Roman" w:eastAsia="Times New Roman" w:hAnsi="Times New Roman" w:cs="Times New Roman"/>
                 <w:color w:val="000000"/>
                 <w:kern w:val="24"/>
                 <w:sz w:val="24"/>
@@ -13033,7 +12648,7 @@
             <w:pPr>
               <w:spacing w:after="0" w:line="240" w:lineRule="auto"/>
               <w:rPr>
-                <w:rFonts w:ascii="Arial" w:eastAsia="Times New Roman" w:hAnsi="Arial" w:cs="Arial"/>
+                <w:rFonts w:ascii="Times New Roman" w:eastAsia="Times New Roman" w:hAnsi="Times New Roman" w:cs="Times New Roman"/>
                 <w:sz w:val="24"/>
                 <w:szCs w:val="24"/>
                 <w:lang w:val="en-US" w:eastAsia="ko-KR"/>
@@ -13041,7 +12656,7 @@
             </w:pPr>
             <w:r>
               <w:rPr>
-                <w:rFonts w:ascii="Arial" w:eastAsia="Times New Roman" w:hAnsi="Arial" w:cs="Arial"/>
+                <w:rFonts w:ascii="Times New Roman" w:eastAsia="Times New Roman" w:hAnsi="Times New Roman" w:cs="Times New Roman"/>
                 <w:sz w:val="24"/>
                 <w:szCs w:val="24"/>
                 <w:lang w:val="en-US" w:eastAsia="ko-KR"/>
@@ -13072,7 +12687,7 @@
             <w:pPr>
               <w:spacing w:after="0" w:line="240" w:lineRule="auto"/>
               <w:rPr>
-                <w:rFonts w:ascii="Arial" w:eastAsia="Times New Roman" w:hAnsi="Arial" w:cs="Arial"/>
+                <w:rFonts w:ascii="Times New Roman" w:eastAsia="Times New Roman" w:hAnsi="Times New Roman" w:cs="Times New Roman"/>
                 <w:sz w:val="24"/>
                 <w:szCs w:val="24"/>
                 <w:lang w:val="en-US" w:eastAsia="ko-KR"/>
@@ -13080,7 +12695,7 @@
             </w:pPr>
             <w:r>
               <w:rPr>
-                <w:rFonts w:ascii="Aptos" w:eastAsia="Times New Roman" w:hAnsi="Aptos" w:cs="Arial"/>
+                <w:rFonts w:ascii="Times New Roman" w:eastAsia="Times New Roman" w:hAnsi="Times New Roman" w:cs="Times New Roman"/>
                 <w:color w:val="000000"/>
                 <w:kern w:val="24"/>
                 <w:sz w:val="24"/>
@@ -13113,7 +12728,7 @@
             <w:pPr>
               <w:spacing w:after="0" w:line="240" w:lineRule="auto"/>
               <w:rPr>
-                <w:rFonts w:ascii="Arial" w:eastAsia="Times New Roman" w:hAnsi="Arial" w:cs="Arial"/>
+                <w:rFonts w:ascii="Times New Roman" w:eastAsia="Times New Roman" w:hAnsi="Times New Roman" w:cs="Times New Roman"/>
                 <w:sz w:val="24"/>
                 <w:szCs w:val="24"/>
                 <w:lang w:val="en-US" w:eastAsia="ko-KR"/>
@@ -13121,7 +12736,7 @@
             </w:pPr>
             <w:r>
               <w:rPr>
-                <w:rFonts w:ascii="Arial" w:eastAsia="Times New Roman" w:hAnsi="Arial" w:cs="Arial"/>
+                <w:rFonts w:ascii="Times New Roman" w:eastAsia="Times New Roman" w:hAnsi="Times New Roman" w:cs="Times New Roman"/>
                 <w:sz w:val="24"/>
                 <w:szCs w:val="24"/>
                 <w:lang w:val="en-US" w:eastAsia="ko-KR"/>
@@ -13152,7 +12767,7 @@
             <w:pPr>
               <w:spacing w:after="0" w:line="240" w:lineRule="auto"/>
               <w:rPr>
-                <w:rFonts w:ascii="Arial" w:eastAsia="Times New Roman" w:hAnsi="Arial" w:cs="Arial"/>
+                <w:rFonts w:ascii="Times New Roman" w:eastAsia="Times New Roman" w:hAnsi="Times New Roman" w:cs="Times New Roman"/>
                 <w:sz w:val="24"/>
                 <w:szCs w:val="24"/>
                 <w:lang w:val="en-US" w:eastAsia="ko-KR"/>
@@ -13160,7 +12775,7 @@
             </w:pPr>
             <w:r>
               <w:rPr>
-                <w:rFonts w:ascii="Aptos" w:eastAsia="Times New Roman" w:hAnsi="Aptos" w:cs="Arial"/>
+                <w:rFonts w:ascii="Times New Roman" w:eastAsia="Times New Roman" w:hAnsi="Times New Roman" w:cs="Times New Roman"/>
                 <w:color w:val="000000"/>
                 <w:kern w:val="24"/>
                 <w:sz w:val="24"/>
@@ -13198,7 +12813,7 @@
             <w:pPr>
               <w:spacing w:after="0" w:line="240" w:lineRule="auto"/>
               <w:rPr>
-                <w:rFonts w:ascii="Arial" w:eastAsia="Times New Roman" w:hAnsi="Arial" w:cs="Arial"/>
+                <w:rFonts w:ascii="Times New Roman" w:eastAsia="Times New Roman" w:hAnsi="Times New Roman" w:cs="Times New Roman"/>
                 <w:sz w:val="24"/>
                 <w:szCs w:val="24"/>
                 <w:lang w:val="en-US" w:eastAsia="ko-KR"/>
@@ -13206,7 +12821,7 @@
             </w:pPr>
             <w:r>
               <w:rPr>
-                <w:rFonts w:ascii="Aptos" w:eastAsia="Times New Roman" w:hAnsi="Aptos" w:cs="Arial"/>
+                <w:rFonts w:ascii="Times New Roman" w:eastAsia="Times New Roman" w:hAnsi="Times New Roman" w:cs="Times New Roman"/>
                 <w:color w:val="000000"/>
                 <w:kern w:val="24"/>
                 <w:sz w:val="24"/>
@@ -13239,7 +12854,7 @@
             <w:pPr>
               <w:spacing w:after="0" w:line="240" w:lineRule="auto"/>
               <w:rPr>
-                <w:rFonts w:ascii="Arial" w:eastAsia="Times New Roman" w:hAnsi="Arial" w:cs="Arial"/>
+                <w:rFonts w:ascii="Times New Roman" w:eastAsia="Times New Roman" w:hAnsi="Times New Roman" w:cs="Times New Roman"/>
                 <w:sz w:val="24"/>
                 <w:szCs w:val="24"/>
                 <w:lang w:val="en-US" w:eastAsia="ko-KR"/>
@@ -13247,7 +12862,7 @@
             </w:pPr>
             <w:r>
               <w:rPr>
-                <w:rFonts w:ascii="Aptos" w:eastAsia="Times New Roman" w:hAnsi="Aptos" w:cs="Arial"/>
+                <w:rFonts w:ascii="Times New Roman" w:eastAsia="Times New Roman" w:hAnsi="Times New Roman" w:cs="Times New Roman"/>
                 <w:color w:val="000000"/>
                 <w:kern w:val="24"/>
                 <w:sz w:val="24"/>
@@ -13280,7 +12895,7 @@
             <w:pPr>
               <w:spacing w:after="0" w:line="240" w:lineRule="auto"/>
               <w:rPr>
-                <w:rFonts w:ascii="Arial" w:eastAsia="Times New Roman" w:hAnsi="Arial" w:cs="Arial"/>
+                <w:rFonts w:ascii="Times New Roman" w:eastAsia="Times New Roman" w:hAnsi="Times New Roman" w:cs="Times New Roman"/>
                 <w:sz w:val="24"/>
                 <w:szCs w:val="24"/>
                 <w:lang w:val="en-US" w:eastAsia="ko-KR"/>
@@ -13288,7 +12903,7 @@
             </w:pPr>
             <w:r>
               <w:rPr>
-                <w:rFonts w:ascii="Aptos" w:eastAsia="Times New Roman" w:hAnsi="Aptos" w:cs="Arial"/>
+                <w:rFonts w:ascii="Times New Roman" w:eastAsia="Times New Roman" w:hAnsi="Times New Roman" w:cs="Times New Roman"/>
                 <w:color w:val="000000"/>
                 <w:kern w:val="24"/>
                 <w:sz w:val="24"/>
@@ -13321,7 +12936,7 @@
             <w:pPr>
               <w:spacing w:after="0" w:line="240" w:lineRule="auto"/>
               <w:rPr>
-                <w:rFonts w:ascii="Arial" w:eastAsia="Times New Roman" w:hAnsi="Arial" w:cs="Arial"/>
+                <w:rFonts w:ascii="Times New Roman" w:eastAsia="Times New Roman" w:hAnsi="Times New Roman" w:cs="Times New Roman"/>
                 <w:sz w:val="24"/>
                 <w:szCs w:val="24"/>
                 <w:lang w:val="en-US" w:eastAsia="ko-KR"/>
@@ -13329,7 +12944,7 @@
             </w:pPr>
             <w:r>
               <w:rPr>
-                <w:rFonts w:ascii="Aptos" w:eastAsia="Times New Roman" w:hAnsi="Aptos" w:cs="Arial"/>
+                <w:rFonts w:ascii="Times New Roman" w:eastAsia="Times New Roman" w:hAnsi="Times New Roman" w:cs="Times New Roman"/>
                 <w:color w:val="000000"/>
                 <w:kern w:val="24"/>
                 <w:sz w:val="24"/>
@@ -13362,7 +12977,7 @@
             <w:pPr>
               <w:spacing w:after="0" w:line="240" w:lineRule="auto"/>
               <w:rPr>
-                <w:rFonts w:ascii="Arial" w:eastAsia="Times New Roman" w:hAnsi="Arial" w:cs="Arial"/>
+                <w:rFonts w:ascii="Times New Roman" w:eastAsia="Times New Roman" w:hAnsi="Times New Roman" w:cs="Times New Roman"/>
                 <w:sz w:val="24"/>
                 <w:szCs w:val="24"/>
                 <w:lang w:val="en-US" w:eastAsia="ko-KR"/>
@@ -13370,7 +12985,7 @@
             </w:pPr>
             <w:r>
               <w:rPr>
-                <w:rFonts w:ascii="Aptos" w:eastAsia="Times New Roman" w:hAnsi="Aptos" w:cs="Arial"/>
+                <w:rFonts w:ascii="Times New Roman" w:eastAsia="Times New Roman" w:hAnsi="Times New Roman" w:cs="Times New Roman"/>
                 <w:color w:val="000000"/>
                 <w:kern w:val="24"/>
                 <w:sz w:val="24"/>
@@ -13403,7 +13018,7 @@
             <w:pPr>
               <w:spacing w:after="0" w:line="240" w:lineRule="auto"/>
               <w:rPr>
-                <w:rFonts w:ascii="Arial" w:eastAsia="Times New Roman" w:hAnsi="Arial" w:cs="Arial"/>
+                <w:rFonts w:ascii="Times New Roman" w:eastAsia="Times New Roman" w:hAnsi="Times New Roman" w:cs="Times New Roman"/>
                 <w:sz w:val="24"/>
                 <w:szCs w:val="24"/>
                 <w:lang w:val="en-US" w:eastAsia="ko-KR"/>
@@ -13411,7 +13026,7 @@
             </w:pPr>
             <w:r>
               <w:rPr>
-                <w:rFonts w:ascii="Aptos" w:eastAsia="Times New Roman" w:hAnsi="Aptos" w:cs="Arial"/>
+                <w:rFonts w:ascii="Times New Roman" w:eastAsia="Times New Roman" w:hAnsi="Times New Roman" w:cs="Times New Roman"/>
                 <w:color w:val="000000"/>
                 <w:kern w:val="24"/>
                 <w:sz w:val="24"/>
@@ -13444,7 +13059,7 @@
             <w:pPr>
               <w:spacing w:after="0" w:line="240" w:lineRule="auto"/>
               <w:rPr>
-                <w:rFonts w:ascii="Arial" w:eastAsia="Times New Roman" w:hAnsi="Arial" w:cs="Arial"/>
+                <w:rFonts w:ascii="Times New Roman" w:eastAsia="Times New Roman" w:hAnsi="Times New Roman" w:cs="Times New Roman"/>
                 <w:sz w:val="24"/>
                 <w:szCs w:val="24"/>
                 <w:lang w:val="en-US" w:eastAsia="ko-KR"/>
@@ -13452,7 +13067,7 @@
             </w:pPr>
             <w:r>
               <w:rPr>
-                <w:rFonts w:ascii="Aptos" w:eastAsia="Times New Roman" w:hAnsi="Aptos" w:cs="Arial"/>
+                <w:rFonts w:ascii="Times New Roman" w:eastAsia="Times New Roman" w:hAnsi="Times New Roman" w:cs="Times New Roman"/>
                 <w:color w:val="000000"/>
                 <w:kern w:val="24"/>
                 <w:sz w:val="24"/>
@@ -13485,7 +13100,7 @@
             <w:pPr>
               <w:spacing w:after="0" w:line="240" w:lineRule="auto"/>
               <w:rPr>
-                <w:rFonts w:ascii="Arial" w:eastAsia="Times New Roman" w:hAnsi="Arial" w:cs="Arial"/>
+                <w:rFonts w:ascii="Times New Roman" w:eastAsia="Times New Roman" w:hAnsi="Times New Roman" w:cs="Times New Roman"/>
                 <w:sz w:val="24"/>
                 <w:szCs w:val="24"/>
                 <w:lang w:val="en-US" w:eastAsia="ko-KR"/>
@@ -13493,7 +13108,7 @@
             </w:pPr>
             <w:r>
               <w:rPr>
-                <w:rFonts w:ascii="Aptos" w:eastAsia="Times New Roman" w:hAnsi="Aptos" w:cs="Arial"/>
+                <w:rFonts w:ascii="Times New Roman" w:eastAsia="Times New Roman" w:hAnsi="Times New Roman" w:cs="Times New Roman"/>
                 <w:color w:val="000000"/>
                 <w:kern w:val="24"/>
                 <w:sz w:val="24"/>
@@ -13523,6 +13138,7 @@
           <w:sz w:val="24"/>
           <w:szCs w:val="24"/>
         </w:rPr>
+        <w:lastRenderedPageBreak/>
         <w:t>Table 3. Scenario modeling the pitfalls of various concordance metrics using the simple example. We see the effect of applying the JSD as a penalty, and the downsides of using the Pearson and JSD alone in uniform cases.</w:t>
       </w:r>
     </w:p>
@@ -13739,7 +13355,7 @@
         <w:rPr>
           <w:noProof/>
         </w:rPr>
-        <w:t>Figure 4. A comparison of the matrix of PIC metric vs that of the PIC – JSD hybrid matrix.</w:t>
+        <w:t>Figure 4. A comparison of the matrix of PIC metric vs that of the PIC – JSD.</w:t>
       </w:r>
     </w:p>
     <w:p>
@@ -14029,6 +13645,13 @@
         </w:rPr>
         <w:t xml:space="preserve">. </w:t>
       </w:r>
+      <w:r>
+        <w:rPr>
+          <w:sz w:val="24"/>
+          <w:szCs w:val="24"/>
+        </w:rPr>
+        <w:t>Mapped back to the sequence logo, the matrices above visualize this direct repeat relationship:</w:t>
+      </w:r>
     </w:p>
     <w:p>
       <w:pPr>
@@ -14042,6 +13665,104 @@
     <w:p>
       <w:pPr>
         <w:pStyle w:val="p1"/>
+        <w:jc w:val="center"/>
+        <w:rPr>
+          <w:sz w:val="24"/>
+          <w:szCs w:val="24"/>
+        </w:rPr>
+      </w:pPr>
+      <w:r>
+        <w:rPr>
+          <w:sz w:val="24"/>
+          <w:szCs w:val="24"/>
+        </w:rPr>
+        <w:drawing>
+          <wp:inline distT="0" distB="0" distL="0" distR="0" wp14:anchorId="71B13B6D" wp14:editId="7B71102E">
+            <wp:extent cx="2603715" cy="1369828"/>
+            <wp:effectExtent l="0" t="0" r="0" b="1905"/>
+            <wp:docPr id="812542860" name="Picture 1" descr="A diagram of numbers and letters&#10;&#10;AI-generated content may be incorrect."/>
+            <wp:cNvGraphicFramePr>
+              <a:graphicFrameLocks xmlns:a="http://schemas.openxmlformats.org/drawingml/2006/main" noChangeAspect="1"/>
+            </wp:cNvGraphicFramePr>
+            <a:graphic xmlns:a="http://schemas.openxmlformats.org/drawingml/2006/main">
+              <a:graphicData uri="http://schemas.openxmlformats.org/drawingml/2006/picture">
+                <pic:pic xmlns:pic="http://schemas.openxmlformats.org/drawingml/2006/picture">
+                  <pic:nvPicPr>
+                    <pic:cNvPr id="812542860" name="Picture 1" descr="A diagram of numbers and letters&#10;&#10;AI-generated content may be incorrect."/>
+                    <pic:cNvPicPr/>
+                  </pic:nvPicPr>
+                  <pic:blipFill>
+                    <a:blip r:embed="rId17"/>
+                    <a:stretch>
+                      <a:fillRect/>
+                    </a:stretch>
+                  </pic:blipFill>
+                  <pic:spPr>
+                    <a:xfrm>
+                      <a:off x="0" y="0"/>
+                      <a:ext cx="2618468" cy="1377590"/>
+                    </a:xfrm>
+                    <a:prstGeom prst="rect">
+                      <a:avLst/>
+                    </a:prstGeom>
+                  </pic:spPr>
+                </pic:pic>
+              </a:graphicData>
+            </a:graphic>
+          </wp:inline>
+        </w:drawing>
+      </w:r>
+    </w:p>
+    <w:p>
+      <w:pPr>
+        <w:pStyle w:val="p1"/>
+        <w:rPr>
+          <w:i/>
+          <w:iCs/>
+          <w:sz w:val="24"/>
+          <w:szCs w:val="24"/>
+        </w:rPr>
+      </w:pPr>
+      <w:r>
+        <w:rPr>
+          <w:i/>
+          <w:iCs/>
+          <w:sz w:val="24"/>
+          <w:szCs w:val="24"/>
+        </w:rPr>
+        <w:t>Figure 5. A sequence logo visualization of the direct repeat pattern suggested by our</w:t>
+      </w:r>
+      <w:r>
+        <w:rPr>
+          <w:i/>
+          <w:iCs/>
+          <w:sz w:val="24"/>
+          <w:szCs w:val="24"/>
+        </w:rPr>
+        <w:t xml:space="preserve"> plotted</w:t>
+      </w:r>
+      <w:r>
+        <w:rPr>
+          <w:i/>
+          <w:iCs/>
+          <w:sz w:val="24"/>
+          <w:szCs w:val="24"/>
+        </w:rPr>
+        <w:t xml:space="preserve"> metric. </w:t>
+      </w:r>
+    </w:p>
+    <w:p>
+      <w:pPr>
+        <w:pStyle w:val="p1"/>
+        <w:rPr>
+          <w:sz w:val="24"/>
+          <w:szCs w:val="24"/>
+        </w:rPr>
+      </w:pPr>
+    </w:p>
+    <w:p>
+      <w:pPr>
+        <w:pStyle w:val="p1"/>
         <w:rPr>
           <w:sz w:val="24"/>
           <w:szCs w:val="24"/>
@@ -14101,7 +13822,15 @@
           <w:sz w:val="24"/>
           <w:szCs w:val="24"/>
         </w:rPr>
-        <w:t>visually obvious, the sequence logo shows some ambiguity in the G-C probability at the 0</w:t>
+        <w:t xml:space="preserve">visually </w:t>
+      </w:r>
+      <w:r>
+        <w:rPr>
+          <w:sz w:val="24"/>
+          <w:szCs w:val="24"/>
+        </w:rPr>
+        <w:lastRenderedPageBreak/>
+        <w:t>obvious, the sequence logo shows some ambiguity in the G-C probability at the 0</w:t>
       </w:r>
       <w:r>
         <w:rPr>
@@ -14496,15 +14225,7 @@
           <w:sz w:val="24"/>
           <w:szCs w:val="24"/>
         </w:rPr>
-        <w:t xml:space="preserve">, the DRIPPY pipeline can set a range of thresholds based on the PIC of the PWM and </w:t>
-      </w:r>
-      <w:r>
-        <w:rPr>
-          <w:sz w:val="24"/>
-          <w:szCs w:val="24"/>
-        </w:rPr>
-        <w:lastRenderedPageBreak/>
-        <w:t>adaptively iterate through them. Below</w:t>
+        <w:t>, the DRIPPY pipeline can set a range of thresholds based on the PIC of the PWM and adaptively iterate through them. Below</w:t>
       </w:r>
       <w:r>
         <w:rPr>
@@ -14551,7 +14272,7 @@
                     <pic:cNvPicPr/>
                   </pic:nvPicPr>
                   <pic:blipFill>
-                    <a:blip r:embed="rId17"/>
+                    <a:blip r:embed="rId18"/>
                     <a:stretch>
                       <a:fillRect/>
                     </a:stretch>
@@ -14590,338 +14311,17 @@
           <w:sz w:val="24"/>
           <w:szCs w:val="24"/>
         </w:rPr>
-        <w:t>Figure 5. Histogram distribution of the PIC-JSD metrics (lower left triangle of the matrix only, as it is mirrored across the main axis).</w:t>
-      </w:r>
-    </w:p>
-    <w:p>
-      <w:pPr>
-        <w:pStyle w:val="p1"/>
-        <w:rPr>
-          <w:sz w:val="24"/>
-          <w:szCs w:val="24"/>
-        </w:rPr>
-      </w:pPr>
-    </w:p>
-    <w:p>
-      <w:pPr>
-        <w:pStyle w:val="p1"/>
-        <w:rPr>
-          <w:sz w:val="24"/>
-          <w:szCs w:val="24"/>
-        </w:rPr>
-      </w:pPr>
-      <w:r>
-        <w:rPr>
-          <w:sz w:val="24"/>
-          <w:szCs w:val="24"/>
-        </w:rPr>
-        <w:t xml:space="preserve">Here, </w:t>
-      </w:r>
-      <w:r>
-        <w:rPr>
-          <w:sz w:val="24"/>
-          <w:szCs w:val="24"/>
-        </w:rPr>
-        <w:t>a fixed 90</w:t>
-      </w:r>
-      <w:r>
-        <w:rPr>
-          <w:sz w:val="24"/>
-          <w:szCs w:val="24"/>
-          <w:vertAlign w:val="superscript"/>
-        </w:rPr>
-        <w:t>th</w:t>
-      </w:r>
-      <w:r>
-        <w:rPr>
-          <w:sz w:val="24"/>
-          <w:szCs w:val="24"/>
-        </w:rPr>
-        <w:t xml:space="preserve"> percentile was used to determine the cutoff for inclusion in the search for diagonal runs. </w:t>
-      </w:r>
-      <w:r>
-        <w:rPr>
-          <w:sz w:val="24"/>
-          <w:szCs w:val="24"/>
-        </w:rPr>
-        <w:t xml:space="preserve">This means that users set the search threshold based on </w:t>
-      </w:r>
-      <w:r>
-        <w:rPr>
-          <w:sz w:val="24"/>
-          <w:szCs w:val="24"/>
-        </w:rPr>
-        <w:t xml:space="preserve">statistical </w:t>
-      </w:r>
-      <w:r>
-        <w:rPr>
-          <w:sz w:val="24"/>
-          <w:szCs w:val="24"/>
-        </w:rPr>
-        <w:t xml:space="preserve">rigor rather than an arbitrary length. </w:t>
-      </w:r>
-      <w:r>
-        <w:rPr>
-          <w:sz w:val="24"/>
-          <w:szCs w:val="24"/>
-        </w:rPr>
-        <w:t xml:space="preserve">Notably, for the cutoff, we use the PIC, and not the hybrid </w:t>
-      </w:r>
-      <w:r>
-        <w:rPr>
-          <w:sz w:val="24"/>
-          <w:szCs w:val="24"/>
-        </w:rPr>
-        <w:t xml:space="preserve">PIC-JSD </w:t>
-      </w:r>
-      <w:r>
-        <w:rPr>
-          <w:sz w:val="24"/>
-          <w:szCs w:val="24"/>
-        </w:rPr>
-        <w:t>metric, because the purpose of the cutoff is to first ascertain the candidate pool</w:t>
-      </w:r>
-      <w:r>
-        <w:rPr>
-          <w:sz w:val="24"/>
-          <w:szCs w:val="24"/>
-        </w:rPr>
-        <w:t xml:space="preserve"> and </w:t>
-      </w:r>
-      <w:r>
-        <w:rPr>
-          <w:sz w:val="24"/>
-          <w:szCs w:val="24"/>
-        </w:rPr>
-        <w:t>answer</w:t>
-      </w:r>
-      <w:r>
-        <w:rPr>
-          <w:sz w:val="24"/>
-          <w:szCs w:val="24"/>
-        </w:rPr>
-        <w:t xml:space="preserve"> </w:t>
-      </w:r>
-      <w:r>
-        <w:rPr>
-          <w:sz w:val="24"/>
-          <w:szCs w:val="24"/>
-        </w:rPr>
-        <w:t xml:space="preserve">the question of whether an index pair has enough biological signal to matter, after which the diagonal search </w:t>
-      </w:r>
-      <w:r>
-        <w:rPr>
-          <w:sz w:val="24"/>
-          <w:szCs w:val="24"/>
-        </w:rPr>
-        <w:t xml:space="preserve">operates </w:t>
-      </w:r>
-      <w:r>
-        <w:rPr>
-          <w:sz w:val="24"/>
-          <w:szCs w:val="24"/>
-        </w:rPr>
-        <w:t xml:space="preserve">by evaluating </w:t>
-      </w:r>
-      <w:r>
-        <w:rPr>
-          <w:sz w:val="24"/>
-          <w:szCs w:val="24"/>
-        </w:rPr>
-        <w:t>the hybrid penalized metric.</w:t>
-      </w:r>
-      <w:r>
-        <w:rPr>
-          <w:sz w:val="24"/>
-          <w:szCs w:val="24"/>
-        </w:rPr>
-        <w:t xml:space="preserve"> </w:t>
-      </w:r>
-    </w:p>
-    <w:p>
-      <w:pPr>
-        <w:pStyle w:val="p1"/>
-        <w:rPr>
-          <w:sz w:val="24"/>
-          <w:szCs w:val="24"/>
-        </w:rPr>
-      </w:pPr>
-    </w:p>
-    <w:p>
-      <w:pPr>
-        <w:pStyle w:val="p1"/>
-        <w:rPr>
-          <w:sz w:val="24"/>
-          <w:szCs w:val="24"/>
-        </w:rPr>
-      </w:pPr>
-      <w:r>
-        <w:rPr>
-          <w:sz w:val="24"/>
-          <w:szCs w:val="24"/>
-        </w:rPr>
-        <w:t>Users can also set an acceptable range of percentile cutoffs. In this case, the algorithm decrements the percentile until it finds candidates of the default minimum length of two base pairs. In this way, the thresholding process is more adaptive</w:t>
-      </w:r>
-      <w:r>
-        <w:rPr>
-          <w:sz w:val="24"/>
-          <w:szCs w:val="24"/>
-        </w:rPr>
-        <w:t xml:space="preserve">. </w:t>
-      </w:r>
-    </w:p>
-    <w:p>
-      <w:pPr>
-        <w:pStyle w:val="p1"/>
-        <w:rPr>
-          <w:sz w:val="24"/>
-          <w:szCs w:val="24"/>
-        </w:rPr>
-      </w:pPr>
-    </w:p>
-    <w:p>
-      <w:pPr>
-        <w:pStyle w:val="p1"/>
-        <w:rPr>
-          <w:sz w:val="24"/>
-          <w:szCs w:val="24"/>
-        </w:rPr>
-      </w:pPr>
-      <w:r>
-        <w:rPr>
-          <w:sz w:val="24"/>
-          <w:szCs w:val="24"/>
-        </w:rPr>
-        <w:t xml:space="preserve">After a threshold is set, the </w:t>
-      </w:r>
-      <w:r>
-        <w:rPr>
-          <w:sz w:val="24"/>
-          <w:szCs w:val="24"/>
-        </w:rPr>
-        <w:t xml:space="preserve">search functions in a greedy manner, traversing the lower left triangle of the metrics matrix. Once it encounters a value that meets or exceeds the threshold, it </w:t>
-      </w:r>
-      <w:r>
-        <w:rPr>
-          <w:sz w:val="24"/>
-          <w:szCs w:val="24"/>
-        </w:rPr>
-        <w:t>proceeds to the next diagonal value in the matrix to grow a diagonal candidate, ceasing if the next value fails the threshold. This surfaces multiple candidates</w:t>
-      </w:r>
-      <w:r>
-        <w:rPr>
-          <w:sz w:val="24"/>
-          <w:szCs w:val="24"/>
-        </w:rPr>
-        <w:t xml:space="preserve">, each with their own score, which is simply the sum of the metrics of their constituents. </w:t>
-      </w:r>
-      <w:r>
-        <w:rPr>
-          <w:sz w:val="24"/>
-          <w:szCs w:val="24"/>
-        </w:rPr>
-        <w:t xml:space="preserve">In the simple example, the only detected candidate would have a score of </w:t>
-      </w:r>
-      <w:r>
-        <w:rPr>
-          <w:sz w:val="24"/>
-          <w:szCs w:val="24"/>
-          <w:lang w:val="es-ES"/>
-        </w:rPr>
-        <w:t>1.72</w:t>
-      </w:r>
-      <w:r>
-        <w:rPr>
-          <w:sz w:val="24"/>
-          <w:szCs w:val="24"/>
-          <w:lang w:val="es-ES"/>
-        </w:rPr>
-        <w:t xml:space="preserve"> </w:t>
-      </w:r>
-      <w:r>
-        <w:rPr>
-          <w:sz w:val="24"/>
-          <w:szCs w:val="24"/>
-          <w:lang w:val="es-ES"/>
-        </w:rPr>
-        <w:t>+</w:t>
-      </w:r>
-      <w:r>
-        <w:rPr>
-          <w:sz w:val="24"/>
-          <w:szCs w:val="24"/>
-          <w:lang w:val="es-ES"/>
-        </w:rPr>
-        <w:t xml:space="preserve"> </w:t>
-      </w:r>
-      <w:r>
-        <w:rPr>
-          <w:sz w:val="24"/>
-          <w:szCs w:val="24"/>
-          <w:lang w:val="es-ES"/>
-        </w:rPr>
-        <w:t>1.85</w:t>
-      </w:r>
-      <w:r>
-        <w:rPr>
-          <w:sz w:val="24"/>
-          <w:szCs w:val="24"/>
-          <w:lang w:val="es-ES"/>
-        </w:rPr>
-        <w:t xml:space="preserve"> </w:t>
-      </w:r>
-      <w:r>
-        <w:rPr>
-          <w:sz w:val="24"/>
-          <w:szCs w:val="24"/>
-          <w:lang w:val="es-ES"/>
-        </w:rPr>
-        <w:t>+</w:t>
-      </w:r>
-      <w:r>
-        <w:rPr>
-          <w:sz w:val="24"/>
-          <w:szCs w:val="24"/>
-          <w:lang w:val="es-ES"/>
-        </w:rPr>
-        <w:t xml:space="preserve"> </w:t>
-      </w:r>
-      <w:r>
-        <w:rPr>
-          <w:sz w:val="24"/>
-          <w:szCs w:val="24"/>
-          <w:lang w:val="es-ES"/>
-        </w:rPr>
-        <w:t>2.00</w:t>
-      </w:r>
-      <w:r>
-        <w:rPr>
-          <w:sz w:val="24"/>
-          <w:szCs w:val="24"/>
-          <w:lang w:val="es-ES"/>
-        </w:rPr>
-        <w:t xml:space="preserve"> = 5.57.</w:t>
-      </w:r>
-    </w:p>
-    <w:p>
-      <w:pPr>
-        <w:pStyle w:val="p1"/>
-        <w:rPr>
-          <w:sz w:val="24"/>
-          <w:szCs w:val="24"/>
-        </w:rPr>
-      </w:pPr>
-    </w:p>
-    <w:p>
-      <w:pPr>
-        <w:pStyle w:val="p1"/>
+        <w:t xml:space="preserve">Figure </w:t>
+      </w:r>
+      <w:r>
         <w:rPr>
           <w:i/>
           <w:iCs/>
           <w:sz w:val="24"/>
           <w:szCs w:val="24"/>
         </w:rPr>
-      </w:pPr>
+        <w:t>6</w:t>
+      </w:r>
       <w:r>
         <w:rPr>
           <w:i/>
@@ -14929,6 +14329,353 @@
           <w:sz w:val="24"/>
           <w:szCs w:val="24"/>
         </w:rPr>
+        <w:t>. Histogram distribution of the PIC-JSD metrics (lower left triangle of the matrix only, as it is mirrored across the main axis).</w:t>
+      </w:r>
+    </w:p>
+    <w:p>
+      <w:pPr>
+        <w:pStyle w:val="p1"/>
+        <w:rPr>
+          <w:sz w:val="24"/>
+          <w:szCs w:val="24"/>
+        </w:rPr>
+      </w:pPr>
+    </w:p>
+    <w:p>
+      <w:pPr>
+        <w:pStyle w:val="p1"/>
+        <w:rPr>
+          <w:sz w:val="24"/>
+          <w:szCs w:val="24"/>
+        </w:rPr>
+      </w:pPr>
+      <w:r>
+        <w:rPr>
+          <w:sz w:val="24"/>
+          <w:szCs w:val="24"/>
+        </w:rPr>
+        <w:t xml:space="preserve">Here, </w:t>
+      </w:r>
+      <w:r>
+        <w:rPr>
+          <w:sz w:val="24"/>
+          <w:szCs w:val="24"/>
+        </w:rPr>
+        <w:t>a fixed 90</w:t>
+      </w:r>
+      <w:r>
+        <w:rPr>
+          <w:sz w:val="24"/>
+          <w:szCs w:val="24"/>
+          <w:vertAlign w:val="superscript"/>
+        </w:rPr>
+        <w:t>th</w:t>
+      </w:r>
+      <w:r>
+        <w:rPr>
+          <w:sz w:val="24"/>
+          <w:szCs w:val="24"/>
+        </w:rPr>
+        <w:t xml:space="preserve"> percentile was used to determine the cutoff for inclusion in the search for diagonal runs. </w:t>
+      </w:r>
+      <w:r>
+        <w:rPr>
+          <w:sz w:val="24"/>
+          <w:szCs w:val="24"/>
+        </w:rPr>
+        <w:t xml:space="preserve">This means that users set the search threshold based on </w:t>
+      </w:r>
+      <w:r>
+        <w:rPr>
+          <w:sz w:val="24"/>
+          <w:szCs w:val="24"/>
+        </w:rPr>
+        <w:t xml:space="preserve">statistical </w:t>
+      </w:r>
+      <w:r>
+        <w:rPr>
+          <w:sz w:val="24"/>
+          <w:szCs w:val="24"/>
+        </w:rPr>
+        <w:t xml:space="preserve">rigor rather than an arbitrary length. </w:t>
+      </w:r>
+      <w:r>
+        <w:rPr>
+          <w:sz w:val="24"/>
+          <w:szCs w:val="24"/>
+        </w:rPr>
+        <w:t xml:space="preserve">Notably, for the cutoff, we use the PIC, and not the hybrid </w:t>
+      </w:r>
+      <w:r>
+        <w:rPr>
+          <w:sz w:val="24"/>
+          <w:szCs w:val="24"/>
+        </w:rPr>
+        <w:t xml:space="preserve">PIC-JSD </w:t>
+      </w:r>
+      <w:r>
+        <w:rPr>
+          <w:sz w:val="24"/>
+          <w:szCs w:val="24"/>
+        </w:rPr>
+        <w:t>metric, because the purpose of the cutoff is to first ascertain the candidate pool</w:t>
+      </w:r>
+      <w:r>
+        <w:rPr>
+          <w:sz w:val="24"/>
+          <w:szCs w:val="24"/>
+        </w:rPr>
+        <w:t xml:space="preserve"> and </w:t>
+      </w:r>
+      <w:r>
+        <w:rPr>
+          <w:sz w:val="24"/>
+          <w:szCs w:val="24"/>
+        </w:rPr>
+        <w:t>answer</w:t>
+      </w:r>
+      <w:r>
+        <w:rPr>
+          <w:sz w:val="24"/>
+          <w:szCs w:val="24"/>
+        </w:rPr>
+        <w:t xml:space="preserve"> </w:t>
+      </w:r>
+      <w:r>
+        <w:rPr>
+          <w:sz w:val="24"/>
+          <w:szCs w:val="24"/>
+        </w:rPr>
+        <w:t xml:space="preserve">the question of whether an index pair has enough biological signal to matter, after which the diagonal search </w:t>
+      </w:r>
+      <w:r>
+        <w:rPr>
+          <w:sz w:val="24"/>
+          <w:szCs w:val="24"/>
+        </w:rPr>
+        <w:t xml:space="preserve">operates </w:t>
+      </w:r>
+      <w:r>
+        <w:rPr>
+          <w:sz w:val="24"/>
+          <w:szCs w:val="24"/>
+        </w:rPr>
+        <w:t xml:space="preserve">by evaluating </w:t>
+      </w:r>
+      <w:r>
+        <w:rPr>
+          <w:sz w:val="24"/>
+          <w:szCs w:val="24"/>
+        </w:rPr>
+        <w:t>the hybrid penalized metric.</w:t>
+      </w:r>
+      <w:r>
+        <w:rPr>
+          <w:sz w:val="24"/>
+          <w:szCs w:val="24"/>
+        </w:rPr>
+        <w:t xml:space="preserve"> </w:t>
+      </w:r>
+    </w:p>
+    <w:p>
+      <w:pPr>
+        <w:pStyle w:val="p1"/>
+        <w:rPr>
+          <w:sz w:val="24"/>
+          <w:szCs w:val="24"/>
+        </w:rPr>
+      </w:pPr>
+    </w:p>
+    <w:p>
+      <w:pPr>
+        <w:pStyle w:val="p1"/>
+        <w:rPr>
+          <w:sz w:val="24"/>
+          <w:szCs w:val="24"/>
+        </w:rPr>
+      </w:pPr>
+      <w:r>
+        <w:rPr>
+          <w:sz w:val="24"/>
+          <w:szCs w:val="24"/>
+        </w:rPr>
+        <w:t>Users can also set an acceptable range of percentile cutoffs. In this case, the algorithm decrements the percentile until it finds candidates of the default minimum length of two base pairs. In this way, the thresholding process is more adaptive</w:t>
+      </w:r>
+      <w:r>
+        <w:rPr>
+          <w:sz w:val="24"/>
+          <w:szCs w:val="24"/>
+        </w:rPr>
+        <w:t xml:space="preserve">. </w:t>
+      </w:r>
+    </w:p>
+    <w:p>
+      <w:pPr>
+        <w:pStyle w:val="p1"/>
+        <w:rPr>
+          <w:sz w:val="24"/>
+          <w:szCs w:val="24"/>
+        </w:rPr>
+      </w:pPr>
+    </w:p>
+    <w:p>
+      <w:pPr>
+        <w:pStyle w:val="p1"/>
+        <w:rPr>
+          <w:sz w:val="24"/>
+          <w:szCs w:val="24"/>
+        </w:rPr>
+      </w:pPr>
+      <w:r>
+        <w:rPr>
+          <w:sz w:val="24"/>
+          <w:szCs w:val="24"/>
+        </w:rPr>
+        <w:t xml:space="preserve">After a threshold is set, the </w:t>
+      </w:r>
+      <w:r>
+        <w:rPr>
+          <w:sz w:val="24"/>
+          <w:szCs w:val="24"/>
+        </w:rPr>
+        <w:t xml:space="preserve">search functions in a greedy manner, traversing the lower left triangle of the metrics matrix. Once it encounters a value that meets or exceeds the threshold, it </w:t>
+      </w:r>
+      <w:r>
+        <w:rPr>
+          <w:sz w:val="24"/>
+          <w:szCs w:val="24"/>
+        </w:rPr>
+        <w:t>proceeds to the next diagonal value in the matrix to grow a diagonal candidate, ceasing if the next value fails the threshold. This surfaces multiple candidates</w:t>
+      </w:r>
+      <w:r>
+        <w:rPr>
+          <w:sz w:val="24"/>
+          <w:szCs w:val="24"/>
+        </w:rPr>
+        <w:t xml:space="preserve">, each with their own score, which is simply the sum of the metrics of their </w:t>
+      </w:r>
+      <w:r>
+        <w:rPr>
+          <w:sz w:val="24"/>
+          <w:szCs w:val="24"/>
+        </w:rPr>
+        <w:lastRenderedPageBreak/>
+        <w:t xml:space="preserve">constituents. </w:t>
+      </w:r>
+      <w:r>
+        <w:rPr>
+          <w:sz w:val="24"/>
+          <w:szCs w:val="24"/>
+        </w:rPr>
+        <w:t xml:space="preserve">In the simple example, the only detected candidate would have a score of </w:t>
+      </w:r>
+      <w:r>
+        <w:rPr>
+          <w:sz w:val="24"/>
+          <w:szCs w:val="24"/>
+          <w:lang w:val="es-ES"/>
+        </w:rPr>
+        <w:t>1.72</w:t>
+      </w:r>
+      <w:r>
+        <w:rPr>
+          <w:sz w:val="24"/>
+          <w:szCs w:val="24"/>
+          <w:lang w:val="es-ES"/>
+        </w:rPr>
+        <w:t xml:space="preserve"> </w:t>
+      </w:r>
+      <w:r>
+        <w:rPr>
+          <w:sz w:val="24"/>
+          <w:szCs w:val="24"/>
+          <w:lang w:val="es-ES"/>
+        </w:rPr>
+        <w:t>+</w:t>
+      </w:r>
+      <w:r>
+        <w:rPr>
+          <w:sz w:val="24"/>
+          <w:szCs w:val="24"/>
+          <w:lang w:val="es-ES"/>
+        </w:rPr>
+        <w:t xml:space="preserve"> </w:t>
+      </w:r>
+      <w:r>
+        <w:rPr>
+          <w:sz w:val="24"/>
+          <w:szCs w:val="24"/>
+          <w:lang w:val="es-ES"/>
+        </w:rPr>
+        <w:t>1.85</w:t>
+      </w:r>
+      <w:r>
+        <w:rPr>
+          <w:sz w:val="24"/>
+          <w:szCs w:val="24"/>
+          <w:lang w:val="es-ES"/>
+        </w:rPr>
+        <w:t xml:space="preserve"> </w:t>
+      </w:r>
+      <w:r>
+        <w:rPr>
+          <w:sz w:val="24"/>
+          <w:szCs w:val="24"/>
+          <w:lang w:val="es-ES"/>
+        </w:rPr>
+        <w:t>+</w:t>
+      </w:r>
+      <w:r>
+        <w:rPr>
+          <w:sz w:val="24"/>
+          <w:szCs w:val="24"/>
+          <w:lang w:val="es-ES"/>
+        </w:rPr>
+        <w:t xml:space="preserve"> </w:t>
+      </w:r>
+      <w:r>
+        <w:rPr>
+          <w:sz w:val="24"/>
+          <w:szCs w:val="24"/>
+          <w:lang w:val="es-ES"/>
+        </w:rPr>
+        <w:t>2.00</w:t>
+      </w:r>
+      <w:r>
+        <w:rPr>
+          <w:sz w:val="24"/>
+          <w:szCs w:val="24"/>
+          <w:lang w:val="es-ES"/>
+        </w:rPr>
+        <w:t xml:space="preserve"> = 5.57.</w:t>
+      </w:r>
+    </w:p>
+    <w:p>
+      <w:pPr>
+        <w:pStyle w:val="p1"/>
+        <w:rPr>
+          <w:sz w:val="24"/>
+          <w:szCs w:val="24"/>
+        </w:rPr>
+      </w:pPr>
+    </w:p>
+    <w:p>
+      <w:pPr>
+        <w:pStyle w:val="p1"/>
+        <w:rPr>
+          <w:i/>
+          <w:iCs/>
+          <w:sz w:val="24"/>
+          <w:szCs w:val="24"/>
+        </w:rPr>
+      </w:pPr>
+      <w:r>
+        <w:rPr>
+          <w:i/>
+          <w:iCs/>
+          <w:sz w:val="24"/>
+          <w:szCs w:val="24"/>
+        </w:rPr>
         <w:t>Bootstrap Significance Testing</w:t>
       </w:r>
     </w:p>
@@ -15012,107 +14759,43 @@
         </w:rPr>
         <w:t xml:space="preserve"> in order </w:t>
       </w:r>
-      <w:proofErr w:type="spellStart"/>
       <w:r>
         <w:rPr>
           <w:sz w:val="24"/>
           <w:szCs w:val="24"/>
           <w:lang w:val="es-ES"/>
         </w:rPr>
-        <w:t>destroy</w:t>
-      </w:r>
-      <w:proofErr w:type="spellEnd"/>
+        <w:t xml:space="preserve">destroy </w:t>
+      </w:r>
       <w:r>
         <w:rPr>
           <w:sz w:val="24"/>
           <w:szCs w:val="24"/>
           <w:lang w:val="es-ES"/>
         </w:rPr>
+        <w:t xml:space="preserve">existing </w:t>
+      </w:r>
+      <w:r>
+        <w:rPr>
+          <w:sz w:val="24"/>
+          <w:szCs w:val="24"/>
+          <w:lang w:val="es-ES"/>
+        </w:rPr>
+        <w:t>index-wise relationships.</w:t>
+      </w:r>
+      <w:r>
+        <w:rPr>
+          <w:sz w:val="24"/>
+          <w:szCs w:val="24"/>
+        </w:rPr>
         <w:t xml:space="preserve"> </w:t>
       </w:r>
-      <w:proofErr w:type="spellStart"/>
-      <w:r>
-        <w:rPr>
-          <w:sz w:val="24"/>
-          <w:szCs w:val="24"/>
-          <w:lang w:val="es-ES"/>
-        </w:rPr>
-        <w:t>existing</w:t>
-      </w:r>
-      <w:proofErr w:type="spellEnd"/>
-      <w:r>
-        <w:rPr>
-          <w:sz w:val="24"/>
-          <w:szCs w:val="24"/>
-          <w:lang w:val="es-ES"/>
-        </w:rPr>
-        <w:t xml:space="preserve"> </w:t>
-      </w:r>
-      <w:proofErr w:type="spellStart"/>
-      <w:r>
-        <w:rPr>
-          <w:sz w:val="24"/>
-          <w:szCs w:val="24"/>
-          <w:lang w:val="es-ES"/>
-        </w:rPr>
-        <w:t>index-wise</w:t>
-      </w:r>
-      <w:proofErr w:type="spellEnd"/>
-      <w:r>
-        <w:rPr>
-          <w:sz w:val="24"/>
-          <w:szCs w:val="24"/>
-          <w:lang w:val="es-ES"/>
-        </w:rPr>
-        <w:t xml:space="preserve"> </w:t>
-      </w:r>
-      <w:proofErr w:type="spellStart"/>
-      <w:r>
-        <w:rPr>
-          <w:sz w:val="24"/>
-          <w:szCs w:val="24"/>
-          <w:lang w:val="es-ES"/>
-        </w:rPr>
-        <w:t>relationships</w:t>
-      </w:r>
-      <w:proofErr w:type="spellEnd"/>
-      <w:r>
-        <w:rPr>
-          <w:sz w:val="24"/>
-          <w:szCs w:val="24"/>
-          <w:lang w:val="es-ES"/>
-        </w:rPr>
-        <w:t>.</w:t>
-      </w:r>
-      <w:r>
-        <w:rPr>
-          <w:sz w:val="24"/>
-          <w:szCs w:val="24"/>
-        </w:rPr>
-        <w:t xml:space="preserve"> </w:t>
-      </w:r>
-      <w:r>
-        <w:rPr>
-          <w:sz w:val="24"/>
-          <w:szCs w:val="24"/>
-        </w:rPr>
-        <w:t xml:space="preserve">For each iteration of the bootstrap, the same </w:t>
-      </w:r>
-      <w:proofErr w:type="spellStart"/>
-      <w:r>
-        <w:rPr>
-          <w:sz w:val="24"/>
-          <w:szCs w:val="24"/>
-        </w:rPr>
-        <w:t>threshold</w:t>
-      </w:r>
-      <w:proofErr w:type="spellEnd"/>
-      <w:r>
-        <w:rPr>
-          <w:sz w:val="24"/>
-          <w:szCs w:val="24"/>
-        </w:rPr>
-        <w:t xml:space="preserve"> and diagonal detection process is applied</w:t>
+      <w:r>
+        <w:rPr>
+          <w:sz w:val="24"/>
+          <w:szCs w:val="24"/>
+        </w:rPr>
+        <w:t>For each iteration of the bootstrap, the same threshold and diagonal detection process is applied</w:t>
       </w:r>
       <w:r>
         <w:rPr>
@@ -15151,7 +14834,6 @@
           <w:sz w:val="24"/>
           <w:szCs w:val="24"/>
         </w:rPr>
-        <w:lastRenderedPageBreak/>
         <w:t>The logic behind this process is to construct a space in which any positional relationships within the PWM are effectively random. This sets a baseline for whether our results offer signal beyond random background noise. T</w:t>
       </w:r>
       <w:r>
@@ -15304,7 +14986,7 @@
                     <pic:cNvPicPr/>
                   </pic:nvPicPr>
                   <pic:blipFill>
-                    <a:blip r:embed="rId18"/>
+                    <a:blip r:embed="rId19"/>
                     <a:stretch>
                       <a:fillRect/>
                     </a:stretch>
@@ -15342,7 +15024,7 @@
           <w:sz w:val="24"/>
           <w:szCs w:val="24"/>
         </w:rPr>
-        <w:t xml:space="preserve">Figure 6. Bootstrap distribution of </w:t>
+        <w:t xml:space="preserve">Figure </w:t>
       </w:r>
       <w:r>
         <w:rPr>
@@ -15351,24 +15033,42 @@
           <w:sz w:val="24"/>
           <w:szCs w:val="24"/>
         </w:rPr>
-        <w:t xml:space="preserve">the PIC-JSD shuffled space. </w:t>
-      </w:r>
-    </w:p>
-    <w:p>
-      <w:pPr>
-        <w:pStyle w:val="p1"/>
+        <w:t>7</w:t>
+      </w:r>
+      <w:r>
         <w:rPr>
           <w:i/>
           <w:iCs/>
           <w:sz w:val="24"/>
           <w:szCs w:val="24"/>
         </w:rPr>
-      </w:pPr>
+        <w:t xml:space="preserve">. Bootstrap distribution of </w:t>
+      </w:r>
+      <w:r>
+        <w:rPr>
+          <w:i/>
+          <w:iCs/>
+          <w:sz w:val="24"/>
+          <w:szCs w:val="24"/>
+        </w:rPr>
+        <w:t xml:space="preserve">the PIC-JSD shuffled space. </w:t>
+      </w:r>
     </w:p>
     <w:p>
       <w:pPr>
         <w:pStyle w:val="p1"/>
         <w:rPr>
+          <w:i/>
+          <w:iCs/>
+          <w:sz w:val="24"/>
+          <w:szCs w:val="24"/>
+        </w:rPr>
+      </w:pPr>
+    </w:p>
+    <w:p>
+      <w:pPr>
+        <w:pStyle w:val="p1"/>
+        <w:rPr>
           <w:sz w:val="24"/>
           <w:szCs w:val="24"/>
         </w:rPr>
@@ -15408,6 +15108,7 @@
         <w:rPr>
           <w:noProof/>
         </w:rPr>
+        <w:lastRenderedPageBreak/>
         <w:drawing>
           <wp:inline distT="0" distB="0" distL="0" distR="0" wp14:anchorId="46AABE6D" wp14:editId="7B3595FD">
             <wp:extent cx="2268782" cy="2068257"/>
@@ -15424,7 +15125,7 @@
                     <pic:cNvPicPr/>
                   </pic:nvPicPr>
                   <pic:blipFill>
-                    <a:blip r:embed="rId19"/>
+                    <a:blip r:embed="rId20"/>
                     <a:stretch>
                       <a:fillRect/>
                     </a:stretch>
@@ -15470,7 +15171,7 @@
                     <pic:cNvPicPr/>
                   </pic:nvPicPr>
                   <pic:blipFill>
-                    <a:blip r:embed="rId20"/>
+                    <a:blip r:embed="rId21"/>
                     <a:stretch>
                       <a:fillRect/>
                     </a:stretch>
@@ -15502,7 +15203,19 @@
         <w:rPr>
           <w:noProof/>
         </w:rPr>
-        <w:t xml:space="preserve">Figure 7: An inverse or palindromic search executed on the same simple example. </w:t>
+        <w:t xml:space="preserve">Figure </w:t>
+      </w:r>
+      <w:r>
+        <w:rPr>
+          <w:noProof/>
+        </w:rPr>
+        <w:t>8</w:t>
+      </w:r>
+      <w:r>
+        <w:rPr>
+          <w:noProof/>
+        </w:rPr>
+        <w:t xml:space="preserve">: An inverse or palindromic search executed on the same simple example. </w:t>
       </w:r>
     </w:p>
     <w:p>
@@ -15527,7 +15240,7 @@
           <w:sz w:val="24"/>
           <w:szCs w:val="24"/>
         </w:rPr>
-        <w:t xml:space="preserve">Note that the inverted repeat diagonals run from bottom-left to top-right, but the axis of symmetry remains the same. </w:t>
+        <w:t xml:space="preserve">Note that </w:t>
       </w:r>
       <w:r>
         <w:rPr>
@@ -15535,6 +15248,22 @@
           <w:sz w:val="24"/>
           <w:szCs w:val="24"/>
         </w:rPr>
+        <w:t xml:space="preserve">in contrast to the direct repeat matrix, </w:t>
+      </w:r>
+      <w:r>
+        <w:rPr>
+          <w:noProof/>
+          <w:sz w:val="24"/>
+          <w:szCs w:val="24"/>
+        </w:rPr>
+        <w:t xml:space="preserve">the inverted repeat diagonals run from bottom-left to top-right, but the axis of symmetry remains the same. </w:t>
+      </w:r>
+      <w:r>
+        <w:rPr>
+          <w:noProof/>
+          <w:sz w:val="24"/>
+          <w:szCs w:val="24"/>
+        </w:rPr>
         <w:t xml:space="preserve">Here, we only see potential </w:t>
       </w:r>
       <w:r>
@@ -15599,7 +15328,39 @@
           <w:sz w:val="24"/>
           <w:szCs w:val="24"/>
         </w:rPr>
-        <w:t>which is CA-TG. While by definition CA-TG is a palindrome, it is not significant as we see in the above bootstrap</w:t>
+        <w:t xml:space="preserve">which is CA-TG. While by definition CA-TG is a palindrome, it is not </w:t>
+      </w:r>
+      <w:r>
+        <w:rPr>
+          <w:noProof/>
+          <w:sz w:val="24"/>
+          <w:szCs w:val="24"/>
+        </w:rPr>
+        <w:t xml:space="preserve">particularly </w:t>
+      </w:r>
+      <w:r>
+        <w:rPr>
+          <w:noProof/>
+          <w:sz w:val="24"/>
+          <w:szCs w:val="24"/>
+        </w:rPr>
+        <w:t>significant</w:t>
+      </w:r>
+      <w:r>
+        <w:rPr>
+          <w:noProof/>
+          <w:sz w:val="24"/>
+          <w:szCs w:val="24"/>
+        </w:rPr>
+        <w:t xml:space="preserve">, </w:t>
+      </w:r>
+      <w:r>
+        <w:rPr>
+          <w:noProof/>
+          <w:sz w:val="24"/>
+          <w:szCs w:val="24"/>
+        </w:rPr>
+        <w:t>as we see in the above bootstrap</w:t>
       </w:r>
       <w:r>
         <w:rPr>
@@ -15646,6 +15407,15 @@
         </w:rPr>
         <w:t xml:space="preserve">Evaluation </w:t>
       </w:r>
+      <w:r>
+        <w:rPr>
+          <w:i/>
+          <w:iCs/>
+          <w:sz w:val="24"/>
+          <w:szCs w:val="24"/>
+        </w:rPr>
+        <w:t>of Results</w:t>
+      </w:r>
     </w:p>
     <w:p>
       <w:pPr>
@@ -15669,7 +15439,98 @@
           <w:sz w:val="24"/>
           <w:szCs w:val="24"/>
         </w:rPr>
-        <w:t xml:space="preserve">The DRIPPY analysis was run on both the CollecTF and MEME datasets, checking for direct and inverted repeat patterns for each combination of species and TF UniProtID. </w:t>
+        <w:t>The DRIPPY analysis was run on both the CollecTF and MEME datasets</w:t>
+      </w:r>
+      <w:r>
+        <w:rPr>
+          <w:sz w:val="24"/>
+          <w:szCs w:val="24"/>
+        </w:rPr>
+        <w:t>,</w:t>
+      </w:r>
+      <w:r>
+        <w:rPr>
+          <w:sz w:val="24"/>
+          <w:szCs w:val="24"/>
+        </w:rPr>
+        <w:t xml:space="preserve"> checking for direct and inverted repeat patterns for each </w:t>
+      </w:r>
+      <w:r>
+        <w:rPr>
+          <w:sz w:val="24"/>
+          <w:szCs w:val="24"/>
+        </w:rPr>
+        <w:t xml:space="preserve">observation at </w:t>
+      </w:r>
+      <w:r>
+        <w:rPr>
+          <w:sz w:val="24"/>
+          <w:szCs w:val="24"/>
+        </w:rPr>
+        <w:t>multiple fixed percentile thresholds from 0 to 90 percent</w:t>
+      </w:r>
+      <w:r>
+        <w:rPr>
+          <w:sz w:val="24"/>
+          <w:szCs w:val="24"/>
+        </w:rPr>
+        <w:t xml:space="preserve">, </w:t>
+      </w:r>
+      <w:r>
+        <w:rPr>
+          <w:sz w:val="24"/>
+          <w:szCs w:val="24"/>
+        </w:rPr>
+        <w:t xml:space="preserve">with </w:t>
+      </w:r>
+      <w:r>
+        <w:rPr>
+          <w:sz w:val="24"/>
+          <w:szCs w:val="24"/>
+        </w:rPr>
+        <w:t xml:space="preserve">a </w:t>
+      </w:r>
+      <w:r>
+        <w:rPr>
+          <w:sz w:val="24"/>
+          <w:szCs w:val="24"/>
+        </w:rPr>
+        <w:t xml:space="preserve">minimum </w:t>
+      </w:r>
+      <w:r>
+        <w:rPr>
+          <w:sz w:val="24"/>
+          <w:szCs w:val="24"/>
+        </w:rPr>
+        <w:t xml:space="preserve">motif search </w:t>
+      </w:r>
+      <w:r>
+        <w:rPr>
+          <w:sz w:val="24"/>
+          <w:szCs w:val="24"/>
+        </w:rPr>
+        <w:t xml:space="preserve">length </w:t>
+      </w:r>
+      <w:r>
+        <w:rPr>
+          <w:sz w:val="24"/>
+          <w:szCs w:val="24"/>
+        </w:rPr>
+        <w:t xml:space="preserve">of </w:t>
+      </w:r>
+      <w:r>
+        <w:rPr>
+          <w:sz w:val="24"/>
+          <w:szCs w:val="24"/>
+        </w:rPr>
+        <w:t xml:space="preserve">2 </w:t>
+      </w:r>
+      <w:r>
+        <w:rPr>
+          <w:sz w:val="24"/>
+          <w:szCs w:val="24"/>
+        </w:rPr>
+        <w:t>positions.</w:t>
       </w:r>
     </w:p>
     <w:p>
@@ -15680,22 +15541,6 @@
           <w:szCs w:val="24"/>
         </w:rPr>
       </w:pPr>
-    </w:p>
-    <w:p>
-      <w:pPr>
-        <w:pStyle w:val="p1"/>
-        <w:rPr>
-          <w:sz w:val="24"/>
-          <w:szCs w:val="24"/>
-        </w:rPr>
-      </w:pPr>
-      <w:r>
-        <w:rPr>
-          <w:sz w:val="24"/>
-          <w:szCs w:val="24"/>
-        </w:rPr>
-        <w:t xml:space="preserve">We test at multiple fixed percentile thresholds from 0 to 90 percent with minimum length 2 to cast a wide net and understand the impact of manipulating the threshold. </w:t>
-      </w:r>
     </w:p>
     <w:p>
       <w:pPr>
@@ -17297,6 +17142,9 @@
       </w:r>
       <w:r>
         <w:t xml:space="preserve"> </w:t>
+      </w:r>
+      <w:r>
+        <w:t>https://pmc.ncbi.nlm.nih.gov/articles/PMC332411/</w:t>
       </w:r>
     </w:p>
   </w:footnote>

</xml_diff>

<commit_message>
new updates to MAYMOTIF workflow, ROC PR curves for system and in conjunction - cleaning up folders
</commit_message>
<xml_diff>
--- a/TFM Writing/RICSE_Enoch Shin_template.docx
+++ b/TFM Writing/RICSE_Enoch Shin_template.docx
@@ -362,13 +362,10 @@
           <w:szCs w:val="32"/>
           <w:lang w:val="en-US"/>
         </w:rPr>
-        <w:t>Dr. Ivan Erill Sagales</w:t>
-      </w:r>
-    </w:p>
-    <w:p>
-      <w:pPr>
-        <w:spacing w:after="0" w:line="240" w:lineRule="auto"/>
-        <w:jc w:val="center"/>
+        <w:t xml:space="preserve">Dr. Ivan </w:t>
+      </w:r>
+      <w:proofErr w:type="spellStart"/>
+      <w:r>
         <w:rPr>
           <w:rFonts w:cstheme="minorHAnsi"/>
           <w:b/>
@@ -377,7 +374,9 @@
           <w:szCs w:val="32"/>
           <w:lang w:val="en-US"/>
         </w:rPr>
-      </w:pPr>
+        <w:t>Erill</w:t>
+      </w:r>
+      <w:proofErr w:type="spellEnd"/>
       <w:r>
         <w:rPr>
           <w:rFonts w:cstheme="minorHAnsi"/>
@@ -387,12 +386,10 @@
           <w:szCs w:val="32"/>
           <w:lang w:val="en-US"/>
         </w:rPr>
-        <w:t>Department of Information and Communications Engineering</w:t>
-      </w:r>
-    </w:p>
-    <w:p>
-      <w:pPr>
-        <w:jc w:val="center"/>
+        <w:t xml:space="preserve"> </w:t>
+      </w:r>
+      <w:proofErr w:type="spellStart"/>
+      <w:r>
         <w:rPr>
           <w:rFonts w:cstheme="minorHAnsi"/>
           <w:b/>
@@ -401,10 +398,13 @@
           <w:szCs w:val="32"/>
           <w:lang w:val="en-US"/>
         </w:rPr>
-      </w:pPr>
-    </w:p>
-    <w:p>
-      <w:pPr>
+        <w:t>Sagales</w:t>
+      </w:r>
+      <w:proofErr w:type="spellEnd"/>
+    </w:p>
+    <w:p>
+      <w:pPr>
+        <w:spacing w:after="0" w:line="240" w:lineRule="auto"/>
         <w:jc w:val="center"/>
         <w:rPr>
           <w:rFonts w:cstheme="minorHAnsi"/>
@@ -415,6 +415,43 @@
           <w:lang w:val="en-US"/>
         </w:rPr>
       </w:pPr>
+      <w:r>
+        <w:rPr>
+          <w:rFonts w:cstheme="minorHAnsi"/>
+          <w:b/>
+          <w:bCs/>
+          <w:sz w:val="32"/>
+          <w:szCs w:val="32"/>
+          <w:lang w:val="en-US"/>
+        </w:rPr>
+        <w:t>Department of Information and Communications Engineering</w:t>
+      </w:r>
+    </w:p>
+    <w:p>
+      <w:pPr>
+        <w:jc w:val="center"/>
+        <w:rPr>
+          <w:rFonts w:cstheme="minorHAnsi"/>
+          <w:b/>
+          <w:bCs/>
+          <w:sz w:val="32"/>
+          <w:szCs w:val="32"/>
+          <w:lang w:val="en-US"/>
+        </w:rPr>
+      </w:pPr>
+    </w:p>
+    <w:p>
+      <w:pPr>
+        <w:jc w:val="center"/>
+        <w:rPr>
+          <w:rFonts w:cstheme="minorHAnsi"/>
+          <w:b/>
+          <w:bCs/>
+          <w:sz w:val="32"/>
+          <w:szCs w:val="32"/>
+          <w:lang w:val="en-US"/>
+        </w:rPr>
+      </w:pPr>
     </w:p>
     <w:p>
       <w:pPr>
@@ -439,6 +476,7 @@
           <w:lang w:val="en-US"/>
         </w:rPr>
       </w:pPr>
+      <w:proofErr w:type="spellStart"/>
       <w:r>
         <w:rPr>
           <w:rFonts w:cstheme="minorHAnsi"/>
@@ -446,8 +484,9 @@
           <w:szCs w:val="28"/>
           <w:lang w:val="en-US"/>
         </w:rPr>
-        <w:t>Cerdanyola del Vall</w:t>
-      </w:r>
+        <w:t>Cerdanyola</w:t>
+      </w:r>
+      <w:proofErr w:type="spellEnd"/>
       <w:r>
         <w:rPr>
           <w:rFonts w:cstheme="minorHAnsi"/>
@@ -455,8 +494,9 @@
           <w:szCs w:val="28"/>
           <w:lang w:val="en-US"/>
         </w:rPr>
-        <w:t>è</w:t>
-      </w:r>
+        <w:t xml:space="preserve"> del </w:t>
+      </w:r>
+      <w:proofErr w:type="spellStart"/>
       <w:r>
         <w:rPr>
           <w:rFonts w:cstheme="minorHAnsi"/>
@@ -464,7 +504,35 @@
           <w:szCs w:val="28"/>
           <w:lang w:val="en-US"/>
         </w:rPr>
-        <w:t xml:space="preserve">s, </w:t>
+        <w:t>Vall</w:t>
+      </w:r>
+      <w:r>
+        <w:rPr>
+          <w:rFonts w:cstheme="minorHAnsi"/>
+          <w:sz w:val="28"/>
+          <w:szCs w:val="28"/>
+          <w:lang w:val="en-US"/>
+        </w:rPr>
+        <w:t>è</w:t>
+      </w:r>
+      <w:r>
+        <w:rPr>
+          <w:rFonts w:cstheme="minorHAnsi"/>
+          <w:sz w:val="28"/>
+          <w:szCs w:val="28"/>
+          <w:lang w:val="en-US"/>
+        </w:rPr>
+        <w:t>s</w:t>
+      </w:r>
+      <w:proofErr w:type="spellEnd"/>
+      <w:r>
+        <w:rPr>
+          <w:rFonts w:cstheme="minorHAnsi"/>
+          <w:sz w:val="28"/>
+          <w:szCs w:val="28"/>
+          <w:lang w:val="en-US"/>
+        </w:rPr>
+        <w:t xml:space="preserve">, </w:t>
       </w:r>
       <w:r>
         <w:rPr>
@@ -623,8 +691,33 @@
           <w:sz w:val="24"/>
           <w:szCs w:val="24"/>
         </w:rPr>
-        <w:t>Ivan Erill Sagales</w:t>
-      </w:r>
+        <w:t xml:space="preserve">Ivan </w:t>
+      </w:r>
+      <w:proofErr w:type="spellStart"/>
+      <w:r>
+        <w:rPr>
+          <w:sz w:val="24"/>
+          <w:szCs w:val="24"/>
+        </w:rPr>
+        <w:t>Erill</w:t>
+      </w:r>
+      <w:proofErr w:type="spellEnd"/>
+      <w:r>
+        <w:rPr>
+          <w:sz w:val="24"/>
+          <w:szCs w:val="24"/>
+        </w:rPr>
+        <w:t xml:space="preserve"> </w:t>
+      </w:r>
+      <w:proofErr w:type="spellStart"/>
+      <w:r>
+        <w:rPr>
+          <w:sz w:val="24"/>
+          <w:szCs w:val="24"/>
+        </w:rPr>
+        <w:t>Sagales</w:t>
+      </w:r>
+      <w:proofErr w:type="spellEnd"/>
       <w:r>
         <w:rPr>
           <w:sz w:val="24"/>
@@ -672,7 +765,23 @@
           <w:sz w:val="24"/>
           <w:szCs w:val="24"/>
         </w:rPr>
-        <w:t xml:space="preserve">a history and statistics background, Dr. Erill tailored the project to </w:t>
+        <w:t xml:space="preserve">a history and statistics background, Dr. </w:t>
+      </w:r>
+      <w:proofErr w:type="spellStart"/>
+      <w:r>
+        <w:rPr>
+          <w:sz w:val="24"/>
+          <w:szCs w:val="24"/>
+        </w:rPr>
+        <w:t>Erill</w:t>
+      </w:r>
+      <w:proofErr w:type="spellEnd"/>
+      <w:r>
+        <w:rPr>
+          <w:sz w:val="24"/>
+          <w:szCs w:val="24"/>
+        </w:rPr>
+        <w:t xml:space="preserve"> tailored the project to </w:t>
       </w:r>
       <w:r>
         <w:rPr>
@@ -714,7 +823,23 @@
           <w:sz w:val="24"/>
           <w:szCs w:val="24"/>
         </w:rPr>
-        <w:t xml:space="preserve">. Moreover, Dr. Erill worked tirelessly to support me in </w:t>
+        <w:t xml:space="preserve">. Moreover, Dr. </w:t>
+      </w:r>
+      <w:proofErr w:type="spellStart"/>
+      <w:r>
+        <w:rPr>
+          <w:sz w:val="24"/>
+          <w:szCs w:val="24"/>
+        </w:rPr>
+        <w:t>Erill</w:t>
+      </w:r>
+      <w:proofErr w:type="spellEnd"/>
+      <w:r>
+        <w:rPr>
+          <w:sz w:val="24"/>
+          <w:szCs w:val="24"/>
+        </w:rPr>
+        <w:t xml:space="preserve"> worked tirelessly to support me in </w:t>
       </w:r>
       <w:r>
         <w:rPr>
@@ -742,7 +867,39 @@
           <w:sz w:val="24"/>
           <w:szCs w:val="24"/>
         </w:rPr>
-        <w:t>scholarship funding for my studies here at the Universitat Autònoma de Barcelona, without which my time here would have been substantially more stressful and challenging. I am grateful to have had the opportunity to work with him</w:t>
+        <w:t xml:space="preserve">scholarship funding for my studies here at the </w:t>
+      </w:r>
+      <w:proofErr w:type="spellStart"/>
+      <w:r>
+        <w:rPr>
+          <w:sz w:val="24"/>
+          <w:szCs w:val="24"/>
+        </w:rPr>
+        <w:t>Universitat</w:t>
+      </w:r>
+      <w:proofErr w:type="spellEnd"/>
+      <w:r>
+        <w:rPr>
+          <w:sz w:val="24"/>
+          <w:szCs w:val="24"/>
+        </w:rPr>
+        <w:t xml:space="preserve"> </w:t>
+      </w:r>
+      <w:proofErr w:type="spellStart"/>
+      <w:r>
+        <w:rPr>
+          <w:sz w:val="24"/>
+          <w:szCs w:val="24"/>
+        </w:rPr>
+        <w:t>Autònoma</w:t>
+      </w:r>
+      <w:proofErr w:type="spellEnd"/>
+      <w:r>
+        <w:rPr>
+          <w:sz w:val="24"/>
+          <w:szCs w:val="24"/>
+        </w:rPr>
+        <w:t xml:space="preserve"> de Barcelona, without which my time here would have been substantially more stressful and challenging. I am grateful to have had the opportunity to work with him</w:t>
       </w:r>
       <w:r>
         <w:rPr>
@@ -2560,7 +2717,23 @@
           <w:sz w:val="24"/>
           <w:szCs w:val="24"/>
         </w:rPr>
-        <w:t>Classical approaches to motif discovery include ChIP-Seq (Chromatin Immunoprecipitation Sequencing) and RNA-Seq.</w:t>
+        <w:t xml:space="preserve">Classical approaches to motif discovery include </w:t>
+      </w:r>
+      <w:proofErr w:type="spellStart"/>
+      <w:r>
+        <w:rPr>
+          <w:sz w:val="24"/>
+          <w:szCs w:val="24"/>
+        </w:rPr>
+        <w:t>ChIP</w:t>
+      </w:r>
+      <w:proofErr w:type="spellEnd"/>
+      <w:r>
+        <w:rPr>
+          <w:sz w:val="24"/>
+          <w:szCs w:val="24"/>
+        </w:rPr>
+        <w:t>-Seq (Chromatin Immunoprecipitation Sequencing) and RNA-Seq.</w:t>
       </w:r>
       <w:r>
         <w:rPr>
@@ -2589,7 +2762,23 @@
           <w:sz w:val="24"/>
           <w:szCs w:val="24"/>
         </w:rPr>
-        <w:t xml:space="preserve">organism of interest in a petri dish. In ChIP-Seq, the transcription factor </w:t>
+        <w:t xml:space="preserve">organism of interest in a petri dish. In </w:t>
+      </w:r>
+      <w:proofErr w:type="spellStart"/>
+      <w:r>
+        <w:rPr>
+          <w:sz w:val="24"/>
+          <w:szCs w:val="24"/>
+        </w:rPr>
+        <w:t>ChIP</w:t>
+      </w:r>
+      <w:proofErr w:type="spellEnd"/>
+      <w:r>
+        <w:rPr>
+          <w:sz w:val="24"/>
+          <w:szCs w:val="24"/>
+        </w:rPr>
+        <w:t xml:space="preserve">-Seq, the transcription factor </w:t>
       </w:r>
       <w:r>
         <w:rPr>
@@ -2957,7 +3146,23 @@
           <w:sz w:val="24"/>
           <w:szCs w:val="24"/>
         </w:rPr>
-        <w:t xml:space="preserve"> and phylogenetic footprinting, </w:t>
+        <w:t xml:space="preserve"> and phylogenetic </w:t>
+      </w:r>
+      <w:proofErr w:type="spellStart"/>
+      <w:r>
+        <w:rPr>
+          <w:sz w:val="24"/>
+          <w:szCs w:val="24"/>
+        </w:rPr>
+        <w:t>footprinting</w:t>
+      </w:r>
+      <w:proofErr w:type="spellEnd"/>
+      <w:r>
+        <w:rPr>
+          <w:sz w:val="24"/>
+          <w:szCs w:val="24"/>
+        </w:rPr>
+        <w:t xml:space="preserve">, </w:t>
       </w:r>
       <w:r>
         <w:rPr>
@@ -4098,7 +4303,23 @@
           <w:sz w:val="24"/>
           <w:szCs w:val="24"/>
         </w:rPr>
-        <w:t xml:space="preserve"> (e.g, </w:t>
+        <w:t xml:space="preserve"> (</w:t>
+      </w:r>
+      <w:proofErr w:type="spellStart"/>
+      <w:r>
+        <w:rPr>
+          <w:sz w:val="24"/>
+          <w:szCs w:val="24"/>
+        </w:rPr>
+        <w:t>e.g</w:t>
+      </w:r>
+      <w:proofErr w:type="spellEnd"/>
+      <w:r>
+        <w:rPr>
+          <w:sz w:val="24"/>
+          <w:szCs w:val="24"/>
+        </w:rPr>
+        <w:t xml:space="preserve">, </w:t>
       </w:r>
       <w:r>
         <w:rPr>
@@ -5326,7 +5547,23 @@
           <w:sz w:val="24"/>
           <w:szCs w:val="24"/>
         </w:rPr>
-        <w:t xml:space="preserve">(Hypergeometric Optimization of Motif EnRichment, 2010) or STREME </w:t>
+        <w:t xml:space="preserve">(Hypergeometric Optimization of Motif </w:t>
+      </w:r>
+      <w:proofErr w:type="spellStart"/>
+      <w:r>
+        <w:rPr>
+          <w:sz w:val="24"/>
+          <w:szCs w:val="24"/>
+        </w:rPr>
+        <w:t>EnRichment</w:t>
+      </w:r>
+      <w:proofErr w:type="spellEnd"/>
+      <w:r>
+        <w:rPr>
+          <w:sz w:val="24"/>
+          <w:szCs w:val="24"/>
+        </w:rPr>
+        <w:t xml:space="preserve">, 2010) or STREME </w:t>
       </w:r>
       <w:r>
         <w:rPr>
@@ -5582,7 +5819,23 @@
           <w:sz w:val="24"/>
           <w:szCs w:val="24"/>
         </w:rPr>
-        <w:t xml:space="preserve"> compared to five other methods, including deep learning-based and MEME-ChiP algorithms.</w:t>
+        <w:t xml:space="preserve"> compared to five other methods, including deep learning-based and MEME-</w:t>
+      </w:r>
+      <w:proofErr w:type="spellStart"/>
+      <w:r>
+        <w:rPr>
+          <w:sz w:val="24"/>
+          <w:szCs w:val="24"/>
+        </w:rPr>
+        <w:t>ChiP</w:t>
+      </w:r>
+      <w:proofErr w:type="spellEnd"/>
+      <w:r>
+        <w:rPr>
+          <w:sz w:val="24"/>
+          <w:szCs w:val="24"/>
+        </w:rPr>
+        <w:t xml:space="preserve"> algorithms.</w:t>
       </w:r>
       <w:r>
         <w:rPr>
@@ -6977,7 +7230,39 @@
           <w:sz w:val="24"/>
           <w:szCs w:val="24"/>
         </w:rPr>
-        <w:t>Given a set of binding site sequences across the FNR-CRP, LexA, and OmpR transcription factor families</w:t>
+        <w:t xml:space="preserve">Given a set of binding site sequences across the FNR-CRP, </w:t>
+      </w:r>
+      <w:proofErr w:type="spellStart"/>
+      <w:r>
+        <w:rPr>
+          <w:sz w:val="24"/>
+          <w:szCs w:val="24"/>
+        </w:rPr>
+        <w:t>LexA</w:t>
+      </w:r>
+      <w:proofErr w:type="spellEnd"/>
+      <w:r>
+        <w:rPr>
+          <w:sz w:val="24"/>
+          <w:szCs w:val="24"/>
+        </w:rPr>
+        <w:t xml:space="preserve">, and </w:t>
+      </w:r>
+      <w:proofErr w:type="spellStart"/>
+      <w:r>
+        <w:rPr>
+          <w:sz w:val="24"/>
+          <w:szCs w:val="24"/>
+        </w:rPr>
+        <w:t>OmpR</w:t>
+      </w:r>
+      <w:proofErr w:type="spellEnd"/>
+      <w:r>
+        <w:rPr>
+          <w:sz w:val="24"/>
+          <w:szCs w:val="24"/>
+        </w:rPr>
+        <w:t xml:space="preserve"> transcription factor families</w:t>
       </w:r>
       <w:r>
         <w:rPr>
@@ -7449,7 +7734,53 @@
           <w:sz w:val="24"/>
           <w:szCs w:val="24"/>
         </w:rPr>
-        <w:t xml:space="preserve">(identified by their UniProtID) </w:t>
+        <w:t>(identified by their UniProtID)</w:t>
+      </w:r>
+      <w:r>
+        <w:rPr>
+          <w:sz w:val="24"/>
+          <w:szCs w:val="24"/>
+        </w:rPr>
+        <w:t xml:space="preserve">, across the families </w:t>
+      </w:r>
+      <w:proofErr w:type="spellStart"/>
+      <w:r>
+        <w:rPr>
+          <w:sz w:val="24"/>
+          <w:szCs w:val="24"/>
+        </w:rPr>
+        <w:t>LexA</w:t>
+      </w:r>
+      <w:proofErr w:type="spellEnd"/>
+      <w:r>
+        <w:rPr>
+          <w:sz w:val="24"/>
+          <w:szCs w:val="24"/>
+        </w:rPr>
+        <w:t xml:space="preserve">, </w:t>
+      </w:r>
+      <w:proofErr w:type="spellStart"/>
+      <w:r>
+        <w:rPr>
+          <w:sz w:val="24"/>
+          <w:szCs w:val="24"/>
+        </w:rPr>
+        <w:t>OmpR</w:t>
+      </w:r>
+      <w:proofErr w:type="spellEnd"/>
+      <w:r>
+        <w:rPr>
+          <w:sz w:val="24"/>
+          <w:szCs w:val="24"/>
+        </w:rPr>
+        <w:t>, FNR-CRP, which are identified</w:t>
+      </w:r>
+      <w:r>
+        <w:rPr>
+          <w:sz w:val="24"/>
+          <w:szCs w:val="24"/>
+        </w:rPr>
+        <w:t xml:space="preserve"> </w:t>
       </w:r>
       <w:r>
         <w:rPr>
@@ -7635,8 +7966,17 @@
           <w:sz w:val="24"/>
           <w:szCs w:val="24"/>
         </w:rPr>
-        <w:t>For example, the LexA</w:t>
-      </w:r>
+        <w:t xml:space="preserve">For example, the </w:t>
+      </w:r>
+      <w:proofErr w:type="spellStart"/>
+      <w:r>
+        <w:rPr>
+          <w:sz w:val="24"/>
+          <w:szCs w:val="24"/>
+        </w:rPr>
+        <w:t>LexA</w:t>
+      </w:r>
+      <w:proofErr w:type="spellEnd"/>
       <w:r>
         <w:rPr>
           <w:sz w:val="24"/>
@@ -8073,7 +8413,15 @@
           <w:sz w:val="24"/>
           <w:szCs w:val="24"/>
         </w:rPr>
-        <w:t xml:space="preserve">direct or inverted repeat patterns, but </w:t>
+        <w:t xml:space="preserve">direct or inverted repeat patterns, </w:t>
+      </w:r>
+      <w:r>
+        <w:rPr>
+          <w:sz w:val="24"/>
+          <w:szCs w:val="24"/>
+        </w:rPr>
+        <w:lastRenderedPageBreak/>
+        <w:t xml:space="preserve">but </w:t>
       </w:r>
       <w:r>
         <w:rPr>
@@ -8122,15 +8470,7 @@
           <w:sz w:val="24"/>
           <w:szCs w:val="24"/>
         </w:rPr>
-        <w:t xml:space="preserve">are </w:t>
-      </w:r>
-      <w:r>
-        <w:rPr>
-          <w:sz w:val="24"/>
-          <w:szCs w:val="24"/>
-        </w:rPr>
-        <w:lastRenderedPageBreak/>
-        <w:t>associated with</w:t>
+        <w:t>are associated with</w:t>
       </w:r>
       <w:r>
         <w:rPr>
@@ -9978,8 +10318,17 @@
           <w:sz w:val="24"/>
           <w:szCs w:val="24"/>
         </w:rPr>
-        <w:t>The Kullback</w:t>
-      </w:r>
+        <w:t xml:space="preserve">The </w:t>
+      </w:r>
+      <w:proofErr w:type="spellStart"/>
+      <w:r>
+        <w:rPr>
+          <w:sz w:val="24"/>
+          <w:szCs w:val="24"/>
+        </w:rPr>
+        <w:t>Kullback</w:t>
+      </w:r>
+      <w:proofErr w:type="spellEnd"/>
       <w:r>
         <w:rPr>
           <w:sz w:val="24"/>
@@ -11843,6 +12192,7 @@
               </w:rPr>
               <w:t xml:space="preserve">Low </w:t>
             </w:r>
+            <w:proofErr w:type="gramStart"/>
             <w:r>
               <w:rPr>
                 <w:rFonts w:ascii="Times New Roman" w:eastAsia="Times New Roman" w:hAnsi="Times New Roman" w:cs="Times New Roman"/>
@@ -11852,7 +12202,19 @@
                 <w:szCs w:val="24"/>
                 <w:lang w:val="en-US" w:eastAsia="ko-KR"/>
               </w:rPr>
-              <w:t>IC  + strongly correlated</w:t>
+              <w:t>IC  +</w:t>
+            </w:r>
+            <w:proofErr w:type="gramEnd"/>
+            <w:r>
+              <w:rPr>
+                <w:rFonts w:ascii="Times New Roman" w:eastAsia="Times New Roman" w:hAnsi="Times New Roman" w:cs="Times New Roman"/>
+                <w:color w:val="000000"/>
+                <w:kern w:val="24"/>
+                <w:sz w:val="24"/>
+                <w:szCs w:val="24"/>
+                <w:lang w:val="en-US" w:eastAsia="ko-KR"/>
+              </w:rPr>
+              <w:t xml:space="preserve"> strongly correlated</w:t>
             </w:r>
             <w:r>
               <w:rPr>
@@ -12540,8 +12902,21 @@
                 <w:szCs w:val="24"/>
                 <w:lang w:val="en-US" w:eastAsia="ko-KR"/>
               </w:rPr>
-              <w:t>+ neg corr</w:t>
+              <w:t xml:space="preserve">+ neg </w:t>
             </w:r>
+            <w:proofErr w:type="spellStart"/>
+            <w:r>
+              <w:rPr>
+                <w:rFonts w:ascii="Times New Roman" w:eastAsia="Times New Roman" w:hAnsi="Times New Roman" w:cs="Times New Roman"/>
+                <w:color w:val="000000"/>
+                <w:kern w:val="24"/>
+                <w:sz w:val="24"/>
+                <w:szCs w:val="24"/>
+                <w:lang w:val="en-US" w:eastAsia="ko-KR"/>
+              </w:rPr>
+              <w:t>corr</w:t>
+            </w:r>
+            <w:proofErr w:type="spellEnd"/>
           </w:p>
         </w:tc>
         <w:tc>
@@ -12572,6 +12947,7 @@
                 <w:lang w:val="en-US" w:eastAsia="ko-KR"/>
               </w:rPr>
             </w:pPr>
+            <w:proofErr w:type="gramStart"/>
             <w:r>
               <w:rPr>
                 <w:rFonts w:ascii="Times New Roman" w:eastAsia="Times New Roman" w:hAnsi="Times New Roman" w:cs="Times New Roman"/>
@@ -12581,7 +12957,19 @@
                 <w:szCs w:val="24"/>
                 <w:lang w:val="en-US" w:eastAsia="ko-KR"/>
               </w:rPr>
-              <w:t xml:space="preserve">32 , 6 </w:t>
+              <w:t>32 ,</w:t>
+            </w:r>
+            <w:proofErr w:type="gramEnd"/>
+            <w:r>
+              <w:rPr>
+                <w:rFonts w:ascii="Times New Roman" w:eastAsia="Times New Roman" w:hAnsi="Times New Roman" w:cs="Times New Roman"/>
+                <w:color w:val="000000"/>
+                <w:kern w:val="24"/>
+                <w:sz w:val="24"/>
+                <w:szCs w:val="24"/>
+                <w:lang w:val="en-US" w:eastAsia="ko-KR"/>
+              </w:rPr>
+              <w:t xml:space="preserve"> 6 </w:t>
             </w:r>
           </w:p>
         </w:tc>
@@ -14759,43 +15147,107 @@
         </w:rPr>
         <w:t xml:space="preserve"> in order </w:t>
       </w:r>
+      <w:proofErr w:type="spellStart"/>
       <w:r>
         <w:rPr>
           <w:sz w:val="24"/>
           <w:szCs w:val="24"/>
           <w:lang w:val="es-ES"/>
         </w:rPr>
-        <w:t xml:space="preserve">destroy </w:t>
-      </w:r>
+        <w:t>destroy</w:t>
+      </w:r>
+      <w:proofErr w:type="spellEnd"/>
       <w:r>
         <w:rPr>
           <w:sz w:val="24"/>
           <w:szCs w:val="24"/>
           <w:lang w:val="es-ES"/>
         </w:rPr>
-        <w:t xml:space="preserve">existing </w:t>
-      </w:r>
+        <w:t xml:space="preserve"> </w:t>
+      </w:r>
+      <w:proofErr w:type="spellStart"/>
       <w:r>
         <w:rPr>
           <w:sz w:val="24"/>
           <w:szCs w:val="24"/>
           <w:lang w:val="es-ES"/>
         </w:rPr>
-        <w:t>index-wise relationships.</w:t>
-      </w:r>
-      <w:r>
-        <w:rPr>
-          <w:sz w:val="24"/>
-          <w:szCs w:val="24"/>
+        <w:t>existing</w:t>
+      </w:r>
+      <w:proofErr w:type="spellEnd"/>
+      <w:r>
+        <w:rPr>
+          <w:sz w:val="24"/>
+          <w:szCs w:val="24"/>
+          <w:lang w:val="es-ES"/>
         </w:rPr>
         <w:t xml:space="preserve"> </w:t>
       </w:r>
-      <w:r>
-        <w:rPr>
-          <w:sz w:val="24"/>
-          <w:szCs w:val="24"/>
-        </w:rPr>
-        <w:t>For each iteration of the bootstrap, the same threshold and diagonal detection process is applied</w:t>
+      <w:proofErr w:type="spellStart"/>
+      <w:r>
+        <w:rPr>
+          <w:sz w:val="24"/>
+          <w:szCs w:val="24"/>
+          <w:lang w:val="es-ES"/>
+        </w:rPr>
+        <w:t>index-wise</w:t>
+      </w:r>
+      <w:proofErr w:type="spellEnd"/>
+      <w:r>
+        <w:rPr>
+          <w:sz w:val="24"/>
+          <w:szCs w:val="24"/>
+          <w:lang w:val="es-ES"/>
+        </w:rPr>
+        <w:t xml:space="preserve"> </w:t>
+      </w:r>
+      <w:proofErr w:type="spellStart"/>
+      <w:r>
+        <w:rPr>
+          <w:sz w:val="24"/>
+          <w:szCs w:val="24"/>
+          <w:lang w:val="es-ES"/>
+        </w:rPr>
+        <w:t>relationships</w:t>
+      </w:r>
+      <w:proofErr w:type="spellEnd"/>
+      <w:r>
+        <w:rPr>
+          <w:sz w:val="24"/>
+          <w:szCs w:val="24"/>
+          <w:lang w:val="es-ES"/>
+        </w:rPr>
+        <w:t>.</w:t>
+      </w:r>
+      <w:r>
+        <w:rPr>
+          <w:sz w:val="24"/>
+          <w:szCs w:val="24"/>
+        </w:rPr>
+        <w:t xml:space="preserve"> </w:t>
+      </w:r>
+      <w:r>
+        <w:rPr>
+          <w:sz w:val="24"/>
+          <w:szCs w:val="24"/>
+        </w:rPr>
+        <w:t xml:space="preserve">For each iteration of the bootstrap, the same </w:t>
+      </w:r>
+      <w:proofErr w:type="spellStart"/>
+      <w:r>
+        <w:rPr>
+          <w:sz w:val="24"/>
+          <w:szCs w:val="24"/>
+        </w:rPr>
+        <w:t>threshold</w:t>
+      </w:r>
+      <w:proofErr w:type="spellEnd"/>
+      <w:r>
+        <w:rPr>
+          <w:sz w:val="24"/>
+          <w:szCs w:val="24"/>
+        </w:rPr>
+        <w:t xml:space="preserve"> and diagonal detection process is applied</w:t>
       </w:r>
       <w:r>
         <w:rPr>
@@ -15550,6 +16002,48 @@
           <w:szCs w:val="24"/>
         </w:rPr>
       </w:pPr>
+      <w:r>
+        <w:rPr>
+          <w:sz w:val="24"/>
+          <w:szCs w:val="24"/>
+        </w:rPr>
+        <w:t xml:space="preserve">For the CollecTF dataset, we have complete label coverage for whether the observations </w:t>
+      </w:r>
+      <w:r>
+        <w:rPr>
+          <w:sz w:val="24"/>
+          <w:szCs w:val="24"/>
+        </w:rPr>
+        <w:t xml:space="preserve">should be </w:t>
+      </w:r>
+      <w:r>
+        <w:rPr>
+          <w:sz w:val="24"/>
+          <w:szCs w:val="24"/>
+        </w:rPr>
+        <w:t>direct or inverted repeats. DRIPPY is run on the full data set, which results in at least two observations per combination of species and UniProtID. The full resulting dataset</w:t>
+      </w:r>
+      <w:r>
+        <w:rPr>
+          <w:sz w:val="24"/>
+          <w:szCs w:val="24"/>
+        </w:rPr>
+        <w:t>s for each percentile threshold</w:t>
+      </w:r>
+      <w:r>
+        <w:rPr>
+          <w:sz w:val="24"/>
+          <w:szCs w:val="24"/>
+        </w:rPr>
+        <w:t xml:space="preserve"> will return all found candidates. </w:t>
+      </w:r>
+      <w:r>
+        <w:rPr>
+          <w:sz w:val="24"/>
+          <w:szCs w:val="24"/>
+        </w:rPr>
+        <w:t xml:space="preserve">This data set was then aggregated so that the best candidates for the direct and inverted searches were found, </w:t>
+      </w:r>
     </w:p>
     <w:p>
       <w:pPr>
@@ -15559,6 +16053,112 @@
           <w:szCs w:val="24"/>
         </w:rPr>
       </w:pPr>
+    </w:p>
+    <w:p>
+      <w:pPr>
+        <w:pStyle w:val="p1"/>
+        <w:rPr>
+          <w:sz w:val="24"/>
+          <w:szCs w:val="24"/>
+        </w:rPr>
+      </w:pPr>
+      <w:r>
+        <w:rPr>
+          <w:sz w:val="24"/>
+          <w:szCs w:val="24"/>
+        </w:rPr>
+        <w:t xml:space="preserve">We </w:t>
+      </w:r>
+      <w:r>
+        <w:rPr>
+          <w:sz w:val="24"/>
+          <w:szCs w:val="24"/>
+        </w:rPr>
+        <w:t xml:space="preserve">then </w:t>
+      </w:r>
+      <w:r>
+        <w:rPr>
+          <w:sz w:val="24"/>
+          <w:szCs w:val="24"/>
+        </w:rPr>
+        <w:t xml:space="preserve">computed </w:t>
+      </w:r>
+      <w:r>
+        <w:rPr>
+          <w:sz w:val="24"/>
+          <w:szCs w:val="24"/>
+        </w:rPr>
+        <w:t xml:space="preserve">two sets of </w:t>
+      </w:r>
+      <w:r>
+        <w:rPr>
+          <w:sz w:val="24"/>
+          <w:szCs w:val="24"/>
+        </w:rPr>
+        <w:t>ROC and PR curves</w:t>
+      </w:r>
+      <w:r>
+        <w:rPr>
+          <w:sz w:val="24"/>
+          <w:szCs w:val="24"/>
+        </w:rPr>
+        <w:t xml:space="preserve">. The </w:t>
+      </w:r>
+      <w:r>
+        <w:rPr>
+          <w:sz w:val="24"/>
+          <w:szCs w:val="24"/>
+        </w:rPr>
+        <w:t xml:space="preserve">on the </w:t>
+      </w:r>
+      <w:r>
+        <w:rPr>
+          <w:sz w:val="24"/>
+          <w:szCs w:val="24"/>
+        </w:rPr>
+        <w:t xml:space="preserve">full data set </w:t>
+      </w:r>
+      <w:r>
+        <w:rPr>
+          <w:sz w:val="24"/>
+          <w:szCs w:val="24"/>
+        </w:rPr>
+        <w:t>aggregate the data set by picking the best candidate for each observation using the p-value. ROC and PR curves are then computed on this full dataset to visualize DRIPPY’s classification performance</w:t>
+      </w:r>
+      <w:r>
+        <w:rPr>
+          <w:sz w:val="24"/>
+          <w:szCs w:val="24"/>
+        </w:rPr>
+        <w:t>.</w:t>
+      </w:r>
+    </w:p>
+    <w:p>
+      <w:pPr>
+        <w:pStyle w:val="p1"/>
+        <w:rPr>
+          <w:sz w:val="24"/>
+          <w:szCs w:val="24"/>
+        </w:rPr>
+      </w:pPr>
+    </w:p>
+    <w:p>
+      <w:pPr>
+        <w:pStyle w:val="p1"/>
+        <w:rPr>
+          <w:sz w:val="24"/>
+          <w:szCs w:val="24"/>
+        </w:rPr>
+      </w:pPr>
+    </w:p>
+    <w:p>
+      <w:pPr>
+        <w:pStyle w:val="p1"/>
+        <w:rPr>
+          <w:sz w:val="24"/>
+          <w:szCs w:val="24"/>
+        </w:rPr>
+      </w:pPr>
       <w:r>
         <w:rPr>
           <w:sz w:val="24"/>
@@ -15579,6 +16179,31 @@
           <w:szCs w:val="24"/>
         </w:rPr>
         <w:t xml:space="preserve">Compare behavior of ROC and PR across different </w:t>
+      </w:r>
+    </w:p>
+    <w:p>
+      <w:pPr>
+        <w:pStyle w:val="p1"/>
+        <w:rPr>
+          <w:sz w:val="24"/>
+          <w:szCs w:val="24"/>
+        </w:rPr>
+      </w:pPr>
+    </w:p>
+    <w:p>
+      <w:pPr>
+        <w:pStyle w:val="p1"/>
+        <w:rPr>
+          <w:sz w:val="24"/>
+          <w:szCs w:val="24"/>
+        </w:rPr>
+      </w:pPr>
+      <w:r>
+        <w:rPr>
+          <w:sz w:val="24"/>
+          <w:szCs w:val="24"/>
+        </w:rPr>
+        <w:t xml:space="preserve">We perform a similar analysis with the MEME data, </w:t>
       </w:r>
     </w:p>
     <w:p>

</xml_diff>

<commit_message>
alignment analysis and meme resultsç
</commit_message>
<xml_diff>
--- a/TFM Writing/RICSE_Enoch Shin_template.docx
+++ b/TFM Writing/RICSE_Enoch Shin_template.docx
@@ -4583,7 +4583,21 @@
           <w:sz w:val="24"/>
           <w:szCs w:val="24"/>
         </w:rPr>
-        <w:t xml:space="preserve">locally optimum solutions at each iteration. </w:t>
+        <w:t xml:space="preserve">locally optimum solutions at each </w:t>
+      </w:r>
+      <w:r>
+        <w:rPr>
+          <w:sz w:val="24"/>
+          <w:szCs w:val="24"/>
+        </w:rPr>
+        <w:t>step</w:t>
+      </w:r>
+      <w:r>
+        <w:rPr>
+          <w:sz w:val="24"/>
+          <w:szCs w:val="24"/>
+        </w:rPr>
+        <w:t xml:space="preserve">. </w:t>
       </w:r>
       <w:r>
         <w:rPr>
@@ -7184,21 +7198,21 @@
           <w:sz w:val="24"/>
           <w:szCs w:val="24"/>
         </w:rPr>
-        <w:t xml:space="preserve">motif </w:t>
-      </w:r>
-      <w:r>
-        <w:rPr>
-          <w:sz w:val="24"/>
-          <w:szCs w:val="24"/>
-        </w:rPr>
-        <w:t xml:space="preserve">candidate </w:t>
-      </w:r>
-      <w:r>
-        <w:rPr>
-          <w:sz w:val="24"/>
-          <w:szCs w:val="24"/>
-        </w:rPr>
-        <w:t>group</w:t>
+        <w:t xml:space="preserve">discovered group of candidate </w:t>
+      </w:r>
+      <w:r>
+        <w:rPr>
+          <w:sz w:val="24"/>
+          <w:szCs w:val="24"/>
+        </w:rPr>
+        <w:t>motif</w:t>
+      </w:r>
+      <w:r>
+        <w:rPr>
+          <w:sz w:val="24"/>
+          <w:szCs w:val="24"/>
+        </w:rPr>
+        <w:t>s</w:t>
       </w:r>
       <w:r>
         <w:rPr>
@@ -7773,7 +7787,56 @@
           <w:sz w:val="24"/>
           <w:szCs w:val="24"/>
         </w:rPr>
-        <w:t>, FNR-CRP, which are identified</w:t>
+        <w:t xml:space="preserve">, FNR-CRP, which are </w:t>
+      </w:r>
+      <w:r>
+        <w:rPr>
+          <w:sz w:val="24"/>
+          <w:szCs w:val="24"/>
+        </w:rPr>
+        <w:t xml:space="preserve">TFs active </w:t>
+      </w:r>
+      <w:r>
+        <w:rPr>
+          <w:sz w:val="24"/>
+          <w:szCs w:val="24"/>
+        </w:rPr>
+        <w:t xml:space="preserve">across multiple species. The sample size is </w:t>
+      </w:r>
+      <w:r>
+        <w:rPr>
+          <w:sz w:val="24"/>
+          <w:szCs w:val="24"/>
+        </w:rPr>
+        <w:t xml:space="preserve">larger </w:t>
+      </w:r>
+      <w:r>
+        <w:rPr>
+          <w:sz w:val="24"/>
+          <w:szCs w:val="24"/>
+        </w:rPr>
+        <w:t xml:space="preserve">as </w:t>
+      </w:r>
+      <w:r>
+        <w:rPr>
+          <w:sz w:val="24"/>
+          <w:szCs w:val="24"/>
+        </w:rPr>
+        <w:t xml:space="preserve">some of the TFs are </w:t>
+      </w:r>
+      <w:r>
+        <w:rPr>
+          <w:sz w:val="24"/>
+          <w:szCs w:val="24"/>
+        </w:rPr>
+        <w:t xml:space="preserve">shared </w:t>
+      </w:r>
+      <w:r>
+        <w:rPr>
+          <w:sz w:val="24"/>
+          <w:szCs w:val="24"/>
+        </w:rPr>
+        <w:t>across multiple species</w:t>
       </w:r>
       <w:r>
         <w:rPr>
@@ -7787,43 +7850,147 @@
           <w:sz w:val="24"/>
           <w:szCs w:val="24"/>
         </w:rPr>
-        <w:t xml:space="preserve">across multiple species. The sample size is </w:t>
-      </w:r>
-      <w:r>
-        <w:rPr>
-          <w:sz w:val="24"/>
-          <w:szCs w:val="24"/>
-        </w:rPr>
-        <w:t xml:space="preserve">larger </w:t>
-      </w:r>
-      <w:r>
-        <w:rPr>
-          <w:sz w:val="24"/>
-          <w:szCs w:val="24"/>
-        </w:rPr>
-        <w:t xml:space="preserve">as </w:t>
-      </w:r>
-      <w:r>
-        <w:rPr>
-          <w:sz w:val="24"/>
-          <w:szCs w:val="24"/>
-        </w:rPr>
-        <w:t xml:space="preserve">some of the TFs are </w:t>
-      </w:r>
-      <w:r>
-        <w:rPr>
-          <w:sz w:val="24"/>
-          <w:szCs w:val="24"/>
-        </w:rPr>
-        <w:t xml:space="preserve">shared </w:t>
-      </w:r>
-      <w:r>
-        <w:rPr>
-          <w:sz w:val="24"/>
-          <w:szCs w:val="24"/>
-        </w:rPr>
-        <w:t>across multiple species</w:t>
-      </w:r>
+        <w:t>(n = 68)</w:t>
+      </w:r>
+      <w:r>
+        <w:rPr>
+          <w:sz w:val="24"/>
+          <w:szCs w:val="24"/>
+        </w:rPr>
+        <w:t>.</w:t>
+      </w:r>
+    </w:p>
+    <w:p>
+      <w:pPr>
+        <w:pStyle w:val="p1"/>
+        <w:rPr>
+          <w:sz w:val="24"/>
+          <w:szCs w:val="24"/>
+        </w:rPr>
+      </w:pPr>
+    </w:p>
+    <w:p>
+      <w:pPr>
+        <w:pStyle w:val="p1"/>
+        <w:rPr>
+          <w:sz w:val="24"/>
+          <w:szCs w:val="24"/>
+        </w:rPr>
+      </w:pPr>
+      <w:r>
+        <w:rPr>
+          <w:sz w:val="24"/>
+          <w:szCs w:val="24"/>
+        </w:rPr>
+        <w:t xml:space="preserve">The justification of incorporating CollecTF data is to </w:t>
+      </w:r>
+      <w:r>
+        <w:rPr>
+          <w:sz w:val="24"/>
+          <w:szCs w:val="24"/>
+        </w:rPr>
+        <w:t xml:space="preserve">build the pipeline on known samples </w:t>
+      </w:r>
+      <w:r>
+        <w:rPr>
+          <w:sz w:val="24"/>
+          <w:szCs w:val="24"/>
+        </w:rPr>
+        <w:t xml:space="preserve">for which we </w:t>
+      </w:r>
+      <w:r>
+        <w:rPr>
+          <w:sz w:val="24"/>
+          <w:szCs w:val="24"/>
+        </w:rPr>
+        <w:t xml:space="preserve">have </w:t>
+      </w:r>
+      <w:r>
+        <w:rPr>
+          <w:sz w:val="24"/>
+          <w:szCs w:val="24"/>
+        </w:rPr>
+        <w:t xml:space="preserve">established </w:t>
+      </w:r>
+      <w:r>
+        <w:rPr>
+          <w:sz w:val="24"/>
+          <w:szCs w:val="24"/>
+        </w:rPr>
+        <w:t>ground truths on the motif</w:t>
+      </w:r>
+      <w:r>
+        <w:rPr>
+          <w:sz w:val="24"/>
+          <w:szCs w:val="24"/>
+        </w:rPr>
+        <w:t xml:space="preserve">s’ expected </w:t>
+      </w:r>
+      <w:r>
+        <w:rPr>
+          <w:sz w:val="24"/>
+          <w:szCs w:val="24"/>
+        </w:rPr>
+        <w:t xml:space="preserve">morphology. We </w:t>
+      </w:r>
+      <w:r>
+        <w:rPr>
+          <w:sz w:val="24"/>
+          <w:szCs w:val="24"/>
+        </w:rPr>
+        <w:t xml:space="preserve">expect </w:t>
+      </w:r>
+      <w:r>
+        <w:rPr>
+          <w:sz w:val="24"/>
+          <w:szCs w:val="24"/>
+        </w:rPr>
+        <w:t xml:space="preserve">that the discovered </w:t>
+      </w:r>
+      <w:r>
+        <w:rPr>
+          <w:sz w:val="24"/>
+          <w:szCs w:val="24"/>
+        </w:rPr>
+        <w:t>motif</w:t>
+      </w:r>
+      <w:r>
+        <w:rPr>
+          <w:sz w:val="24"/>
+          <w:szCs w:val="24"/>
+        </w:rPr>
+        <w:t xml:space="preserve">s should have sequence patterns that conform to palindromic or direct-repeat patterns as observed in </w:t>
+      </w:r>
+      <w:r>
+        <w:rPr>
+          <w:sz w:val="24"/>
+          <w:szCs w:val="24"/>
+        </w:rPr>
+        <w:t xml:space="preserve">existing </w:t>
+      </w:r>
+      <w:r>
+        <w:rPr>
+          <w:sz w:val="24"/>
+          <w:szCs w:val="24"/>
+        </w:rPr>
+        <w:t xml:space="preserve">literature. </w:t>
+      </w:r>
+      <w:r>
+        <w:rPr>
+          <w:sz w:val="24"/>
+          <w:szCs w:val="24"/>
+        </w:rPr>
+        <w:t xml:space="preserve">For example, the </w:t>
+      </w:r>
+      <w:proofErr w:type="spellStart"/>
+      <w:r>
+        <w:rPr>
+          <w:sz w:val="24"/>
+          <w:szCs w:val="24"/>
+        </w:rPr>
+        <w:t>LexA</w:t>
+      </w:r>
+      <w:proofErr w:type="spellEnd"/>
       <w:r>
         <w:rPr>
           <w:sz w:val="24"/>
@@ -7836,7 +8003,131 @@
           <w:sz w:val="24"/>
           <w:szCs w:val="24"/>
         </w:rPr>
-        <w:t>(n = 68)</w:t>
+        <w:t>TF</w:t>
+      </w:r>
+      <w:r>
+        <w:rPr>
+          <w:sz w:val="24"/>
+          <w:szCs w:val="24"/>
+        </w:rPr>
+        <w:t xml:space="preserve"> </w:t>
+      </w:r>
+      <w:r>
+        <w:rPr>
+          <w:sz w:val="24"/>
+          <w:szCs w:val="24"/>
+        </w:rPr>
+        <w:t xml:space="preserve">is known to </w:t>
+      </w:r>
+      <w:r>
+        <w:rPr>
+          <w:sz w:val="24"/>
+          <w:szCs w:val="24"/>
+        </w:rPr>
+        <w:t xml:space="preserve">commonly </w:t>
+      </w:r>
+      <w:r>
+        <w:rPr>
+          <w:sz w:val="24"/>
+          <w:szCs w:val="24"/>
+        </w:rPr>
+        <w:t>have motifs of inverted repeat patterns.</w:t>
+      </w:r>
+      <w:r>
+        <w:rPr>
+          <w:rStyle w:val="FootnoteReference"/>
+          <w:sz w:val="24"/>
+          <w:szCs w:val="24"/>
+        </w:rPr>
+        <w:footnoteReference w:id="41"/>
+      </w:r>
+      <w:r>
+        <w:rPr>
+          <w:sz w:val="24"/>
+          <w:szCs w:val="24"/>
+        </w:rPr>
+        <w:t xml:space="preserve"> </w:t>
+      </w:r>
+      <w:r>
+        <w:rPr>
+          <w:sz w:val="24"/>
+          <w:szCs w:val="24"/>
+        </w:rPr>
+        <w:t xml:space="preserve">This way, we can </w:t>
+      </w:r>
+      <w:r>
+        <w:rPr>
+          <w:sz w:val="24"/>
+          <w:szCs w:val="24"/>
+        </w:rPr>
+        <w:t xml:space="preserve">build </w:t>
+      </w:r>
+      <w:r>
+        <w:rPr>
+          <w:sz w:val="24"/>
+          <w:szCs w:val="24"/>
+        </w:rPr>
+        <w:t>the data pipeline</w:t>
+      </w:r>
+      <w:r>
+        <w:rPr>
+          <w:sz w:val="24"/>
+          <w:szCs w:val="24"/>
+        </w:rPr>
+        <w:t xml:space="preserve"> on a known data set with confirmed ground truth</w:t>
+      </w:r>
+      <w:r>
+        <w:rPr>
+          <w:sz w:val="24"/>
+          <w:szCs w:val="24"/>
+        </w:rPr>
+        <w:t>s</w:t>
+      </w:r>
+      <w:r>
+        <w:rPr>
+          <w:sz w:val="24"/>
+          <w:szCs w:val="24"/>
+        </w:rPr>
+        <w:t xml:space="preserve">. </w:t>
+      </w:r>
+    </w:p>
+    <w:p>
+      <w:pPr>
+        <w:pStyle w:val="p1"/>
+        <w:rPr>
+          <w:sz w:val="24"/>
+          <w:szCs w:val="24"/>
+        </w:rPr>
+      </w:pPr>
+    </w:p>
+    <w:p>
+      <w:pPr>
+        <w:pStyle w:val="p1"/>
+        <w:rPr>
+          <w:sz w:val="24"/>
+          <w:szCs w:val="24"/>
+        </w:rPr>
+      </w:pPr>
+      <w:r>
+        <w:rPr>
+          <w:sz w:val="24"/>
+          <w:szCs w:val="24"/>
+        </w:rPr>
+        <w:t xml:space="preserve">The second data source is a </w:t>
+      </w:r>
+      <w:r>
+        <w:rPr>
+          <w:sz w:val="24"/>
+          <w:szCs w:val="24"/>
+        </w:rPr>
+        <w:t>collection of four MEME outputs, each of which contains 10 candidate motifs</w:t>
+      </w:r>
+      <w:r>
+        <w:rPr>
+          <w:sz w:val="24"/>
+          <w:szCs w:val="24"/>
+        </w:rPr>
+        <w:t xml:space="preserve"> (n = 40)</w:t>
       </w:r>
       <w:r>
         <w:rPr>
@@ -7845,138 +8136,6 @@
         </w:rPr>
         <w:t>.</w:t>
       </w:r>
-    </w:p>
-    <w:p>
-      <w:pPr>
-        <w:pStyle w:val="p1"/>
-        <w:rPr>
-          <w:sz w:val="24"/>
-          <w:szCs w:val="24"/>
-        </w:rPr>
-      </w:pPr>
-    </w:p>
-    <w:p>
-      <w:pPr>
-        <w:pStyle w:val="p1"/>
-        <w:rPr>
-          <w:sz w:val="24"/>
-          <w:szCs w:val="24"/>
-        </w:rPr>
-      </w:pPr>
-      <w:r>
-        <w:rPr>
-          <w:sz w:val="24"/>
-          <w:szCs w:val="24"/>
-        </w:rPr>
-        <w:t xml:space="preserve">The justification of incorporating CollecTF data is to </w:t>
-      </w:r>
-      <w:r>
-        <w:rPr>
-          <w:sz w:val="24"/>
-          <w:szCs w:val="24"/>
-        </w:rPr>
-        <w:t xml:space="preserve">build the pipeline on known samples </w:t>
-      </w:r>
-      <w:r>
-        <w:rPr>
-          <w:sz w:val="24"/>
-          <w:szCs w:val="24"/>
-        </w:rPr>
-        <w:t xml:space="preserve">for which we </w:t>
-      </w:r>
-      <w:r>
-        <w:rPr>
-          <w:sz w:val="24"/>
-          <w:szCs w:val="24"/>
-        </w:rPr>
-        <w:t xml:space="preserve">have </w:t>
-      </w:r>
-      <w:r>
-        <w:rPr>
-          <w:sz w:val="24"/>
-          <w:szCs w:val="24"/>
-        </w:rPr>
-        <w:t xml:space="preserve">established </w:t>
-      </w:r>
-      <w:r>
-        <w:rPr>
-          <w:sz w:val="24"/>
-          <w:szCs w:val="24"/>
-        </w:rPr>
-        <w:t>ground truths on the motif</w:t>
-      </w:r>
-      <w:r>
-        <w:rPr>
-          <w:sz w:val="24"/>
-          <w:szCs w:val="24"/>
-        </w:rPr>
-        <w:t xml:space="preserve">s’ expected </w:t>
-      </w:r>
-      <w:r>
-        <w:rPr>
-          <w:sz w:val="24"/>
-          <w:szCs w:val="24"/>
-        </w:rPr>
-        <w:t xml:space="preserve">morphology. We </w:t>
-      </w:r>
-      <w:r>
-        <w:rPr>
-          <w:sz w:val="24"/>
-          <w:szCs w:val="24"/>
-        </w:rPr>
-        <w:t xml:space="preserve">expect </w:t>
-      </w:r>
-      <w:r>
-        <w:rPr>
-          <w:sz w:val="24"/>
-          <w:szCs w:val="24"/>
-        </w:rPr>
-        <w:t xml:space="preserve">that the discovered </w:t>
-      </w:r>
-      <w:r>
-        <w:rPr>
-          <w:sz w:val="24"/>
-          <w:szCs w:val="24"/>
-        </w:rPr>
-        <w:t>motif</w:t>
-      </w:r>
-      <w:r>
-        <w:rPr>
-          <w:sz w:val="24"/>
-          <w:szCs w:val="24"/>
-        </w:rPr>
-        <w:t xml:space="preserve">s should have sequence patterns that conform to palindromic or direct-repeat patterns as observed in </w:t>
-      </w:r>
-      <w:r>
-        <w:rPr>
-          <w:sz w:val="24"/>
-          <w:szCs w:val="24"/>
-        </w:rPr>
-        <w:t xml:space="preserve">existing </w:t>
-      </w:r>
-      <w:r>
-        <w:rPr>
-          <w:sz w:val="24"/>
-          <w:szCs w:val="24"/>
-        </w:rPr>
-        <w:t xml:space="preserve">literature. </w:t>
-      </w:r>
-      <w:r>
-        <w:rPr>
-          <w:sz w:val="24"/>
-          <w:szCs w:val="24"/>
-        </w:rPr>
-        <w:t xml:space="preserve">For example, the </w:t>
-      </w:r>
-      <w:proofErr w:type="spellStart"/>
-      <w:r>
-        <w:rPr>
-          <w:sz w:val="24"/>
-          <w:szCs w:val="24"/>
-        </w:rPr>
-        <w:t>LexA</w:t>
-      </w:r>
-      <w:proofErr w:type="spellEnd"/>
       <w:r>
         <w:rPr>
           <w:sz w:val="24"/>
@@ -7989,152 +8148,21 @@
           <w:sz w:val="24"/>
           <w:szCs w:val="24"/>
         </w:rPr>
-        <w:t>TF</w:t>
-      </w:r>
-      <w:r>
-        <w:rPr>
-          <w:sz w:val="24"/>
-          <w:szCs w:val="24"/>
-        </w:rPr>
-        <w:t xml:space="preserve"> </w:t>
-      </w:r>
-      <w:r>
-        <w:rPr>
-          <w:sz w:val="24"/>
-          <w:szCs w:val="24"/>
-        </w:rPr>
-        <w:t xml:space="preserve">is known to </w:t>
-      </w:r>
-      <w:r>
-        <w:rPr>
-          <w:sz w:val="24"/>
-          <w:szCs w:val="24"/>
-        </w:rPr>
-        <w:t xml:space="preserve">commonly </w:t>
-      </w:r>
-      <w:r>
-        <w:rPr>
-          <w:sz w:val="24"/>
-          <w:szCs w:val="24"/>
-        </w:rPr>
-        <w:t>have motifs of inverted repeat patterns.</w:t>
-      </w:r>
-      <w:r>
-        <w:rPr>
-          <w:rStyle w:val="FootnoteReference"/>
-          <w:sz w:val="24"/>
-          <w:szCs w:val="24"/>
-        </w:rPr>
-        <w:footnoteReference w:id="41"/>
-      </w:r>
-      <w:r>
-        <w:rPr>
-          <w:sz w:val="24"/>
-          <w:szCs w:val="24"/>
-        </w:rPr>
-        <w:t xml:space="preserve"> </w:t>
-      </w:r>
-      <w:r>
-        <w:rPr>
-          <w:sz w:val="24"/>
-          <w:szCs w:val="24"/>
-        </w:rPr>
-        <w:t xml:space="preserve">This way, we can </w:t>
-      </w:r>
-      <w:r>
-        <w:rPr>
-          <w:sz w:val="24"/>
-          <w:szCs w:val="24"/>
-        </w:rPr>
-        <w:t xml:space="preserve">build </w:t>
-      </w:r>
-      <w:r>
-        <w:rPr>
-          <w:sz w:val="24"/>
-          <w:szCs w:val="24"/>
-        </w:rPr>
-        <w:t>the data pipeline</w:t>
-      </w:r>
-      <w:r>
-        <w:rPr>
-          <w:sz w:val="24"/>
-          <w:szCs w:val="24"/>
-        </w:rPr>
-        <w:t xml:space="preserve"> on a known data set with confirmed ground truth</w:t>
-      </w:r>
-      <w:r>
-        <w:rPr>
-          <w:sz w:val="24"/>
-          <w:szCs w:val="24"/>
-        </w:rPr>
-        <w:t>s</w:t>
-      </w:r>
-      <w:r>
-        <w:rPr>
-          <w:sz w:val="24"/>
-          <w:szCs w:val="24"/>
-        </w:rPr>
-        <w:t xml:space="preserve">. </w:t>
-      </w:r>
-    </w:p>
-    <w:p>
-      <w:pPr>
-        <w:pStyle w:val="p1"/>
-        <w:rPr>
-          <w:sz w:val="24"/>
-          <w:szCs w:val="24"/>
-        </w:rPr>
-      </w:pPr>
-    </w:p>
-    <w:p>
-      <w:pPr>
-        <w:pStyle w:val="p1"/>
-        <w:rPr>
-          <w:sz w:val="24"/>
-          <w:szCs w:val="24"/>
-        </w:rPr>
-      </w:pPr>
-      <w:r>
-        <w:rPr>
-          <w:sz w:val="24"/>
-          <w:szCs w:val="24"/>
-        </w:rPr>
-        <w:t xml:space="preserve">The second data source is a </w:t>
-      </w:r>
-      <w:r>
-        <w:rPr>
-          <w:sz w:val="24"/>
-          <w:szCs w:val="24"/>
-        </w:rPr>
-        <w:t>collection of four MEME outputs, each of which contains 10 candidate motifs</w:t>
-      </w:r>
-      <w:r>
-        <w:rPr>
-          <w:sz w:val="24"/>
-          <w:szCs w:val="24"/>
-        </w:rPr>
-        <w:t xml:space="preserve"> (n = 40)</w:t>
-      </w:r>
-      <w:r>
-        <w:rPr>
-          <w:sz w:val="24"/>
-          <w:szCs w:val="24"/>
-        </w:rPr>
-        <w:t>.</w:t>
-      </w:r>
-      <w:r>
-        <w:rPr>
-          <w:sz w:val="24"/>
-          <w:szCs w:val="24"/>
-        </w:rPr>
-        <w:t xml:space="preserve"> </w:t>
-      </w:r>
-      <w:r>
-        <w:rPr>
-          <w:sz w:val="24"/>
-          <w:szCs w:val="24"/>
-        </w:rPr>
-        <w:t xml:space="preserve">The data was first manually labeled based on MEME’s visual output of the sequence logo, </w:t>
+        <w:t xml:space="preserve">The data was first manually labeled </w:t>
+      </w:r>
+      <w:r>
+        <w:rPr>
+          <w:sz w:val="24"/>
+          <w:szCs w:val="24"/>
+        </w:rPr>
+        <w:t xml:space="preserve">by reviewing </w:t>
+      </w:r>
+      <w:r>
+        <w:rPr>
+          <w:sz w:val="24"/>
+          <w:szCs w:val="24"/>
+        </w:rPr>
+        <w:t xml:space="preserve">MEME’s visual output of the sequence logo, </w:t>
       </w:r>
       <w:r>
         <w:rPr>
@@ -8498,7 +8526,21 @@
           <w:sz w:val="24"/>
           <w:szCs w:val="24"/>
         </w:rPr>
-        <w:t>, where unlike the CollecTF set, we do not apply known literature-backed heuristics</w:t>
+        <w:t xml:space="preserve">, where unlike the CollecTF set, we </w:t>
+      </w:r>
+      <w:r>
+        <w:rPr>
+          <w:sz w:val="24"/>
+          <w:szCs w:val="24"/>
+        </w:rPr>
+        <w:t>can</w:t>
+      </w:r>
+      <w:r>
+        <w:rPr>
+          <w:sz w:val="24"/>
+          <w:szCs w:val="24"/>
+        </w:rPr>
+        <w:t>not apply known literature-backed heuristics</w:t>
       </w:r>
       <w:r>
         <w:rPr>
@@ -9884,6 +9926,7 @@
     <w:p>
       <w:pPr>
         <w:pStyle w:val="p1"/>
+        <w:jc w:val="center"/>
         <w:rPr>
           <w:sz w:val="24"/>
           <w:szCs w:val="24"/>
@@ -9972,13 +10015,6 @@
           <w:szCs w:val="24"/>
         </w:rPr>
         <w:fldChar w:fldCharType="end"/>
-      </w:r>
-      <w:r>
-        <w:rPr>
-          <w:sz w:val="24"/>
-          <w:szCs w:val="24"/>
-        </w:rPr>
-        <w:t xml:space="preserve"> </w:t>
       </w:r>
     </w:p>
     <w:p>
@@ -11691,7 +11727,63 @@
           <w:sz w:val="24"/>
           <w:szCs w:val="24"/>
         </w:rPr>
-        <w:t>resulting in two drastically different measures of divergence. The JSD alone has the same disadvantage as the Pearson for the same reasons, but it is bounded from 0 to 1, which is advantageous as a penalty as it aligns with the nonzero 0 to 2 range of the PIC.</w:t>
+        <w:t xml:space="preserve">resulting in two drastically different measures of divergence. </w:t>
+      </w:r>
+      <w:r>
+        <w:rPr>
+          <w:sz w:val="24"/>
+          <w:szCs w:val="24"/>
+        </w:rPr>
+        <w:t>Using the</w:t>
+      </w:r>
+      <w:r>
+        <w:rPr>
+          <w:sz w:val="24"/>
+          <w:szCs w:val="24"/>
+        </w:rPr>
+        <w:t xml:space="preserve"> JSD </w:t>
+      </w:r>
+      <w:r>
+        <w:rPr>
+          <w:sz w:val="24"/>
+          <w:szCs w:val="24"/>
+        </w:rPr>
+        <w:t xml:space="preserve">as a standalone metric </w:t>
+      </w:r>
+      <w:r>
+        <w:rPr>
+          <w:sz w:val="24"/>
+          <w:szCs w:val="24"/>
+        </w:rPr>
+        <w:t xml:space="preserve">has the same disadvantage as the Pearson for </w:t>
+      </w:r>
+      <w:r>
+        <w:rPr>
+          <w:sz w:val="24"/>
+          <w:szCs w:val="24"/>
+        </w:rPr>
+        <w:t xml:space="preserve">similar </w:t>
+      </w:r>
+      <w:r>
+        <w:rPr>
+          <w:sz w:val="24"/>
+          <w:szCs w:val="24"/>
+        </w:rPr>
+        <w:t xml:space="preserve">reasons, but it is bounded from 0 to 1, which is advantageous as a penalty </w:t>
+      </w:r>
+      <w:r>
+        <w:rPr>
+          <w:sz w:val="24"/>
+          <w:szCs w:val="24"/>
+        </w:rPr>
+        <w:t xml:space="preserve">metric </w:t>
+      </w:r>
+      <w:r>
+        <w:rPr>
+          <w:sz w:val="24"/>
+          <w:szCs w:val="24"/>
+        </w:rPr>
+        <w:t>as it aligns with the nonzero 0 to 2 range of the PIC.</w:t>
       </w:r>
       <w:r>
         <w:rPr>
@@ -15147,121 +15239,61 @@
         </w:rPr>
         <w:t xml:space="preserve"> in order </w:t>
       </w:r>
-      <w:proofErr w:type="spellStart"/>
-      <w:r>
-        <w:rPr>
-          <w:sz w:val="24"/>
-          <w:szCs w:val="24"/>
-          <w:lang w:val="es-ES"/>
-        </w:rPr>
-        <w:t>destroy</w:t>
-      </w:r>
-      <w:proofErr w:type="spellEnd"/>
-      <w:r>
-        <w:rPr>
-          <w:sz w:val="24"/>
-          <w:szCs w:val="24"/>
-          <w:lang w:val="es-ES"/>
+      <w:r>
+        <w:rPr>
+          <w:sz w:val="24"/>
+          <w:szCs w:val="24"/>
+        </w:rPr>
+        <w:t xml:space="preserve">destroy </w:t>
+      </w:r>
+      <w:r>
+        <w:rPr>
+          <w:sz w:val="24"/>
+          <w:szCs w:val="24"/>
+        </w:rPr>
+        <w:t xml:space="preserve">existing </w:t>
+      </w:r>
+      <w:r>
+        <w:rPr>
+          <w:sz w:val="24"/>
+          <w:szCs w:val="24"/>
+        </w:rPr>
+        <w:t>index-wise relationships.</w:t>
+      </w:r>
+      <w:r>
+        <w:rPr>
+          <w:sz w:val="24"/>
+          <w:szCs w:val="24"/>
         </w:rPr>
         <w:t xml:space="preserve"> </w:t>
       </w:r>
-      <w:proofErr w:type="spellStart"/>
-      <w:r>
-        <w:rPr>
-          <w:sz w:val="24"/>
-          <w:szCs w:val="24"/>
-          <w:lang w:val="es-ES"/>
-        </w:rPr>
-        <w:t>existing</w:t>
-      </w:r>
-      <w:proofErr w:type="spellEnd"/>
-      <w:r>
-        <w:rPr>
-          <w:sz w:val="24"/>
-          <w:szCs w:val="24"/>
-          <w:lang w:val="es-ES"/>
+      <w:r>
+        <w:rPr>
+          <w:sz w:val="24"/>
+          <w:szCs w:val="24"/>
+        </w:rPr>
+        <w:t>For each iteration of the bootstrap, the same threshold and diagonal detection process is applied</w:t>
+      </w:r>
+      <w:r>
+        <w:rPr>
+          <w:sz w:val="24"/>
+          <w:szCs w:val="24"/>
+        </w:rPr>
+        <w:t xml:space="preserve">, after which the highest scores of the best candidate found in that iteration are computed. </w:t>
+      </w:r>
+      <w:r>
+        <w:rPr>
+          <w:sz w:val="24"/>
+          <w:szCs w:val="24"/>
+        </w:rPr>
+        <w:t>This constitutes the bootstrap distribution.</w:t>
+      </w:r>
+      <w:r>
+        <w:rPr>
+          <w:sz w:val="24"/>
+          <w:szCs w:val="24"/>
         </w:rPr>
         <w:t xml:space="preserve"> </w:t>
-      </w:r>
-      <w:proofErr w:type="spellStart"/>
-      <w:r>
-        <w:rPr>
-          <w:sz w:val="24"/>
-          <w:szCs w:val="24"/>
-          <w:lang w:val="es-ES"/>
-        </w:rPr>
-        <w:t>index-wise</w:t>
-      </w:r>
-      <w:proofErr w:type="spellEnd"/>
-      <w:r>
-        <w:rPr>
-          <w:sz w:val="24"/>
-          <w:szCs w:val="24"/>
-          <w:lang w:val="es-ES"/>
-        </w:rPr>
-        <w:t xml:space="preserve"> </w:t>
-      </w:r>
-      <w:proofErr w:type="spellStart"/>
-      <w:r>
-        <w:rPr>
-          <w:sz w:val="24"/>
-          <w:szCs w:val="24"/>
-          <w:lang w:val="es-ES"/>
-        </w:rPr>
-        <w:t>relationships</w:t>
-      </w:r>
-      <w:proofErr w:type="spellEnd"/>
-      <w:r>
-        <w:rPr>
-          <w:sz w:val="24"/>
-          <w:szCs w:val="24"/>
-          <w:lang w:val="es-ES"/>
-        </w:rPr>
-        <w:t>.</w:t>
-      </w:r>
-      <w:r>
-        <w:rPr>
-          <w:sz w:val="24"/>
-          <w:szCs w:val="24"/>
-        </w:rPr>
-        <w:t xml:space="preserve"> </w:t>
-      </w:r>
-      <w:r>
-        <w:rPr>
-          <w:sz w:val="24"/>
-          <w:szCs w:val="24"/>
-        </w:rPr>
-        <w:t xml:space="preserve">For each iteration of the bootstrap, the same </w:t>
-      </w:r>
-      <w:proofErr w:type="spellStart"/>
-      <w:r>
-        <w:rPr>
-          <w:sz w:val="24"/>
-          <w:szCs w:val="24"/>
-        </w:rPr>
-        <w:t>threshold</w:t>
-      </w:r>
-      <w:proofErr w:type="spellEnd"/>
-      <w:r>
-        <w:rPr>
-          <w:sz w:val="24"/>
-          <w:szCs w:val="24"/>
-        </w:rPr>
-        <w:t xml:space="preserve"> and diagonal detection process is applied</w:t>
-      </w:r>
-      <w:r>
-        <w:rPr>
-          <w:sz w:val="24"/>
-          <w:szCs w:val="24"/>
-        </w:rPr>
-        <w:t xml:space="preserve">, after which the highest scores of the best candidate found in that iteration are computed. </w:t>
-      </w:r>
-      <w:r>
-        <w:rPr>
-          <w:sz w:val="24"/>
-          <w:szCs w:val="24"/>
-        </w:rPr>
-        <w:t xml:space="preserve">This constitutes the bootstrap distribution. </w:t>
       </w:r>
     </w:p>
     <w:p>
@@ -15537,7 +15569,49 @@
           <w:sz w:val="24"/>
           <w:szCs w:val="24"/>
         </w:rPr>
-        <w:t>is better than random background noise, which indicates its strong candidacy as a direct repeat. The same analysis can be done to detect inverted repeats, where we see no signal at all:</w:t>
+        <w:t>is better than random background noise, which indicates its strong candidacy as a direct repeat. The same analysis can be done to detect inverted repeats</w:t>
+      </w:r>
+      <w:r>
+        <w:rPr>
+          <w:sz w:val="24"/>
+          <w:szCs w:val="24"/>
+        </w:rPr>
+        <w:t xml:space="preserve"> on the same PWM</w:t>
+      </w:r>
+      <w:r>
+        <w:rPr>
+          <w:sz w:val="24"/>
+          <w:szCs w:val="24"/>
+        </w:rPr>
+        <w:t xml:space="preserve">, where we see no </w:t>
+      </w:r>
+      <w:r>
+        <w:rPr>
+          <w:sz w:val="24"/>
+          <w:szCs w:val="24"/>
+        </w:rPr>
+        <w:t xml:space="preserve">significant </w:t>
+      </w:r>
+      <w:r>
+        <w:rPr>
+          <w:sz w:val="24"/>
+          <w:szCs w:val="24"/>
+        </w:rPr>
+        <w:t>signal at all</w:t>
+      </w:r>
+      <w:r>
+        <w:rPr>
+          <w:sz w:val="24"/>
+          <w:szCs w:val="24"/>
+        </w:rPr>
+        <w:t xml:space="preserve"> in the outputs below</w:t>
+      </w:r>
+      <w:r>
+        <w:rPr>
+          <w:sz w:val="24"/>
+          <w:szCs w:val="24"/>
+        </w:rPr>
+        <w:t>:</w:t>
       </w:r>
     </w:p>
     <w:p>
@@ -15708,7 +15782,7 @@
           <w:sz w:val="24"/>
           <w:szCs w:val="24"/>
         </w:rPr>
-        <w:t xml:space="preserve">the inverted repeat diagonals run from bottom-left to top-right, but the axis of symmetry remains the same. </w:t>
+        <w:t xml:space="preserve">the inverted repeat diagonals run from bottom-left to top-right, </w:t>
       </w:r>
       <w:r>
         <w:rPr>
@@ -15716,7 +15790,39 @@
           <w:sz w:val="24"/>
           <w:szCs w:val="24"/>
         </w:rPr>
-        <w:t xml:space="preserve">Here, we only see potential </w:t>
+        <w:t>though</w:t>
+      </w:r>
+      <w:r>
+        <w:rPr>
+          <w:noProof/>
+          <w:sz w:val="24"/>
+          <w:szCs w:val="24"/>
+        </w:rPr>
+        <w:t xml:space="preserve"> the axis of symmetry remains the same. </w:t>
+      </w:r>
+      <w:r>
+        <w:rPr>
+          <w:noProof/>
+          <w:sz w:val="24"/>
+          <w:szCs w:val="24"/>
+        </w:rPr>
+        <w:t xml:space="preserve">Here, we only see </w:t>
+      </w:r>
+      <w:r>
+        <w:rPr>
+          <w:noProof/>
+          <w:sz w:val="24"/>
+          <w:szCs w:val="24"/>
+        </w:rPr>
+        <w:t xml:space="preserve">a </w:t>
+      </w:r>
+      <w:r>
+        <w:rPr>
+          <w:noProof/>
+          <w:sz w:val="24"/>
+          <w:szCs w:val="24"/>
+        </w:rPr>
+        <w:t xml:space="preserve">potential </w:t>
       </w:r>
       <w:r>
         <w:rPr>
@@ -15866,7 +15972,7 @@
           <w:sz w:val="24"/>
           <w:szCs w:val="24"/>
         </w:rPr>
-        <w:t>of Results</w:t>
+        <w:t>Methods for Results</w:t>
       </w:r>
     </w:p>
     <w:p>
@@ -15905,7 +16011,77 @@
           <w:sz w:val="24"/>
           <w:szCs w:val="24"/>
         </w:rPr>
-        <w:t xml:space="preserve"> checking for direct and inverted repeat patterns for each </w:t>
+        <w:t xml:space="preserve"> </w:t>
+      </w:r>
+      <w:r>
+        <w:rPr>
+          <w:sz w:val="24"/>
+          <w:szCs w:val="24"/>
+        </w:rPr>
+        <w:t>which were labeled beforehand for whether we expect them to be direct repeat (DR) or inverted repeat (IR) patterns.</w:t>
+      </w:r>
+      <w:r>
+        <w:rPr>
+          <w:sz w:val="24"/>
+          <w:szCs w:val="24"/>
+        </w:rPr>
+        <w:t xml:space="preserve"> In the case of the MEME data, there were some candidates that were labeled as neither a DR nor IR.</w:t>
+      </w:r>
+      <w:r>
+        <w:rPr>
+          <w:sz w:val="24"/>
+          <w:szCs w:val="24"/>
+        </w:rPr>
+        <w:t xml:space="preserve"> We </w:t>
+      </w:r>
+      <w:r>
+        <w:rPr>
+          <w:sz w:val="24"/>
+          <w:szCs w:val="24"/>
+        </w:rPr>
+        <w:t xml:space="preserve">then ran the analysis to </w:t>
+      </w:r>
+      <w:r>
+        <w:rPr>
+          <w:sz w:val="24"/>
+          <w:szCs w:val="24"/>
+        </w:rPr>
+        <w:t xml:space="preserve">check </w:t>
+      </w:r>
+      <w:r>
+        <w:rPr>
+          <w:sz w:val="24"/>
+          <w:szCs w:val="24"/>
+        </w:rPr>
+        <w:t xml:space="preserve">for </w:t>
+      </w:r>
+      <w:r>
+        <w:rPr>
+          <w:sz w:val="24"/>
+          <w:szCs w:val="24"/>
+        </w:rPr>
+        <w:t xml:space="preserve">both </w:t>
+      </w:r>
+      <w:r>
+        <w:rPr>
+          <w:sz w:val="24"/>
+          <w:szCs w:val="24"/>
+        </w:rPr>
+        <w:t>pattern</w:t>
+      </w:r>
+      <w:r>
+        <w:rPr>
+          <w:sz w:val="24"/>
+          <w:szCs w:val="24"/>
+        </w:rPr>
+        <w:t xml:space="preserve"> types </w:t>
+      </w:r>
+      <w:r>
+        <w:rPr>
+          <w:sz w:val="24"/>
+          <w:szCs w:val="24"/>
+        </w:rPr>
+        <w:t xml:space="preserve">for each </w:t>
       </w:r>
       <w:r>
         <w:rPr>
@@ -15984,6 +16160,69 @@
         </w:rPr>
         <w:t>positions.</w:t>
       </w:r>
+      <w:r>
+        <w:rPr>
+          <w:sz w:val="24"/>
+          <w:szCs w:val="24"/>
+        </w:rPr>
+        <w:t xml:space="preserve"> </w:t>
+      </w:r>
+      <w:r>
+        <w:rPr>
+          <w:sz w:val="24"/>
+          <w:szCs w:val="24"/>
+        </w:rPr>
+        <w:t>W</w:t>
+      </w:r>
+      <w:r>
+        <w:rPr>
+          <w:sz w:val="24"/>
+          <w:szCs w:val="24"/>
+        </w:rPr>
+        <w:t>e evaluate</w:t>
+      </w:r>
+      <w:r>
+        <w:rPr>
+          <w:sz w:val="24"/>
+          <w:szCs w:val="24"/>
+        </w:rPr>
+        <w:t xml:space="preserve">d </w:t>
+      </w:r>
+      <w:r>
+        <w:rPr>
+          <w:sz w:val="24"/>
+          <w:szCs w:val="24"/>
+        </w:rPr>
+        <w:t>the results compared to the labels</w:t>
+      </w:r>
+      <w:r>
+        <w:rPr>
+          <w:sz w:val="24"/>
+          <w:szCs w:val="24"/>
+        </w:rPr>
+        <w:t xml:space="preserve">, </w:t>
+      </w:r>
+      <w:r>
+        <w:rPr>
+          <w:sz w:val="24"/>
+          <w:szCs w:val="24"/>
+        </w:rPr>
+        <w:t xml:space="preserve">as well as </w:t>
+      </w:r>
+      <w:r>
+        <w:rPr>
+          <w:sz w:val="24"/>
+          <w:szCs w:val="24"/>
+        </w:rPr>
+        <w:t xml:space="preserve">examining </w:t>
+      </w:r>
+      <w:r>
+        <w:rPr>
+          <w:sz w:val="24"/>
+          <w:szCs w:val="24"/>
+        </w:rPr>
+        <w:t xml:space="preserve">the behavior of the outputs when manipulating the user-defined parameters. </w:t>
+      </w:r>
     </w:p>
     <w:p>
       <w:pPr>
@@ -16007,6 +16246,222 @@
           <w:sz w:val="24"/>
           <w:szCs w:val="24"/>
         </w:rPr>
+        <w:t xml:space="preserve">Prior to discussing performance of results, understanding the behavior of the thresholding parameters was necessary to select the optimal tuning. </w:t>
+      </w:r>
+      <w:r>
+        <w:rPr>
+          <w:sz w:val="24"/>
+          <w:szCs w:val="24"/>
+        </w:rPr>
+        <w:t xml:space="preserve">After running </w:t>
+      </w:r>
+      <w:r>
+        <w:rPr>
+          <w:sz w:val="24"/>
+          <w:szCs w:val="24"/>
+        </w:rPr>
+        <w:t xml:space="preserve">the DRIPPY </w:t>
+      </w:r>
+      <w:r>
+        <w:rPr>
+          <w:sz w:val="24"/>
+          <w:szCs w:val="24"/>
+        </w:rPr>
+        <w:t>pipeline through threshold percentiles 0-90% in increments</w:t>
+      </w:r>
+      <w:r>
+        <w:rPr>
+          <w:sz w:val="24"/>
+          <w:szCs w:val="24"/>
+        </w:rPr>
+        <w:t xml:space="preserve"> of 10</w:t>
+      </w:r>
+      <w:r>
+        <w:rPr>
+          <w:sz w:val="24"/>
+          <w:szCs w:val="24"/>
+        </w:rPr>
+        <w:t>, we compare the results to determine an optimal threshold</w:t>
+      </w:r>
+      <w:r>
+        <w:rPr>
+          <w:sz w:val="24"/>
+          <w:szCs w:val="24"/>
+        </w:rPr>
+        <w:t xml:space="preserve"> and discuss impact to result quality</w:t>
+      </w:r>
+      <w:r>
+        <w:rPr>
+          <w:sz w:val="24"/>
+          <w:szCs w:val="24"/>
+        </w:rPr>
+        <w:t>.</w:t>
+      </w:r>
+      <w:r>
+        <w:rPr>
+          <w:sz w:val="24"/>
+          <w:szCs w:val="24"/>
+        </w:rPr>
+        <w:t xml:space="preserve"> During the analysis, we found that p-value and agreement with the labels was not a complete</w:t>
+      </w:r>
+      <w:r>
+        <w:rPr>
+          <w:sz w:val="24"/>
+          <w:szCs w:val="24"/>
+        </w:rPr>
+        <w:t xml:space="preserve"> </w:t>
+      </w:r>
+      <w:r>
+        <w:rPr>
+          <w:sz w:val="24"/>
+          <w:szCs w:val="24"/>
+        </w:rPr>
+        <w:t>representation of result quality. As the DRIPPY algorithm is greedy, a statistically significant result sometimes result</w:t>
+      </w:r>
+      <w:r>
+        <w:rPr>
+          <w:sz w:val="24"/>
+          <w:szCs w:val="24"/>
+        </w:rPr>
+        <w:t xml:space="preserve">s </w:t>
+      </w:r>
+      <w:r>
+        <w:rPr>
+          <w:sz w:val="24"/>
+          <w:szCs w:val="24"/>
+        </w:rPr>
+        <w:t xml:space="preserve">in inaccurate </w:t>
+      </w:r>
+      <w:r>
+        <w:rPr>
+          <w:sz w:val="24"/>
+          <w:szCs w:val="24"/>
+        </w:rPr>
+        <w:t xml:space="preserve">or misleading </w:t>
+      </w:r>
+      <w:r>
+        <w:rPr>
+          <w:sz w:val="24"/>
+          <w:szCs w:val="24"/>
+        </w:rPr>
+        <w:t xml:space="preserve">output, e.g. the pipeline might report a significant DR as GTCC-GTCA, with a mismatch at the last position due to </w:t>
+      </w:r>
+      <w:r>
+        <w:rPr>
+          <w:sz w:val="24"/>
+          <w:szCs w:val="24"/>
+        </w:rPr>
+        <w:t>ambiguity in the PWM</w:t>
+      </w:r>
+      <w:r>
+        <w:rPr>
+          <w:sz w:val="24"/>
+          <w:szCs w:val="24"/>
+        </w:rPr>
+        <w:t xml:space="preserve"> (i.e., at the fourth position, A and C might be equally likely)</w:t>
+      </w:r>
+      <w:r>
+        <w:rPr>
+          <w:sz w:val="24"/>
+          <w:szCs w:val="24"/>
+        </w:rPr>
+        <w:t xml:space="preserve">. We measure and discuss this level of mismatch in terms of “concordance,” where in our GTCC-GTCA example, concordance is 75% due to the single mismatch </w:t>
+      </w:r>
+      <w:r>
+        <w:rPr>
+          <w:sz w:val="24"/>
+          <w:szCs w:val="24"/>
+        </w:rPr>
+        <w:t xml:space="preserve">of the four possible nucleotides in </w:t>
+      </w:r>
+      <w:r>
+        <w:rPr>
+          <w:sz w:val="24"/>
+          <w:szCs w:val="24"/>
+        </w:rPr>
+        <w:t xml:space="preserve">each member of </w:t>
+      </w:r>
+      <w:r>
+        <w:rPr>
+          <w:sz w:val="24"/>
+          <w:szCs w:val="24"/>
+        </w:rPr>
+        <w:t xml:space="preserve">the direct repeat </w:t>
+      </w:r>
+      <w:r>
+        <w:rPr>
+          <w:sz w:val="24"/>
+          <w:szCs w:val="24"/>
+        </w:rPr>
+        <w:t>phrase</w:t>
+      </w:r>
+      <w:r>
+        <w:rPr>
+          <w:sz w:val="24"/>
+          <w:szCs w:val="24"/>
+        </w:rPr>
+        <w:t xml:space="preserve">. </w:t>
+      </w:r>
+    </w:p>
+    <w:p>
+      <w:pPr>
+        <w:pStyle w:val="p1"/>
+        <w:rPr>
+          <w:sz w:val="24"/>
+          <w:szCs w:val="24"/>
+        </w:rPr>
+      </w:pPr>
+    </w:p>
+    <w:p>
+      <w:pPr>
+        <w:pStyle w:val="p1"/>
+        <w:rPr>
+          <w:sz w:val="24"/>
+          <w:szCs w:val="24"/>
+        </w:rPr>
+      </w:pPr>
+      <w:r>
+        <w:rPr>
+          <w:sz w:val="24"/>
+          <w:szCs w:val="24"/>
+        </w:rPr>
+        <w:t>After discussing optimal thresholding, we discuss results more concretely</w:t>
+      </w:r>
+      <w:r>
+        <w:rPr>
+          <w:sz w:val="24"/>
+          <w:szCs w:val="24"/>
+        </w:rPr>
+        <w:t xml:space="preserve"> in classical machine learning ROC and precision-</w:t>
+      </w:r>
+      <w:proofErr w:type="spellStart"/>
+      <w:r>
+        <w:rPr>
+          <w:sz w:val="24"/>
+          <w:szCs w:val="24"/>
+        </w:rPr>
+        <w:t>reccal</w:t>
+      </w:r>
+      <w:proofErr w:type="spellEnd"/>
+      <w:r>
+        <w:rPr>
+          <w:sz w:val="24"/>
+          <w:szCs w:val="24"/>
+        </w:rPr>
+        <w:t xml:space="preserve"> terms</w:t>
+      </w:r>
+      <w:r>
+        <w:rPr>
+          <w:sz w:val="24"/>
+          <w:szCs w:val="24"/>
+        </w:rPr>
+        <w:t xml:space="preserve">. </w:t>
+      </w:r>
+      <w:r>
+        <w:rPr>
+          <w:sz w:val="24"/>
+          <w:szCs w:val="24"/>
+        </w:rPr>
         <w:t xml:space="preserve">For the CollecTF dataset, we have complete label coverage for whether the observations </w:t>
       </w:r>
       <w:r>
@@ -16021,7 +16476,28 @@
           <w:sz w:val="24"/>
           <w:szCs w:val="24"/>
         </w:rPr>
-        <w:t>direct or inverted repeats. DRIPPY is run on the full data set, which results in at least two observations per combination of species and UniProtID. The full resulting dataset</w:t>
+        <w:t>DR or IR</w:t>
+      </w:r>
+      <w:r>
+        <w:rPr>
+          <w:sz w:val="24"/>
+          <w:szCs w:val="24"/>
+        </w:rPr>
+        <w:t xml:space="preserve">. DRIPPY </w:t>
+      </w:r>
+      <w:r>
+        <w:rPr>
+          <w:sz w:val="24"/>
+          <w:szCs w:val="24"/>
+        </w:rPr>
+        <w:t xml:space="preserve">was </w:t>
+      </w:r>
+      <w:r>
+        <w:rPr>
+          <w:sz w:val="24"/>
+          <w:szCs w:val="24"/>
+        </w:rPr>
+        <w:t>run on the full data set, which results in at least two observations per combination of species and UniProtID. The full resulting dataset</w:t>
       </w:r>
       <w:r>
         <w:rPr>
@@ -16035,14 +16511,92 @@
           <w:sz w:val="24"/>
           <w:szCs w:val="24"/>
         </w:rPr>
-        <w:t xml:space="preserve"> will return all found candidates. </w:t>
-      </w:r>
-      <w:r>
-        <w:rPr>
-          <w:sz w:val="24"/>
-          <w:szCs w:val="24"/>
-        </w:rPr>
-        <w:t xml:space="preserve">This data set was then aggregated so that the best candidates for the direct and inverted searches were found, </w:t>
+        <w:t xml:space="preserve"> will return all found </w:t>
+      </w:r>
+      <w:r>
+        <w:rPr>
+          <w:sz w:val="24"/>
+          <w:szCs w:val="24"/>
+        </w:rPr>
+        <w:t xml:space="preserve">motif </w:t>
+      </w:r>
+      <w:r>
+        <w:rPr>
+          <w:sz w:val="24"/>
+          <w:szCs w:val="24"/>
+        </w:rPr>
+        <w:t>candidates</w:t>
+      </w:r>
+      <w:r>
+        <w:rPr>
+          <w:sz w:val="24"/>
+          <w:szCs w:val="24"/>
+        </w:rPr>
+        <w:t>, whether significant or not</w:t>
+      </w:r>
+      <w:r>
+        <w:rPr>
+          <w:sz w:val="24"/>
+          <w:szCs w:val="24"/>
+        </w:rPr>
+        <w:t xml:space="preserve"> under the bootstrap </w:t>
+      </w:r>
+      <w:r>
+        <w:rPr>
+          <w:sz w:val="24"/>
+          <w:szCs w:val="24"/>
+        </w:rPr>
+        <w:lastRenderedPageBreak/>
+        <w:t>distribution</w:t>
+      </w:r>
+      <w:r>
+        <w:rPr>
+          <w:sz w:val="24"/>
+          <w:szCs w:val="24"/>
+        </w:rPr>
+        <w:t xml:space="preserve">. </w:t>
+      </w:r>
+      <w:r>
+        <w:rPr>
+          <w:sz w:val="24"/>
+          <w:szCs w:val="24"/>
+        </w:rPr>
+        <w:t xml:space="preserve">This data was then </w:t>
+      </w:r>
+      <w:r>
+        <w:rPr>
+          <w:sz w:val="24"/>
+          <w:szCs w:val="24"/>
+        </w:rPr>
+        <w:t xml:space="preserve">aggregated </w:t>
+      </w:r>
+      <w:r>
+        <w:rPr>
+          <w:sz w:val="24"/>
+          <w:szCs w:val="24"/>
+        </w:rPr>
+        <w:t xml:space="preserve">so that the </w:t>
+      </w:r>
+      <w:r>
+        <w:rPr>
+          <w:sz w:val="24"/>
+          <w:szCs w:val="24"/>
+        </w:rPr>
+        <w:t xml:space="preserve">top </w:t>
+      </w:r>
+      <w:r>
+        <w:rPr>
+          <w:sz w:val="24"/>
+          <w:szCs w:val="24"/>
+        </w:rPr>
+        <w:t xml:space="preserve">candidates for the direct and inverted searches were found, </w:t>
+      </w:r>
+      <w:r>
+        <w:rPr>
+          <w:sz w:val="24"/>
+          <w:szCs w:val="24"/>
+        </w:rPr>
+        <w:t xml:space="preserve">resulting in two p-values for each observation.  </w:t>
       </w:r>
     </w:p>
     <w:p>
@@ -16102,35 +16656,175 @@
           <w:sz w:val="24"/>
           <w:szCs w:val="24"/>
         </w:rPr>
-        <w:t xml:space="preserve">. The </w:t>
-      </w:r>
-      <w:r>
-        <w:rPr>
-          <w:sz w:val="24"/>
-          <w:szCs w:val="24"/>
-        </w:rPr>
-        <w:t xml:space="preserve">on the </w:t>
-      </w:r>
-      <w:r>
-        <w:rPr>
-          <w:sz w:val="24"/>
-          <w:szCs w:val="24"/>
-        </w:rPr>
-        <w:t xml:space="preserve">full data set </w:t>
-      </w:r>
-      <w:r>
-        <w:rPr>
-          <w:sz w:val="24"/>
-          <w:szCs w:val="24"/>
-        </w:rPr>
-        <w:t>aggregate the data set by picking the best candidate for each observation using the p-value. ROC and PR curves are then computed on this full dataset to visualize DRIPPY’s classification performance</w:t>
-      </w:r>
-      <w:r>
-        <w:rPr>
-          <w:sz w:val="24"/>
-          <w:szCs w:val="24"/>
-        </w:rPr>
-        <w:t>.</w:t>
+        <w:t xml:space="preserve">. </w:t>
+      </w:r>
+      <w:r>
+        <w:rPr>
+          <w:sz w:val="24"/>
+          <w:szCs w:val="24"/>
+        </w:rPr>
+        <w:t xml:space="preserve">Note that the </w:t>
+      </w:r>
+      <w:r>
+        <w:rPr>
+          <w:sz w:val="24"/>
+          <w:szCs w:val="24"/>
+        </w:rPr>
+        <w:t xml:space="preserve">DR and IR </w:t>
+      </w:r>
+      <w:r>
+        <w:rPr>
+          <w:sz w:val="24"/>
+          <w:szCs w:val="24"/>
+        </w:rPr>
+        <w:t xml:space="preserve">search can be considered two </w:t>
+      </w:r>
+      <w:r>
+        <w:rPr>
+          <w:sz w:val="24"/>
+          <w:szCs w:val="24"/>
+        </w:rPr>
+        <w:t xml:space="preserve">entirely independent runs of </w:t>
+      </w:r>
+      <w:r>
+        <w:rPr>
+          <w:sz w:val="24"/>
+          <w:szCs w:val="24"/>
+        </w:rPr>
+        <w:t>search algorithms</w:t>
+      </w:r>
+      <w:r>
+        <w:rPr>
+          <w:sz w:val="24"/>
+          <w:szCs w:val="24"/>
+        </w:rPr>
+        <w:t xml:space="preserve">, so the ROC and PR curves display </w:t>
+      </w:r>
+      <w:r>
+        <w:rPr>
+          <w:sz w:val="24"/>
+          <w:szCs w:val="24"/>
+        </w:rPr>
+        <w:t xml:space="preserve">the performance of </w:t>
+      </w:r>
+      <w:r>
+        <w:rPr>
+          <w:sz w:val="24"/>
+          <w:szCs w:val="24"/>
+        </w:rPr>
+        <w:t>both</w:t>
+      </w:r>
+      <w:r>
+        <w:rPr>
+          <w:sz w:val="24"/>
+          <w:szCs w:val="24"/>
+        </w:rPr>
+        <w:t>. We first plot</w:t>
+      </w:r>
+      <w:r>
+        <w:rPr>
+          <w:sz w:val="24"/>
+          <w:szCs w:val="24"/>
+        </w:rPr>
+        <w:t xml:space="preserve">ted </w:t>
+      </w:r>
+      <w:r>
+        <w:rPr>
+          <w:sz w:val="24"/>
+          <w:szCs w:val="24"/>
+        </w:rPr>
+        <w:t>the ROC and PR for the aggregated data</w:t>
+      </w:r>
+      <w:r>
+        <w:rPr>
+          <w:sz w:val="24"/>
+          <w:szCs w:val="24"/>
+        </w:rPr>
+        <w:t xml:space="preserve"> to evaluate the performance of the direct and inverse searches separately. Then, </w:t>
+      </w:r>
+      <w:r>
+        <w:rPr>
+          <w:sz w:val="24"/>
+          <w:szCs w:val="24"/>
+        </w:rPr>
+        <w:t xml:space="preserve">we </w:t>
+      </w:r>
+      <w:r>
+        <w:rPr>
+          <w:sz w:val="24"/>
+          <w:szCs w:val="24"/>
+        </w:rPr>
+        <w:t xml:space="preserve">applied </w:t>
+      </w:r>
+      <w:r>
+        <w:rPr>
+          <w:sz w:val="24"/>
+          <w:szCs w:val="24"/>
+        </w:rPr>
+        <w:t xml:space="preserve">a simple “winner takes all” heuristic </w:t>
+      </w:r>
+      <w:r>
+        <w:rPr>
+          <w:sz w:val="24"/>
+          <w:szCs w:val="24"/>
+        </w:rPr>
+        <w:t xml:space="preserve">to combine both searches: for </w:t>
+      </w:r>
+      <w:r>
+        <w:rPr>
+          <w:sz w:val="24"/>
+          <w:szCs w:val="24"/>
+        </w:rPr>
+        <w:t>each pair of direct and inverse search result</w:t>
+      </w:r>
+      <w:r>
+        <w:rPr>
+          <w:sz w:val="24"/>
+          <w:szCs w:val="24"/>
+        </w:rPr>
+        <w:t>s</w:t>
+      </w:r>
+      <w:r>
+        <w:rPr>
+          <w:sz w:val="24"/>
+          <w:szCs w:val="24"/>
+        </w:rPr>
+        <w:t xml:space="preserve"> for </w:t>
+      </w:r>
+      <w:r>
+        <w:rPr>
+          <w:sz w:val="24"/>
+          <w:szCs w:val="24"/>
+        </w:rPr>
+        <w:t xml:space="preserve">the same </w:t>
+      </w:r>
+      <w:r>
+        <w:rPr>
+          <w:sz w:val="24"/>
+          <w:szCs w:val="24"/>
+        </w:rPr>
+        <w:t xml:space="preserve">observation, whichever result had the lowest p-value was considered the </w:t>
+      </w:r>
+      <w:r>
+        <w:rPr>
+          <w:sz w:val="24"/>
+          <w:szCs w:val="24"/>
+        </w:rPr>
+        <w:t xml:space="preserve">best </w:t>
+      </w:r>
+      <w:r>
+        <w:rPr>
+          <w:sz w:val="24"/>
+          <w:szCs w:val="24"/>
+        </w:rPr>
+        <w:t xml:space="preserve">conclusion of the DRIPPY pipeline. </w:t>
+      </w:r>
+      <w:r>
+        <w:rPr>
+          <w:sz w:val="24"/>
+          <w:szCs w:val="24"/>
+        </w:rPr>
+        <w:t xml:space="preserve">We then plotted another ROC and PR curve for this result. </w:t>
       </w:r>
     </w:p>
     <w:p>
@@ -16150,6 +16844,13 @@
           <w:szCs w:val="24"/>
         </w:rPr>
       </w:pPr>
+      <w:r>
+        <w:rPr>
+          <w:sz w:val="24"/>
+          <w:szCs w:val="24"/>
+        </w:rPr>
+        <w:t xml:space="preserve">We also evaluated confusion matrices based on different p-value cutoffs for search results, using an inverted score (1 – p-value). The classical p &lt; 0.05 cutoff was used to produce inference from the DRIPPY pipeline and evaluate the true-false positive-negative results, but we also use Youden’s J-statistic to find the optimizing cutoff and evaluate error rates this way. </w:t>
+      </w:r>
     </w:p>
     <w:p>
       <w:pPr>
@@ -16159,27 +16860,6 @@
           <w:szCs w:val="24"/>
         </w:rPr>
       </w:pPr>
-      <w:r>
-        <w:rPr>
-          <w:sz w:val="24"/>
-          <w:szCs w:val="24"/>
-        </w:rPr>
-        <w:t xml:space="preserve">Show best </w:t>
-      </w:r>
-      <w:r>
-        <w:rPr>
-          <w:sz w:val="24"/>
-          <w:szCs w:val="24"/>
-        </w:rPr>
-        <w:t xml:space="preserve">ROC and PR across all analyses – DR and IR separated. Then we apply them in unison, having DRIPPY classify based on significance of p-value. </w:t>
-      </w:r>
-      <w:r>
-        <w:rPr>
-          <w:sz w:val="24"/>
-          <w:szCs w:val="24"/>
-        </w:rPr>
-        <w:t xml:space="preserve">Compare behavior of ROC and PR across different </w:t>
-      </w:r>
     </w:p>
     <w:p>
       <w:pPr>
@@ -16189,6 +16869,20 @@
           <w:szCs w:val="24"/>
         </w:rPr>
       </w:pPr>
+      <w:r>
+        <w:rPr>
+          <w:sz w:val="24"/>
+          <w:szCs w:val="24"/>
+        </w:rPr>
+        <w:t xml:space="preserve">We perform a similar analysis with the MEME data, </w:t>
+      </w:r>
+      <w:r>
+        <w:rPr>
+          <w:sz w:val="24"/>
+          <w:szCs w:val="24"/>
+        </w:rPr>
+        <w:t xml:space="preserve">though the MEME data is slightly more challenging for classification as it also contains null values, i.e., some of the candidate motifs were labeled as neither a direct nor inverse repeat. </w:t>
+      </w:r>
     </w:p>
     <w:p>
       <w:pPr>
@@ -16198,13 +16892,6 @@
           <w:szCs w:val="24"/>
         </w:rPr>
       </w:pPr>
-      <w:r>
-        <w:rPr>
-          <w:sz w:val="24"/>
-          <w:szCs w:val="24"/>
-        </w:rPr>
-        <w:t xml:space="preserve">We perform a similar analysis with the MEME data, </w:t>
-      </w:r>
     </w:p>
     <w:p>
       <w:pPr>
@@ -16223,34 +16910,6 @@
           <w:szCs w:val="24"/>
         </w:rPr>
       </w:pPr>
-      <w:r>
-        <w:rPr>
-          <w:sz w:val="24"/>
-          <w:szCs w:val="24"/>
-        </w:rPr>
-        <w:t>Finally</w:t>
-      </w:r>
-      <w:r>
-        <w:rPr>
-          <w:sz w:val="24"/>
-          <w:szCs w:val="24"/>
-        </w:rPr>
-        <w:t xml:space="preserve">, </w:t>
-      </w:r>
-      <w:r>
-        <w:rPr>
-          <w:sz w:val="24"/>
-          <w:szCs w:val="24"/>
-        </w:rPr>
-        <w:t xml:space="preserve">we evaluate the </w:t>
-      </w:r>
-      <w:r>
-        <w:rPr>
-          <w:sz w:val="24"/>
-          <w:szCs w:val="24"/>
-        </w:rPr>
-        <w:t xml:space="preserve">results compared to the manual labels as well as discussing the behavior of the outputs when manipulating the user-defined parameters. </w:t>
-      </w:r>
     </w:p>
     <w:p>
       <w:pPr>
@@ -16321,35 +16980,84 @@
     <w:p>
       <w:pPr>
         <w:pStyle w:val="p1"/>
-        <w:numPr>
-          <w:ilvl w:val="0"/>
-          <w:numId w:val="8"/>
-        </w:numPr>
-        <w:rPr>
-          <w:sz w:val="24"/>
-          <w:szCs w:val="24"/>
-        </w:rPr>
-      </w:pPr>
-      <w:r>
-        <w:rPr>
-          <w:sz w:val="24"/>
-          <w:szCs w:val="24"/>
-        </w:rPr>
-        <w:t xml:space="preserve">Individual observation comparison -- </w:t>
-      </w:r>
-      <w:r>
-        <w:rPr>
-          <w:sz w:val="24"/>
-          <w:szCs w:val="24"/>
-        </w:rPr>
-        <w:t>Adjusting the threshold impacts the motif size</w:t>
-      </w:r>
-      <w:r>
-        <w:rPr>
-          <w:sz w:val="24"/>
-          <w:szCs w:val="24"/>
-        </w:rPr>
-        <w:t xml:space="preserve">, </w:t>
+        <w:rPr>
+          <w:sz w:val="24"/>
+          <w:szCs w:val="24"/>
+        </w:rPr>
+      </w:pPr>
+      <w:r>
+        <w:rPr>
+          <w:sz w:val="24"/>
+          <w:szCs w:val="24"/>
+        </w:rPr>
+        <w:t xml:space="preserve">Before </w:t>
+      </w:r>
+      <w:r>
+        <w:rPr>
+          <w:sz w:val="24"/>
+          <w:szCs w:val="24"/>
+        </w:rPr>
+        <w:t xml:space="preserve">discussing precision and performance, we first discuss the impacts of manipulating the user-adjustable parameter of threshold percentile. As discussed in the Methodology section, the threshold percentile determines how many positions the DRIPPY will include in the final candidate motif output – lower thresholds </w:t>
+      </w:r>
+      <w:r>
+        <w:rPr>
+          <w:sz w:val="24"/>
+          <w:szCs w:val="24"/>
+        </w:rPr>
+        <w:t xml:space="preserve">imply more </w:t>
+      </w:r>
+      <w:r>
+        <w:rPr>
+          <w:sz w:val="24"/>
+          <w:szCs w:val="24"/>
+        </w:rPr>
+        <w:t xml:space="preserve">lenient inclusion criteria, and therefore </w:t>
+      </w:r>
+      <w:r>
+        <w:rPr>
+          <w:sz w:val="24"/>
+          <w:szCs w:val="24"/>
+        </w:rPr>
+        <w:t xml:space="preserve">longer output motifs.  </w:t>
+      </w:r>
+    </w:p>
+    <w:p>
+      <w:pPr>
+        <w:pStyle w:val="p1"/>
+        <w:rPr>
+          <w:sz w:val="24"/>
+          <w:szCs w:val="24"/>
+        </w:rPr>
+      </w:pPr>
+    </w:p>
+    <w:p>
+      <w:pPr>
+        <w:pStyle w:val="p1"/>
+        <w:rPr>
+          <w:sz w:val="24"/>
+          <w:szCs w:val="24"/>
+        </w:rPr>
+      </w:pPr>
+      <w:r>
+        <w:rPr>
+          <w:sz w:val="24"/>
+          <w:szCs w:val="24"/>
+        </w:rPr>
+        <w:t xml:space="preserve">However, </w:t>
+      </w:r>
+      <w:r>
+        <w:rPr>
+          <w:sz w:val="24"/>
+          <w:szCs w:val="24"/>
+        </w:rPr>
+        <w:t>the threshold percentile impacts more than just the search result size. It also impacts</w:t>
+      </w:r>
+      <w:r>
+        <w:rPr>
+          <w:sz w:val="24"/>
+          <w:szCs w:val="24"/>
+        </w:rPr>
+        <w:t xml:space="preserve"> </w:t>
       </w:r>
       <w:r>
         <w:rPr>
@@ -16363,23 +17071,646 @@
           <w:sz w:val="24"/>
           <w:szCs w:val="24"/>
         </w:rPr>
-        <w:t xml:space="preserve">, and computing overhead </w:t>
-      </w:r>
-      <w:r>
-        <w:rPr>
-          <w:sz w:val="24"/>
-          <w:szCs w:val="24"/>
-        </w:rPr>
-        <w:t xml:space="preserve">– lots of false positives but p-value significance </w:t>
+        <w:t xml:space="preserve"> and computing overhead</w:t>
+      </w:r>
+      <w:r>
+        <w:rPr>
+          <w:sz w:val="24"/>
+          <w:szCs w:val="24"/>
+        </w:rPr>
+        <w:t>. In the previous section, we defined a concordance metric that measures whether a</w:t>
+      </w:r>
+      <w:r>
+        <w:rPr>
+          <w:sz w:val="24"/>
+          <w:szCs w:val="24"/>
+        </w:rPr>
+        <w:t xml:space="preserve">n alleged </w:t>
+      </w:r>
+      <w:r>
+        <w:rPr>
+          <w:sz w:val="24"/>
+          <w:szCs w:val="24"/>
+        </w:rPr>
+        <w:t xml:space="preserve">DR or IR </w:t>
+      </w:r>
+      <w:r>
+        <w:rPr>
+          <w:sz w:val="24"/>
+          <w:szCs w:val="24"/>
+        </w:rPr>
+        <w:t xml:space="preserve">pattern </w:t>
+      </w:r>
+      <w:r>
+        <w:rPr>
+          <w:sz w:val="24"/>
+          <w:szCs w:val="24"/>
+        </w:rPr>
+        <w:t xml:space="preserve">is </w:t>
+      </w:r>
+      <w:r>
+        <w:rPr>
+          <w:sz w:val="24"/>
+          <w:szCs w:val="24"/>
+        </w:rPr>
+        <w:t>truly</w:t>
+      </w:r>
+      <w:r>
+        <w:rPr>
+          <w:sz w:val="24"/>
+          <w:szCs w:val="24"/>
+        </w:rPr>
+        <w:t xml:space="preserve"> a bona fide DR or IR based on </w:t>
+      </w:r>
+      <w:r>
+        <w:rPr>
+          <w:sz w:val="24"/>
+          <w:szCs w:val="24"/>
+        </w:rPr>
+        <w:t xml:space="preserve">the outputted </w:t>
+      </w:r>
+      <w:r>
+        <w:rPr>
+          <w:sz w:val="24"/>
+          <w:szCs w:val="24"/>
+        </w:rPr>
+        <w:t xml:space="preserve">nucleotide </w:t>
+      </w:r>
+      <w:r>
+        <w:rPr>
+          <w:sz w:val="24"/>
+          <w:szCs w:val="24"/>
+        </w:rPr>
+        <w:t>sequence</w:t>
+      </w:r>
+      <w:r>
+        <w:rPr>
+          <w:sz w:val="24"/>
+          <w:szCs w:val="24"/>
+        </w:rPr>
+        <w:t xml:space="preserve">, which is measured by how many positions in the candidate are correct to expectations. Across the thresholds, </w:t>
+      </w:r>
+      <w:r>
+        <w:rPr>
+          <w:sz w:val="24"/>
+          <w:szCs w:val="24"/>
+        </w:rPr>
+        <w:t xml:space="preserve">we see that as expected, lower thresholds tend to lead to more imprecise results. </w:t>
+      </w:r>
+      <w:r>
+        <w:rPr>
+          <w:sz w:val="24"/>
+          <w:szCs w:val="24"/>
+        </w:rPr>
+        <w:t xml:space="preserve">However, a low concordance measure does not necessarily imply an incorrect result: this is simply a consequence of a noisy PWM where at specific positions in the motif candidate, there is ambiguity on the conserved nucleotide. </w:t>
+      </w:r>
+      <w:r>
+        <w:rPr>
+          <w:sz w:val="24"/>
+          <w:szCs w:val="24"/>
+        </w:rPr>
+        <w:t xml:space="preserve">The DRIPPY pipeline evaluates significance of the motif </w:t>
+      </w:r>
+      <w:proofErr w:type="gramStart"/>
+      <w:r>
+        <w:rPr>
+          <w:sz w:val="24"/>
+          <w:szCs w:val="24"/>
+        </w:rPr>
+        <w:t>as a whole</w:t>
+      </w:r>
+      <w:r>
+        <w:rPr>
+          <w:sz w:val="24"/>
+          <w:szCs w:val="24"/>
+        </w:rPr>
+        <w:t xml:space="preserve"> rather</w:t>
+      </w:r>
+      <w:proofErr w:type="gramEnd"/>
+      <w:r>
+        <w:rPr>
+          <w:sz w:val="24"/>
+          <w:szCs w:val="24"/>
+        </w:rPr>
+        <w:t xml:space="preserve"> than </w:t>
+      </w:r>
+      <w:r>
+        <w:rPr>
+          <w:sz w:val="24"/>
+          <w:szCs w:val="24"/>
+        </w:rPr>
+        <w:t xml:space="preserve">the </w:t>
+      </w:r>
+      <w:r>
+        <w:rPr>
+          <w:sz w:val="24"/>
+          <w:szCs w:val="24"/>
+        </w:rPr>
+        <w:t xml:space="preserve">significance </w:t>
+      </w:r>
+      <w:r>
+        <w:rPr>
+          <w:sz w:val="24"/>
+          <w:szCs w:val="24"/>
+        </w:rPr>
+        <w:t xml:space="preserve">of </w:t>
+      </w:r>
+      <w:r>
+        <w:rPr>
+          <w:sz w:val="24"/>
+          <w:szCs w:val="24"/>
+        </w:rPr>
+        <w:t>individual</w:t>
+      </w:r>
+      <w:r>
+        <w:rPr>
+          <w:sz w:val="24"/>
+          <w:szCs w:val="24"/>
+        </w:rPr>
+        <w:t xml:space="preserve"> positions</w:t>
+      </w:r>
+      <w:r>
+        <w:rPr>
+          <w:sz w:val="24"/>
+          <w:szCs w:val="24"/>
+        </w:rPr>
+        <w:t>,</w:t>
+      </w:r>
+      <w:r>
+        <w:rPr>
+          <w:sz w:val="24"/>
+          <w:szCs w:val="24"/>
+        </w:rPr>
+        <w:t xml:space="preserve"> </w:t>
+      </w:r>
+      <w:r>
+        <w:rPr>
+          <w:sz w:val="24"/>
+          <w:szCs w:val="24"/>
+        </w:rPr>
+        <w:t>as</w:t>
+      </w:r>
+      <w:r>
+        <w:rPr>
+          <w:sz w:val="24"/>
+          <w:szCs w:val="24"/>
+        </w:rPr>
+        <w:t xml:space="preserve"> the scoring metric is derived from the sum of the individual positional metrics. However, for high-throughput applications, users may be constrained by computation time, as we see below, which helps guide the threshold selection. </w:t>
+      </w:r>
+      <w:r>
+        <w:rPr>
+          <w:sz w:val="24"/>
+          <w:szCs w:val="24"/>
+        </w:rPr>
+        <w:t xml:space="preserve">Computation time </w:t>
+      </w:r>
+      <w:r>
+        <w:rPr>
+          <w:sz w:val="24"/>
+          <w:szCs w:val="24"/>
+        </w:rPr>
+        <w:t xml:space="preserve">shows an </w:t>
+      </w:r>
+      <w:r>
+        <w:rPr>
+          <w:sz w:val="24"/>
+          <w:szCs w:val="24"/>
+        </w:rPr>
+        <w:t>inverse</w:t>
+      </w:r>
+      <w:r>
+        <w:rPr>
+          <w:sz w:val="24"/>
+          <w:szCs w:val="24"/>
+        </w:rPr>
+        <w:t xml:space="preserve"> relationship</w:t>
+      </w:r>
+      <w:r>
+        <w:rPr>
+          <w:sz w:val="24"/>
+          <w:szCs w:val="24"/>
+        </w:rPr>
+        <w:t xml:space="preserve"> with the threshold percentile as </w:t>
+      </w:r>
+      <w:r>
+        <w:rPr>
+          <w:sz w:val="24"/>
+          <w:szCs w:val="24"/>
+        </w:rPr>
+        <w:t xml:space="preserve">lower thresholds forcing the pipeline to search and evaluate longer candidates, hence returning more results. </w:t>
       </w:r>
     </w:p>
     <w:p>
       <w:pPr>
         <w:pStyle w:val="p1"/>
-        <w:numPr>
-          <w:ilvl w:val="0"/>
-          <w:numId w:val="8"/>
-        </w:numPr>
+        <w:rPr>
+          <w:sz w:val="24"/>
+          <w:szCs w:val="24"/>
+        </w:rPr>
+      </w:pPr>
+    </w:p>
+    <w:p>
+      <w:pPr>
+        <w:pStyle w:val="p1"/>
+        <w:jc w:val="center"/>
+        <w:rPr>
+          <w:noProof/>
+        </w:rPr>
+      </w:pPr>
+      <w:r>
+        <w:rPr>
+          <w:noProof/>
+        </w:rPr>
+        <w:drawing>
+          <wp:inline distT="0" distB="0" distL="0" distR="0" wp14:anchorId="4B19DFD5" wp14:editId="72D13600">
+            <wp:extent cx="2645664" cy="1699450"/>
+            <wp:effectExtent l="0" t="0" r="0" b="2540"/>
+            <wp:docPr id="219692434" name="Picture 1" descr="A graph with a line&#10;&#10;AI-generated content may be incorrect."/>
+            <wp:cNvGraphicFramePr>
+              <a:graphicFrameLocks xmlns:a="http://schemas.openxmlformats.org/drawingml/2006/main" noChangeAspect="1"/>
+            </wp:cNvGraphicFramePr>
+            <a:graphic xmlns:a="http://schemas.openxmlformats.org/drawingml/2006/main">
+              <a:graphicData uri="http://schemas.openxmlformats.org/drawingml/2006/picture">
+                <pic:pic xmlns:pic="http://schemas.openxmlformats.org/drawingml/2006/picture">
+                  <pic:nvPicPr>
+                    <pic:cNvPr id="219692434" name="Picture 1" descr="A graph with a line&#10;&#10;AI-generated content may be incorrect."/>
+                    <pic:cNvPicPr/>
+                  </pic:nvPicPr>
+                  <pic:blipFill>
+                    <a:blip r:embed="rId22"/>
+                    <a:stretch>
+                      <a:fillRect/>
+                    </a:stretch>
+                  </pic:blipFill>
+                  <pic:spPr>
+                    <a:xfrm>
+                      <a:off x="0" y="0"/>
+                      <a:ext cx="2705356" cy="1737793"/>
+                    </a:xfrm>
+                    <a:prstGeom prst="rect">
+                      <a:avLst/>
+                    </a:prstGeom>
+                  </pic:spPr>
+                </pic:pic>
+              </a:graphicData>
+            </a:graphic>
+          </wp:inline>
+        </w:drawing>
+      </w:r>
+      <w:r>
+        <w:rPr>
+          <w:noProof/>
+        </w:rPr>
+        <w:t xml:space="preserve"> </w:t>
+      </w:r>
+      <w:r>
+        <w:rPr>
+          <w:sz w:val="24"/>
+          <w:szCs w:val="24"/>
+        </w:rPr>
+        <w:drawing>
+          <wp:inline distT="0" distB="0" distL="0" distR="0" wp14:anchorId="2EBBFD9F" wp14:editId="14F69A1A">
+            <wp:extent cx="2655823" cy="1697990"/>
+            <wp:effectExtent l="0" t="0" r="0" b="3810"/>
+            <wp:docPr id="1647665826" name="Picture 1" descr="A graph with a line going up&#10;&#10;AI-generated content may be incorrect."/>
+            <wp:cNvGraphicFramePr>
+              <a:graphicFrameLocks xmlns:a="http://schemas.openxmlformats.org/drawingml/2006/main" noChangeAspect="1"/>
+            </wp:cNvGraphicFramePr>
+            <a:graphic xmlns:a="http://schemas.openxmlformats.org/drawingml/2006/main">
+              <a:graphicData uri="http://schemas.openxmlformats.org/drawingml/2006/picture">
+                <pic:pic xmlns:pic="http://schemas.openxmlformats.org/drawingml/2006/picture">
+                  <pic:nvPicPr>
+                    <pic:cNvPr id="1647665826" name="Picture 1" descr="A graph with a line going up&#10;&#10;AI-generated content may be incorrect."/>
+                    <pic:cNvPicPr/>
+                  </pic:nvPicPr>
+                  <pic:blipFill>
+                    <a:blip r:embed="rId23"/>
+                    <a:stretch>
+                      <a:fillRect/>
+                    </a:stretch>
+                  </pic:blipFill>
+                  <pic:spPr>
+                    <a:xfrm>
+                      <a:off x="0" y="0"/>
+                      <a:ext cx="2697247" cy="1724474"/>
+                    </a:xfrm>
+                    <a:prstGeom prst="rect">
+                      <a:avLst/>
+                    </a:prstGeom>
+                  </pic:spPr>
+                </pic:pic>
+              </a:graphicData>
+            </a:graphic>
+          </wp:inline>
+        </w:drawing>
+      </w:r>
+    </w:p>
+    <w:p>
+      <w:pPr>
+        <w:pStyle w:val="p1"/>
+        <w:rPr>
+          <w:i/>
+          <w:iCs/>
+          <w:sz w:val="24"/>
+          <w:szCs w:val="24"/>
+        </w:rPr>
+      </w:pPr>
+      <w:r>
+        <w:rPr>
+          <w:i/>
+          <w:iCs/>
+          <w:noProof/>
+        </w:rPr>
+        <w:t xml:space="preserve">Figure. </w:t>
+      </w:r>
+      <w:r>
+        <w:rPr>
+          <w:i/>
+          <w:iCs/>
+          <w:noProof/>
+        </w:rPr>
+        <w:t xml:space="preserve">Concordance over thresholds and execution time by threshold. </w:t>
+      </w:r>
+    </w:p>
+    <w:p>
+      <w:pPr>
+        <w:pStyle w:val="p1"/>
+        <w:rPr>
+          <w:sz w:val="24"/>
+          <w:szCs w:val="24"/>
+        </w:rPr>
+      </w:pPr>
+    </w:p>
+    <w:p>
+      <w:pPr>
+        <w:pStyle w:val="p1"/>
+        <w:rPr>
+          <w:sz w:val="24"/>
+          <w:szCs w:val="24"/>
+        </w:rPr>
+      </w:pPr>
+      <w:r>
+        <w:rPr>
+          <w:sz w:val="24"/>
+          <w:szCs w:val="24"/>
+        </w:rPr>
+        <w:t xml:space="preserve">Neither of these results are </w:t>
+      </w:r>
+      <w:r>
+        <w:rPr>
+          <w:sz w:val="24"/>
+          <w:szCs w:val="24"/>
+        </w:rPr>
+        <w:t xml:space="preserve">particularly surprising, but they do assist with threshold tuning depending on user goals. </w:t>
+      </w:r>
+      <w:r>
+        <w:rPr>
+          <w:sz w:val="24"/>
+          <w:szCs w:val="24"/>
+        </w:rPr>
+        <w:t>A stricter, higher threshold percentage will result in motifs that are highly internally conformant to either the DR or IR pattern across all positions.</w:t>
+      </w:r>
+      <w:r>
+        <w:rPr>
+          <w:sz w:val="24"/>
+          <w:szCs w:val="24"/>
+        </w:rPr>
+        <w:t xml:space="preserve"> </w:t>
+      </w:r>
+    </w:p>
+    <w:p>
+      <w:pPr>
+        <w:pStyle w:val="p1"/>
+        <w:rPr>
+          <w:sz w:val="24"/>
+          <w:szCs w:val="24"/>
+        </w:rPr>
+      </w:pPr>
+    </w:p>
+    <w:p>
+      <w:pPr>
+        <w:pStyle w:val="p1"/>
+        <w:rPr>
+          <w:sz w:val="24"/>
+          <w:szCs w:val="24"/>
+        </w:rPr>
+      </w:pPr>
+      <w:r>
+        <w:rPr>
+          <w:sz w:val="24"/>
+          <w:szCs w:val="24"/>
+        </w:rPr>
+        <w:t>C</w:t>
+      </w:r>
+      <w:r>
+        <w:rPr>
+          <w:sz w:val="24"/>
+          <w:szCs w:val="24"/>
+        </w:rPr>
+        <w:t>lassification performance</w:t>
+      </w:r>
+      <w:r>
+        <w:rPr>
+          <w:sz w:val="24"/>
+          <w:szCs w:val="24"/>
+        </w:rPr>
+        <w:t xml:space="preserve"> as a function of the threshold percentile setting is of paramount interest.</w:t>
+      </w:r>
+      <w:r>
+        <w:rPr>
+          <w:sz w:val="24"/>
+          <w:szCs w:val="24"/>
+        </w:rPr>
+        <w:t xml:space="preserve"> Below, we evaluate DRIPPY’s best conclusions with the p &lt; 0.05 threshold applied, meaning that </w:t>
+      </w:r>
+      <w:r>
+        <w:rPr>
+          <w:sz w:val="24"/>
+          <w:szCs w:val="24"/>
+        </w:rPr>
+        <w:t xml:space="preserve">inference was subject to statistically significance, even if the best conclusion between the DR/IR search (i.e., the search result with the comparatively lower p-value) aligned with the label. We see that </w:t>
+      </w:r>
+    </w:p>
+    <w:p>
+      <w:pPr>
+        <w:pStyle w:val="p1"/>
+        <w:rPr>
+          <w:sz w:val="24"/>
+          <w:szCs w:val="24"/>
+        </w:rPr>
+      </w:pPr>
+      <w:r>
+        <w:rPr>
+          <w:sz w:val="24"/>
+          <w:szCs w:val="24"/>
+        </w:rPr>
+        <w:lastRenderedPageBreak/>
+        <w:drawing>
+          <wp:inline distT="0" distB="0" distL="0" distR="0" wp14:anchorId="798C3B9F" wp14:editId="73C629B9">
+            <wp:extent cx="5400040" cy="3136265"/>
+            <wp:effectExtent l="0" t="0" r="0" b="635"/>
+            <wp:docPr id="1994469616" name="Picture 1" descr="A graph with red and blue lines&#10;&#10;AI-generated content may be incorrect."/>
+            <wp:cNvGraphicFramePr>
+              <a:graphicFrameLocks xmlns:a="http://schemas.openxmlformats.org/drawingml/2006/main" noChangeAspect="1"/>
+            </wp:cNvGraphicFramePr>
+            <a:graphic xmlns:a="http://schemas.openxmlformats.org/drawingml/2006/main">
+              <a:graphicData uri="http://schemas.openxmlformats.org/drawingml/2006/picture">
+                <pic:pic xmlns:pic="http://schemas.openxmlformats.org/drawingml/2006/picture">
+                  <pic:nvPicPr>
+                    <pic:cNvPr id="1994469616" name="Picture 1" descr="A graph with red and blue lines&#10;&#10;AI-generated content may be incorrect."/>
+                    <pic:cNvPicPr/>
+                  </pic:nvPicPr>
+                  <pic:blipFill>
+                    <a:blip r:embed="rId24"/>
+                    <a:stretch>
+                      <a:fillRect/>
+                    </a:stretch>
+                  </pic:blipFill>
+                  <pic:spPr>
+                    <a:xfrm>
+                      <a:off x="0" y="0"/>
+                      <a:ext cx="5400040" cy="3136265"/>
+                    </a:xfrm>
+                    <a:prstGeom prst="rect">
+                      <a:avLst/>
+                    </a:prstGeom>
+                  </pic:spPr>
+                </pic:pic>
+              </a:graphicData>
+            </a:graphic>
+          </wp:inline>
+        </w:drawing>
+      </w:r>
+      <w:r>
+        <w:rPr>
+          <w:sz w:val="24"/>
+          <w:szCs w:val="24"/>
+        </w:rPr>
+        <w:t xml:space="preserve"> </w:t>
+      </w:r>
+    </w:p>
+    <w:p>
+      <w:pPr>
+        <w:pStyle w:val="p1"/>
+        <w:rPr>
+          <w:sz w:val="24"/>
+          <w:szCs w:val="24"/>
+        </w:rPr>
+      </w:pPr>
+      <w:r>
+        <w:rPr>
+          <w:sz w:val="24"/>
+          <w:szCs w:val="24"/>
+        </w:rPr>
+        <w:drawing>
+          <wp:inline distT="0" distB="0" distL="0" distR="0" wp14:anchorId="546A7803" wp14:editId="4473FFB9">
+            <wp:extent cx="5400040" cy="5400040"/>
+            <wp:effectExtent l="0" t="0" r="0" b="0"/>
+            <wp:docPr id="740028251" name="Picture 1"/>
+            <wp:cNvGraphicFramePr>
+              <a:graphicFrameLocks xmlns:a="http://schemas.openxmlformats.org/drawingml/2006/main" noChangeAspect="1"/>
+            </wp:cNvGraphicFramePr>
+            <a:graphic xmlns:a="http://schemas.openxmlformats.org/drawingml/2006/main">
+              <a:graphicData uri="http://schemas.openxmlformats.org/drawingml/2006/picture">
+                <pic:pic xmlns:pic="http://schemas.openxmlformats.org/drawingml/2006/picture">
+                  <pic:nvPicPr>
+                    <pic:cNvPr id="740028251" name=""/>
+                    <pic:cNvPicPr/>
+                  </pic:nvPicPr>
+                  <pic:blipFill>
+                    <a:blip r:embed="rId25"/>
+                    <a:stretch>
+                      <a:fillRect/>
+                    </a:stretch>
+                  </pic:blipFill>
+                  <pic:spPr>
+                    <a:xfrm>
+                      <a:off x="0" y="0"/>
+                      <a:ext cx="5400040" cy="5400040"/>
+                    </a:xfrm>
+                    <a:prstGeom prst="rect">
+                      <a:avLst/>
+                    </a:prstGeom>
+                  </pic:spPr>
+                </pic:pic>
+              </a:graphicData>
+            </a:graphic>
+          </wp:inline>
+        </w:drawing>
+      </w:r>
+    </w:p>
+    <w:p>
+      <w:pPr>
+        <w:pStyle w:val="p1"/>
+        <w:rPr>
+          <w:sz w:val="24"/>
+          <w:szCs w:val="24"/>
+        </w:rPr>
+      </w:pPr>
+    </w:p>
+    <w:p>
+      <w:pPr>
+        <w:pStyle w:val="p1"/>
+        <w:rPr>
+          <w:sz w:val="24"/>
+          <w:szCs w:val="24"/>
+        </w:rPr>
+      </w:pPr>
+      <w:r>
+        <w:rPr>
+          <w:sz w:val="24"/>
+          <w:szCs w:val="24"/>
+        </w:rPr>
+        <w:lastRenderedPageBreak/>
+        <w:drawing>
+          <wp:inline distT="0" distB="0" distL="0" distR="0" wp14:anchorId="2D01230E" wp14:editId="6C65D699">
+            <wp:extent cx="5400040" cy="4622165"/>
+            <wp:effectExtent l="0" t="0" r="0" b="635"/>
+            <wp:docPr id="618168886" name="Picture 1" descr="A group of graphs showing different types of curves&#10;&#10;AI-generated content may be incorrect."/>
+            <wp:cNvGraphicFramePr>
+              <a:graphicFrameLocks xmlns:a="http://schemas.openxmlformats.org/drawingml/2006/main" noChangeAspect="1"/>
+            </wp:cNvGraphicFramePr>
+            <a:graphic xmlns:a="http://schemas.openxmlformats.org/drawingml/2006/main">
+              <a:graphicData uri="http://schemas.openxmlformats.org/drawingml/2006/picture">
+                <pic:pic xmlns:pic="http://schemas.openxmlformats.org/drawingml/2006/picture">
+                  <pic:nvPicPr>
+                    <pic:cNvPr id="618168886" name="Picture 1" descr="A group of graphs showing different types of curves&#10;&#10;AI-generated content may be incorrect."/>
+                    <pic:cNvPicPr/>
+                  </pic:nvPicPr>
+                  <pic:blipFill>
+                    <a:blip r:embed="rId26"/>
+                    <a:stretch>
+                      <a:fillRect/>
+                    </a:stretch>
+                  </pic:blipFill>
+                  <pic:spPr>
+                    <a:xfrm>
+                      <a:off x="0" y="0"/>
+                      <a:ext cx="5400040" cy="4622165"/>
+                    </a:xfrm>
+                    <a:prstGeom prst="rect">
+                      <a:avLst/>
+                    </a:prstGeom>
+                  </pic:spPr>
+                </pic:pic>
+              </a:graphicData>
+            </a:graphic>
+          </wp:inline>
+        </w:drawing>
+      </w:r>
+    </w:p>
+    <w:p>
+      <w:pPr>
+        <w:pStyle w:val="p1"/>
+        <w:rPr>
+          <w:sz w:val="24"/>
+          <w:szCs w:val="24"/>
+        </w:rPr>
+      </w:pPr>
+    </w:p>
+    <w:p>
+      <w:pPr>
+        <w:pStyle w:val="p1"/>
         <w:rPr>
           <w:sz w:val="24"/>
           <w:szCs w:val="24"/>

</xml_diff>